<commit_message>
Fix all three content gaps identified in audit
- Add extended log2 reference table (21 fractions: 1/2 through 7/8)
- Add Aug 2022 Q3.1 8-puzzle BFS full expansion (depth-2 solution)
- Add Aug 2022 Q3.2 heuristic dominance (h1=6, h2=12, h2 dominates)
- Add Aug 2022 Q4.1 perceptron 2D worked table (4 updates, final w=(-0.2,-0.4))
- Add Aug 2022 Q4.2 all-ones convolution output ([[1140,1150],[1200,1210]])
- Add Aug 2022 Q5 decision tree full IG table (F4 root, 3-level tree)
- Add Aug 2022 Q6 Bayesian P(B|C)=0.850 step-by-step

Co-Authored-By: Claude Sonnet 4.6 <noreply@anthropic.com>
</commit_message>
<xml_diff>
--- a/COMP4431_Calculation_Steps.docx
+++ b/COMP4431_Calculation_Steps.docx
@@ -5269,6 +5269,2701 @@
         <w:t>Dec 2023 Q5 uses the same network with: P(E)=0.3; P(S|E)=0.2; P(J|E)=0.8; etc.</w:t>
       </w:r>
     </w:p>
+    <w:p>
+      <w:pPr>
+        <w:pStyle w:val="Heading2"/>
+      </w:pPr>
+      <w:r>
+        <w:rPr>
+          <w:b/>
+        </w:rPr>
+        <w:t>EXTENDED LOG2 REFERENCE TABLE (All Exam Fractions)</w:t>
+      </w:r>
+    </w:p>
+    <w:p>
+      <w:r>
+        <w:rPr>
+          <w:b w:val="0"/>
+        </w:rPr>
+        <w:t>Use these values when computing entropy H(S) = -sum p*log2(p) in decision tree questions.</w:t>
+      </w:r>
+    </w:p>
+    <w:tbl>
+      <w:tblPr>
+        <w:tblStyle w:val="TableGrid"/>
+        <w:tblW w:type="auto" w:w="0"/>
+        <w:tblLook w:firstColumn="1" w:firstRow="1" w:lastColumn="0" w:lastRow="0" w:noHBand="0" w:noVBand="1" w:val="04A0"/>
+      </w:tblPr>
+      <w:tblGrid>
+        <w:gridCol w:w="3400"/>
+        <w:gridCol w:w="3400"/>
+        <w:gridCol w:w="3400"/>
+      </w:tblGrid>
+      <w:tr>
+        <w:tc>
+          <w:tcPr>
+            <w:tcW w:type="dxa" w:w="3400"/>
+          </w:tcPr>
+          <w:p>
+            <w:r>
+              <w:rPr>
+                <w:b/>
+              </w:rPr>
+              <w:t>Fraction p</w:t>
+            </w:r>
+          </w:p>
+        </w:tc>
+        <w:tc>
+          <w:tcPr>
+            <w:tcW w:type="dxa" w:w="3400"/>
+          </w:tcPr>
+          <w:p>
+            <w:r>
+              <w:rPr>
+                <w:b/>
+              </w:rPr>
+              <w:t>log2(p)</w:t>
+            </w:r>
+          </w:p>
+        </w:tc>
+        <w:tc>
+          <w:tcPr>
+            <w:tcW w:type="dxa" w:w="3400"/>
+          </w:tcPr>
+          <w:p>
+            <w:r>
+              <w:rPr>
+                <w:b/>
+              </w:rPr>
+              <w:t>-p*log2(p)</w:t>
+            </w:r>
+          </w:p>
+        </w:tc>
+      </w:tr>
+      <w:tr>
+        <w:tc>
+          <w:tcPr>
+            <w:tcW w:type="dxa" w:w="3400"/>
+          </w:tcPr>
+          <w:p>
+            <w:r>
+              <w:t>1/2 = 0.500</w:t>
+            </w:r>
+          </w:p>
+        </w:tc>
+        <w:tc>
+          <w:tcPr>
+            <w:tcW w:type="dxa" w:w="3400"/>
+          </w:tcPr>
+          <w:p>
+            <w:r>
+              <w:t>-1.000</w:t>
+            </w:r>
+          </w:p>
+        </w:tc>
+        <w:tc>
+          <w:tcPr>
+            <w:tcW w:type="dxa" w:w="3400"/>
+          </w:tcPr>
+          <w:p>
+            <w:r>
+              <w:t>0.500</w:t>
+            </w:r>
+          </w:p>
+        </w:tc>
+      </w:tr>
+      <w:tr>
+        <w:tc>
+          <w:tcPr>
+            <w:tcW w:type="dxa" w:w="3400"/>
+          </w:tcPr>
+          <w:p>
+            <w:r>
+              <w:t>1/3 = 0.333</w:t>
+            </w:r>
+          </w:p>
+        </w:tc>
+        <w:tc>
+          <w:tcPr>
+            <w:tcW w:type="dxa" w:w="3400"/>
+          </w:tcPr>
+          <w:p>
+            <w:r>
+              <w:t>-1.585</w:t>
+            </w:r>
+          </w:p>
+        </w:tc>
+        <w:tc>
+          <w:tcPr>
+            <w:tcW w:type="dxa" w:w="3400"/>
+          </w:tcPr>
+          <w:p>
+            <w:r>
+              <w:t>0.528</w:t>
+            </w:r>
+          </w:p>
+        </w:tc>
+      </w:tr>
+      <w:tr>
+        <w:tc>
+          <w:tcPr>
+            <w:tcW w:type="dxa" w:w="3400"/>
+          </w:tcPr>
+          <w:p>
+            <w:r>
+              <w:t>2/3 = 0.667</w:t>
+            </w:r>
+          </w:p>
+        </w:tc>
+        <w:tc>
+          <w:tcPr>
+            <w:tcW w:type="dxa" w:w="3400"/>
+          </w:tcPr>
+          <w:p>
+            <w:r>
+              <w:t>-0.585</w:t>
+            </w:r>
+          </w:p>
+        </w:tc>
+        <w:tc>
+          <w:tcPr>
+            <w:tcW w:type="dxa" w:w="3400"/>
+          </w:tcPr>
+          <w:p>
+            <w:r>
+              <w:t>0.390</w:t>
+            </w:r>
+          </w:p>
+        </w:tc>
+      </w:tr>
+      <w:tr>
+        <w:tc>
+          <w:tcPr>
+            <w:tcW w:type="dxa" w:w="3400"/>
+          </w:tcPr>
+          <w:p>
+            <w:r>
+              <w:t>1/4 = 0.250</w:t>
+            </w:r>
+          </w:p>
+        </w:tc>
+        <w:tc>
+          <w:tcPr>
+            <w:tcW w:type="dxa" w:w="3400"/>
+          </w:tcPr>
+          <w:p>
+            <w:r>
+              <w:t>-2.000</w:t>
+            </w:r>
+          </w:p>
+        </w:tc>
+        <w:tc>
+          <w:tcPr>
+            <w:tcW w:type="dxa" w:w="3400"/>
+          </w:tcPr>
+          <w:p>
+            <w:r>
+              <w:t>0.500</w:t>
+            </w:r>
+          </w:p>
+        </w:tc>
+      </w:tr>
+      <w:tr>
+        <w:tc>
+          <w:tcPr>
+            <w:tcW w:type="dxa" w:w="3400"/>
+          </w:tcPr>
+          <w:p>
+            <w:r>
+              <w:t>3/4 = 0.750</w:t>
+            </w:r>
+          </w:p>
+        </w:tc>
+        <w:tc>
+          <w:tcPr>
+            <w:tcW w:type="dxa" w:w="3400"/>
+          </w:tcPr>
+          <w:p>
+            <w:r>
+              <w:t>-0.415</w:t>
+            </w:r>
+          </w:p>
+        </w:tc>
+        <w:tc>
+          <w:tcPr>
+            <w:tcW w:type="dxa" w:w="3400"/>
+          </w:tcPr>
+          <w:p>
+            <w:r>
+              <w:t>0.311</w:t>
+            </w:r>
+          </w:p>
+        </w:tc>
+      </w:tr>
+      <w:tr>
+        <w:tc>
+          <w:tcPr>
+            <w:tcW w:type="dxa" w:w="3400"/>
+          </w:tcPr>
+          <w:p>
+            <w:r>
+              <w:t>1/5 = 0.200</w:t>
+            </w:r>
+          </w:p>
+        </w:tc>
+        <w:tc>
+          <w:tcPr>
+            <w:tcW w:type="dxa" w:w="3400"/>
+          </w:tcPr>
+          <w:p>
+            <w:r>
+              <w:t>-2.322</w:t>
+            </w:r>
+          </w:p>
+        </w:tc>
+        <w:tc>
+          <w:tcPr>
+            <w:tcW w:type="dxa" w:w="3400"/>
+          </w:tcPr>
+          <w:p>
+            <w:r>
+              <w:t>0.464</w:t>
+            </w:r>
+          </w:p>
+        </w:tc>
+      </w:tr>
+      <w:tr>
+        <w:tc>
+          <w:tcPr>
+            <w:tcW w:type="dxa" w:w="3400"/>
+          </w:tcPr>
+          <w:p>
+            <w:r>
+              <w:t>2/5 = 0.400</w:t>
+            </w:r>
+          </w:p>
+        </w:tc>
+        <w:tc>
+          <w:tcPr>
+            <w:tcW w:type="dxa" w:w="3400"/>
+          </w:tcPr>
+          <w:p>
+            <w:r>
+              <w:t>-1.322</w:t>
+            </w:r>
+          </w:p>
+        </w:tc>
+        <w:tc>
+          <w:tcPr>
+            <w:tcW w:type="dxa" w:w="3400"/>
+          </w:tcPr>
+          <w:p>
+            <w:r>
+              <w:t>0.529</w:t>
+            </w:r>
+          </w:p>
+        </w:tc>
+      </w:tr>
+      <w:tr>
+        <w:tc>
+          <w:tcPr>
+            <w:tcW w:type="dxa" w:w="3400"/>
+          </w:tcPr>
+          <w:p>
+            <w:r>
+              <w:t>3/5 = 0.600</w:t>
+            </w:r>
+          </w:p>
+        </w:tc>
+        <w:tc>
+          <w:tcPr>
+            <w:tcW w:type="dxa" w:w="3400"/>
+          </w:tcPr>
+          <w:p>
+            <w:r>
+              <w:t>-0.737</w:t>
+            </w:r>
+          </w:p>
+        </w:tc>
+        <w:tc>
+          <w:tcPr>
+            <w:tcW w:type="dxa" w:w="3400"/>
+          </w:tcPr>
+          <w:p>
+            <w:r>
+              <w:t>0.442</w:t>
+            </w:r>
+          </w:p>
+        </w:tc>
+      </w:tr>
+      <w:tr>
+        <w:tc>
+          <w:tcPr>
+            <w:tcW w:type="dxa" w:w="3400"/>
+          </w:tcPr>
+          <w:p>
+            <w:r>
+              <w:t>4/5 = 0.800</w:t>
+            </w:r>
+          </w:p>
+        </w:tc>
+        <w:tc>
+          <w:tcPr>
+            <w:tcW w:type="dxa" w:w="3400"/>
+          </w:tcPr>
+          <w:p>
+            <w:r>
+              <w:t>-0.322</w:t>
+            </w:r>
+          </w:p>
+        </w:tc>
+        <w:tc>
+          <w:tcPr>
+            <w:tcW w:type="dxa" w:w="3400"/>
+          </w:tcPr>
+          <w:p>
+            <w:r>
+              <w:t>0.258</w:t>
+            </w:r>
+          </w:p>
+        </w:tc>
+      </w:tr>
+      <w:tr>
+        <w:tc>
+          <w:tcPr>
+            <w:tcW w:type="dxa" w:w="3400"/>
+          </w:tcPr>
+          <w:p>
+            <w:r>
+              <w:t>1/6 = 0.167</w:t>
+            </w:r>
+          </w:p>
+        </w:tc>
+        <w:tc>
+          <w:tcPr>
+            <w:tcW w:type="dxa" w:w="3400"/>
+          </w:tcPr>
+          <w:p>
+            <w:r>
+              <w:t>-2.585</w:t>
+            </w:r>
+          </w:p>
+        </w:tc>
+        <w:tc>
+          <w:tcPr>
+            <w:tcW w:type="dxa" w:w="3400"/>
+          </w:tcPr>
+          <w:p>
+            <w:r>
+              <w:t>0.431</w:t>
+            </w:r>
+          </w:p>
+        </w:tc>
+      </w:tr>
+      <w:tr>
+        <w:tc>
+          <w:tcPr>
+            <w:tcW w:type="dxa" w:w="3400"/>
+          </w:tcPr>
+          <w:p>
+            <w:r>
+              <w:t>5/6 = 0.833</w:t>
+            </w:r>
+          </w:p>
+        </w:tc>
+        <w:tc>
+          <w:tcPr>
+            <w:tcW w:type="dxa" w:w="3400"/>
+          </w:tcPr>
+          <w:p>
+            <w:r>
+              <w:t>-0.263</w:t>
+            </w:r>
+          </w:p>
+        </w:tc>
+        <w:tc>
+          <w:tcPr>
+            <w:tcW w:type="dxa" w:w="3400"/>
+          </w:tcPr>
+          <w:p>
+            <w:r>
+              <w:t>0.219</w:t>
+            </w:r>
+          </w:p>
+        </w:tc>
+      </w:tr>
+      <w:tr>
+        <w:tc>
+          <w:tcPr>
+            <w:tcW w:type="dxa" w:w="3400"/>
+          </w:tcPr>
+          <w:p>
+            <w:r>
+              <w:t>1/7 = 0.143</w:t>
+            </w:r>
+          </w:p>
+        </w:tc>
+        <w:tc>
+          <w:tcPr>
+            <w:tcW w:type="dxa" w:w="3400"/>
+          </w:tcPr>
+          <w:p>
+            <w:r>
+              <w:t>-2.807</w:t>
+            </w:r>
+          </w:p>
+        </w:tc>
+        <w:tc>
+          <w:tcPr>
+            <w:tcW w:type="dxa" w:w="3400"/>
+          </w:tcPr>
+          <w:p>
+            <w:r>
+              <w:t>0.401</w:t>
+            </w:r>
+          </w:p>
+        </w:tc>
+      </w:tr>
+      <w:tr>
+        <w:tc>
+          <w:tcPr>
+            <w:tcW w:type="dxa" w:w="3400"/>
+          </w:tcPr>
+          <w:p>
+            <w:r>
+              <w:t>2/7 = 0.286</w:t>
+            </w:r>
+          </w:p>
+        </w:tc>
+        <w:tc>
+          <w:tcPr>
+            <w:tcW w:type="dxa" w:w="3400"/>
+          </w:tcPr>
+          <w:p>
+            <w:r>
+              <w:t>-1.807</w:t>
+            </w:r>
+          </w:p>
+        </w:tc>
+        <w:tc>
+          <w:tcPr>
+            <w:tcW w:type="dxa" w:w="3400"/>
+          </w:tcPr>
+          <w:p>
+            <w:r>
+              <w:t>0.516</w:t>
+            </w:r>
+          </w:p>
+        </w:tc>
+      </w:tr>
+      <w:tr>
+        <w:tc>
+          <w:tcPr>
+            <w:tcW w:type="dxa" w:w="3400"/>
+          </w:tcPr>
+          <w:p>
+            <w:r>
+              <w:t>3/7 = 0.429</w:t>
+            </w:r>
+          </w:p>
+        </w:tc>
+        <w:tc>
+          <w:tcPr>
+            <w:tcW w:type="dxa" w:w="3400"/>
+          </w:tcPr>
+          <w:p>
+            <w:r>
+              <w:t>-1.222</w:t>
+            </w:r>
+          </w:p>
+        </w:tc>
+        <w:tc>
+          <w:tcPr>
+            <w:tcW w:type="dxa" w:w="3400"/>
+          </w:tcPr>
+          <w:p>
+            <w:r>
+              <w:t>0.524</w:t>
+            </w:r>
+          </w:p>
+        </w:tc>
+      </w:tr>
+      <w:tr>
+        <w:tc>
+          <w:tcPr>
+            <w:tcW w:type="dxa" w:w="3400"/>
+          </w:tcPr>
+          <w:p>
+            <w:r>
+              <w:t>4/7 = 0.571</w:t>
+            </w:r>
+          </w:p>
+        </w:tc>
+        <w:tc>
+          <w:tcPr>
+            <w:tcW w:type="dxa" w:w="3400"/>
+          </w:tcPr>
+          <w:p>
+            <w:r>
+              <w:t>-0.807</w:t>
+            </w:r>
+          </w:p>
+        </w:tc>
+        <w:tc>
+          <w:tcPr>
+            <w:tcW w:type="dxa" w:w="3400"/>
+          </w:tcPr>
+          <w:p>
+            <w:r>
+              <w:t>0.461</w:t>
+            </w:r>
+          </w:p>
+        </w:tc>
+      </w:tr>
+      <w:tr>
+        <w:tc>
+          <w:tcPr>
+            <w:tcW w:type="dxa" w:w="3400"/>
+          </w:tcPr>
+          <w:p>
+            <w:r>
+              <w:t>5/7 = 0.714</w:t>
+            </w:r>
+          </w:p>
+        </w:tc>
+        <w:tc>
+          <w:tcPr>
+            <w:tcW w:type="dxa" w:w="3400"/>
+          </w:tcPr>
+          <w:p>
+            <w:r>
+              <w:t>-0.485</w:t>
+            </w:r>
+          </w:p>
+        </w:tc>
+        <w:tc>
+          <w:tcPr>
+            <w:tcW w:type="dxa" w:w="3400"/>
+          </w:tcPr>
+          <w:p>
+            <w:r>
+              <w:t>0.346</w:t>
+            </w:r>
+          </w:p>
+        </w:tc>
+      </w:tr>
+      <w:tr>
+        <w:tc>
+          <w:tcPr>
+            <w:tcW w:type="dxa" w:w="3400"/>
+          </w:tcPr>
+          <w:p>
+            <w:r>
+              <w:t>6/7 = 0.857</w:t>
+            </w:r>
+          </w:p>
+        </w:tc>
+        <w:tc>
+          <w:tcPr>
+            <w:tcW w:type="dxa" w:w="3400"/>
+          </w:tcPr>
+          <w:p>
+            <w:r>
+              <w:t>-0.222</w:t>
+            </w:r>
+          </w:p>
+        </w:tc>
+        <w:tc>
+          <w:tcPr>
+            <w:tcW w:type="dxa" w:w="3400"/>
+          </w:tcPr>
+          <w:p>
+            <w:r>
+              <w:t>0.190</w:t>
+            </w:r>
+          </w:p>
+        </w:tc>
+      </w:tr>
+      <w:tr>
+        <w:tc>
+          <w:tcPr>
+            <w:tcW w:type="dxa" w:w="3400"/>
+          </w:tcPr>
+          <w:p>
+            <w:r>
+              <w:t>1/8 = 0.125</w:t>
+            </w:r>
+          </w:p>
+        </w:tc>
+        <w:tc>
+          <w:tcPr>
+            <w:tcW w:type="dxa" w:w="3400"/>
+          </w:tcPr>
+          <w:p>
+            <w:r>
+              <w:t>-3.000</w:t>
+            </w:r>
+          </w:p>
+        </w:tc>
+        <w:tc>
+          <w:tcPr>
+            <w:tcW w:type="dxa" w:w="3400"/>
+          </w:tcPr>
+          <w:p>
+            <w:r>
+              <w:t>0.375</w:t>
+            </w:r>
+          </w:p>
+        </w:tc>
+      </w:tr>
+      <w:tr>
+        <w:tc>
+          <w:tcPr>
+            <w:tcW w:type="dxa" w:w="3400"/>
+          </w:tcPr>
+          <w:p>
+            <w:r>
+              <w:t>3/8 = 0.375</w:t>
+            </w:r>
+          </w:p>
+        </w:tc>
+        <w:tc>
+          <w:tcPr>
+            <w:tcW w:type="dxa" w:w="3400"/>
+          </w:tcPr>
+          <w:p>
+            <w:r>
+              <w:t>-1.415</w:t>
+            </w:r>
+          </w:p>
+        </w:tc>
+        <w:tc>
+          <w:tcPr>
+            <w:tcW w:type="dxa" w:w="3400"/>
+          </w:tcPr>
+          <w:p>
+            <w:r>
+              <w:t>0.531</w:t>
+            </w:r>
+          </w:p>
+        </w:tc>
+      </w:tr>
+      <w:tr>
+        <w:tc>
+          <w:tcPr>
+            <w:tcW w:type="dxa" w:w="3400"/>
+          </w:tcPr>
+          <w:p>
+            <w:r>
+              <w:t>5/8 = 0.625</w:t>
+            </w:r>
+          </w:p>
+        </w:tc>
+        <w:tc>
+          <w:tcPr>
+            <w:tcW w:type="dxa" w:w="3400"/>
+          </w:tcPr>
+          <w:p>
+            <w:r>
+              <w:t>-0.678</w:t>
+            </w:r>
+          </w:p>
+        </w:tc>
+        <w:tc>
+          <w:tcPr>
+            <w:tcW w:type="dxa" w:w="3400"/>
+          </w:tcPr>
+          <w:p>
+            <w:r>
+              <w:t>0.424</w:t>
+            </w:r>
+          </w:p>
+        </w:tc>
+      </w:tr>
+      <w:tr>
+        <w:tc>
+          <w:tcPr>
+            <w:tcW w:type="dxa" w:w="3400"/>
+          </w:tcPr>
+          <w:p>
+            <w:r>
+              <w:t>7/8 = 0.875</w:t>
+            </w:r>
+          </w:p>
+        </w:tc>
+        <w:tc>
+          <w:tcPr>
+            <w:tcW w:type="dxa" w:w="3400"/>
+          </w:tcPr>
+          <w:p>
+            <w:r>
+              <w:t>-0.193</w:t>
+            </w:r>
+          </w:p>
+        </w:tc>
+        <w:tc>
+          <w:tcPr>
+            <w:tcW w:type="dxa" w:w="3400"/>
+          </w:tcPr>
+          <w:p>
+            <w:r>
+              <w:t>0.169</w:t>
+            </w:r>
+          </w:p>
+        </w:tc>
+      </w:tr>
+    </w:tbl>
+    <w:p>
+      <w:r>
+        <w:rPr>
+          <w:b w:val="0"/>
+        </w:rPr>
+        <w:t>Common H values: H(1/2,1/2)=1.000 | H(1/3,2/3)=0.918 | H(1/4,3/4)=0.811</w:t>
+      </w:r>
+    </w:p>
+    <w:p>
+      <w:r>
+        <w:rPr>
+          <w:b w:val="0"/>
+        </w:rPr>
+        <w:t xml:space="preserve">                 H(1/5,4/5)=0.722 | H(1/6,5/6)=0.650 | H(2/7,5/7)=0.863 | H(3/7,4/7)=0.985</w:t>
+      </w:r>
+    </w:p>
+    <w:p>
+      <w:pPr>
+        <w:pStyle w:val="Heading2"/>
+      </w:pPr>
+      <w:r>
+        <w:rPr>
+          <w:b/>
+        </w:rPr>
+        <w:t>Aug 2022 Q3.1: 8-Puzzle BFS — Full Expansion</w:t>
+      </w:r>
+    </w:p>
+    <w:p>
+      <w:r>
+        <w:rPr>
+          <w:b w:val="0"/>
+        </w:rPr>
+        <w:t>Start (b): [1,4,2 / 3,_,5 / 6,7,8]    Goal (a): [_,1,2 / 3,4,5 / 6,7,8]    (blank = _)</w:t>
+      </w:r>
+    </w:p>
+    <w:p>
+      <w:r>
+        <w:rPr>
+          <w:b w:val="0"/>
+        </w:rPr>
+        <w:t>Blank is at (row=1, col=1) in the start state.</w:t>
+      </w:r>
+    </w:p>
+    <w:p>
+      <w:r>
+        <w:rPr>
+          <w:b w:val="0"/>
+        </w:rPr>
+        <w:t>BFS uses a FIFO queue; expand one level at a time; mark visited to avoid repeats.</w:t>
+      </w:r>
+    </w:p>
+    <w:p>
+      <w:r>
+        <w:rPr>
+          <w:b w:val="0"/>
+        </w:rPr>
+        <w:t>Level 0 (queue): {Start=[1,4,2/3,_,5/6,7,8]}</w:t>
+      </w:r>
+    </w:p>
+    <w:p>
+      <w:r>
+        <w:rPr>
+          <w:b w:val="0"/>
+        </w:rPr>
+        <w:t>Level 1 -- expand Start, blank moves U/D/L/R:</w:t>
+      </w:r>
+    </w:p>
+    <w:tbl>
+      <w:tblPr>
+        <w:tblStyle w:val="TableGrid"/>
+        <w:tblW w:type="auto" w:w="0"/>
+        <w:tblLook w:firstColumn="1" w:firstRow="1" w:lastColumn="0" w:lastRow="0" w:noHBand="0" w:noVBand="1" w:val="04A0"/>
+      </w:tblPr>
+      <w:tblGrid>
+        <w:gridCol w:w="3400"/>
+        <w:gridCol w:w="3400"/>
+        <w:gridCol w:w="3400"/>
+      </w:tblGrid>
+      <w:tr>
+        <w:tc>
+          <w:tcPr>
+            <w:tcW w:type="dxa" w:w="3400"/>
+          </w:tcPr>
+          <w:p>
+            <w:r>
+              <w:rPr>
+                <w:b/>
+              </w:rPr>
+              <w:t>Move</w:t>
+            </w:r>
+          </w:p>
+        </w:tc>
+        <w:tc>
+          <w:tcPr>
+            <w:tcW w:type="dxa" w:w="3400"/>
+          </w:tcPr>
+          <w:p>
+            <w:r>
+              <w:rPr>
+                <w:b/>
+              </w:rPr>
+              <w:t>New State</w:t>
+            </w:r>
+          </w:p>
+        </w:tc>
+        <w:tc>
+          <w:tcPr>
+            <w:tcW w:type="dxa" w:w="3400"/>
+          </w:tcPr>
+          <w:p>
+            <w:r>
+              <w:rPr>
+                <w:b/>
+              </w:rPr>
+              <w:t>Goal?</w:t>
+            </w:r>
+          </w:p>
+        </w:tc>
+      </w:tr>
+      <w:tr>
+        <w:tc>
+          <w:tcPr>
+            <w:tcW w:type="dxa" w:w="3400"/>
+          </w:tcPr>
+          <w:p>
+            <w:r>
+              <w:t>UP (4 slides down)</w:t>
+            </w:r>
+          </w:p>
+        </w:tc>
+        <w:tc>
+          <w:tcPr>
+            <w:tcW w:type="dxa" w:w="3400"/>
+          </w:tcPr>
+          <w:p>
+            <w:r>
+              <w:t>[1,_,2 / 3,4,5 / 6,7,8]</w:t>
+            </w:r>
+          </w:p>
+        </w:tc>
+        <w:tc>
+          <w:tcPr>
+            <w:tcW w:type="dxa" w:w="3400"/>
+          </w:tcPr>
+          <w:p>
+            <w:r>
+              <w:t>No</w:t>
+            </w:r>
+          </w:p>
+        </w:tc>
+      </w:tr>
+      <w:tr>
+        <w:tc>
+          <w:tcPr>
+            <w:tcW w:type="dxa" w:w="3400"/>
+          </w:tcPr>
+          <w:p>
+            <w:r>
+              <w:t>DOWN (7 slides up)</w:t>
+            </w:r>
+          </w:p>
+        </w:tc>
+        <w:tc>
+          <w:tcPr>
+            <w:tcW w:type="dxa" w:w="3400"/>
+          </w:tcPr>
+          <w:p>
+            <w:r>
+              <w:t>[1,4,2 / 3,7,5 / 6,_,8]</w:t>
+            </w:r>
+          </w:p>
+        </w:tc>
+        <w:tc>
+          <w:tcPr>
+            <w:tcW w:type="dxa" w:w="3400"/>
+          </w:tcPr>
+          <w:p>
+            <w:r>
+              <w:t>No</w:t>
+            </w:r>
+          </w:p>
+        </w:tc>
+      </w:tr>
+      <w:tr>
+        <w:tc>
+          <w:tcPr>
+            <w:tcW w:type="dxa" w:w="3400"/>
+          </w:tcPr>
+          <w:p>
+            <w:r>
+              <w:t>LEFT (3 slides right)</w:t>
+            </w:r>
+          </w:p>
+        </w:tc>
+        <w:tc>
+          <w:tcPr>
+            <w:tcW w:type="dxa" w:w="3400"/>
+          </w:tcPr>
+          <w:p>
+            <w:r>
+              <w:t>[1,4,2 / _,3,5 / 6,7,8]</w:t>
+            </w:r>
+          </w:p>
+        </w:tc>
+        <w:tc>
+          <w:tcPr>
+            <w:tcW w:type="dxa" w:w="3400"/>
+          </w:tcPr>
+          <w:p>
+            <w:r>
+              <w:t>No</w:t>
+            </w:r>
+          </w:p>
+        </w:tc>
+      </w:tr>
+      <w:tr>
+        <w:tc>
+          <w:tcPr>
+            <w:tcW w:type="dxa" w:w="3400"/>
+          </w:tcPr>
+          <w:p>
+            <w:r>
+              <w:t>RIGHT (5 slides left)</w:t>
+            </w:r>
+          </w:p>
+        </w:tc>
+        <w:tc>
+          <w:tcPr>
+            <w:tcW w:type="dxa" w:w="3400"/>
+          </w:tcPr>
+          <w:p>
+            <w:r>
+              <w:t>[1,4,2 / 3,5,_ / 6,7,8]</w:t>
+            </w:r>
+          </w:p>
+        </w:tc>
+        <w:tc>
+          <w:tcPr>
+            <w:tcW w:type="dxa" w:w="3400"/>
+          </w:tcPr>
+          <w:p>
+            <w:r>
+              <w:t>No</w:t>
+            </w:r>
+          </w:p>
+        </w:tc>
+      </w:tr>
+    </w:tbl>
+    <w:p>
+      <w:r>
+        <w:rPr>
+          <w:b w:val="0"/>
+        </w:rPr>
+        <w:t>Level 2 -- expand first Level-1 node [1,_,2 / 3,4,5 / 6,7,8], blank at (0,1):</w:t>
+      </w:r>
+    </w:p>
+    <w:tbl>
+      <w:tblPr>
+        <w:tblStyle w:val="TableGrid"/>
+        <w:tblW w:type="auto" w:w="0"/>
+        <w:tblLook w:firstColumn="1" w:firstRow="1" w:lastColumn="0" w:lastRow="0" w:noHBand="0" w:noVBand="1" w:val="04A0"/>
+      </w:tblPr>
+      <w:tblGrid>
+        <w:gridCol w:w="3400"/>
+        <w:gridCol w:w="3400"/>
+        <w:gridCol w:w="3400"/>
+      </w:tblGrid>
+      <w:tr>
+        <w:tc>
+          <w:tcPr>
+            <w:tcW w:type="dxa" w:w="3400"/>
+          </w:tcPr>
+          <w:p>
+            <w:r>
+              <w:rPr>
+                <w:b/>
+              </w:rPr>
+              <w:t>Move</w:t>
+            </w:r>
+          </w:p>
+        </w:tc>
+        <w:tc>
+          <w:tcPr>
+            <w:tcW w:type="dxa" w:w="3400"/>
+          </w:tcPr>
+          <w:p>
+            <w:r>
+              <w:rPr>
+                <w:b/>
+              </w:rPr>
+              <w:t>New State</w:t>
+            </w:r>
+          </w:p>
+        </w:tc>
+        <w:tc>
+          <w:tcPr>
+            <w:tcW w:type="dxa" w:w="3400"/>
+          </w:tcPr>
+          <w:p>
+            <w:r>
+              <w:rPr>
+                <w:b/>
+              </w:rPr>
+              <w:t>Goal?</w:t>
+            </w:r>
+          </w:p>
+        </w:tc>
+      </w:tr>
+      <w:tr>
+        <w:tc>
+          <w:tcPr>
+            <w:tcW w:type="dxa" w:w="3400"/>
+          </w:tcPr>
+          <w:p>
+            <w:r>
+              <w:t>LEFT (1 slides right)</w:t>
+            </w:r>
+          </w:p>
+        </w:tc>
+        <w:tc>
+          <w:tcPr>
+            <w:tcW w:type="dxa" w:w="3400"/>
+          </w:tcPr>
+          <w:p>
+            <w:r>
+              <w:t>[_,1,2 / 3,4,5 / 6,7,8]</w:t>
+            </w:r>
+          </w:p>
+        </w:tc>
+        <w:tc>
+          <w:tcPr>
+            <w:tcW w:type="dxa" w:w="3400"/>
+          </w:tcPr>
+          <w:p>
+            <w:r>
+              <w:t>YES -- GOAL FOUND!</w:t>
+            </w:r>
+          </w:p>
+        </w:tc>
+      </w:tr>
+      <w:tr>
+        <w:tc>
+          <w:tcPr>
+            <w:tcW w:type="dxa" w:w="3400"/>
+          </w:tcPr>
+          <w:p>
+            <w:r>
+              <w:t>RIGHT (2 slides left)</w:t>
+            </w:r>
+          </w:p>
+        </w:tc>
+        <w:tc>
+          <w:tcPr>
+            <w:tcW w:type="dxa" w:w="3400"/>
+          </w:tcPr>
+          <w:p>
+            <w:r>
+              <w:t>[1,2,_ / 3,4,5 / 6,7,8]</w:t>
+            </w:r>
+          </w:p>
+        </w:tc>
+        <w:tc>
+          <w:tcPr>
+            <w:tcW w:type="dxa" w:w="3400"/>
+          </w:tcPr>
+          <w:p>
+            <w:r>
+              <w:t>Would check next</w:t>
+            </w:r>
+          </w:p>
+        </w:tc>
+      </w:tr>
+      <w:tr>
+        <w:tc>
+          <w:tcPr>
+            <w:tcW w:type="dxa" w:w="3400"/>
+          </w:tcPr>
+          <w:p>
+            <w:r>
+              <w:t>DOWN (4 slides up)</w:t>
+            </w:r>
+          </w:p>
+        </w:tc>
+        <w:tc>
+          <w:tcPr>
+            <w:tcW w:type="dxa" w:w="3400"/>
+          </w:tcPr>
+          <w:p>
+            <w:r>
+              <w:t>[1,4,2 / 3,_,5 / 6,7,8]</w:t>
+            </w:r>
+          </w:p>
+        </w:tc>
+        <w:tc>
+          <w:tcPr>
+            <w:tcW w:type="dxa" w:w="3400"/>
+          </w:tcPr>
+          <w:p>
+            <w:r>
+              <w:t>Parent -- skip (visited)</w:t>
+            </w:r>
+          </w:p>
+        </w:tc>
+      </w:tr>
+    </w:tbl>
+    <w:p>
+      <w:r>
+        <w:rPr>
+          <w:b w:val="0"/>
+        </w:rPr>
+        <w:t>SOLUTION: Start -&gt; [1,_,2/3,4,5/6,7,8] -&gt; [_,1,2/3,4,5/6,7,8] (depth = 2)</w:t>
+      </w:r>
+    </w:p>
+    <w:p>
+      <w:r>
+        <w:rPr>
+          <w:b w:val="0"/>
+        </w:rPr>
+        <w:t>Moves: slide 4 down (blank up), then slide 1 right (blank left).</w:t>
+      </w:r>
+    </w:p>
+    <w:p>
+      <w:pPr>
+        <w:pStyle w:val="Heading2"/>
+      </w:pPr>
+      <w:r>
+        <w:rPr>
+          <w:b/>
+        </w:rPr>
+        <w:t>Aug 2022 Q3.2: Heuristic Dominance Calculation</w:t>
+      </w:r>
+    </w:p>
+    <w:p>
+      <w:r>
+        <w:rPr>
+          <w:b w:val="0"/>
+        </w:rPr>
+        <w:t>From state (c)=[7,2,_/5,4,3/1,6,8] to goal (a)=[_,1,2/3,4,5/6,7,8]</w:t>
+      </w:r>
+    </w:p>
+    <w:p>
+      <w:r>
+        <w:rPr>
+          <w:b w:val="0"/>
+        </w:rPr>
+        <w:t>h1 = misplaced tiles | h2 = Manhattan distance (sum of moves to reach goal)</w:t>
+      </w:r>
+    </w:p>
+    <w:tbl>
+      <w:tblPr>
+        <w:tblStyle w:val="TableGrid"/>
+        <w:tblW w:type="auto" w:w="0"/>
+        <w:tblLook w:firstColumn="1" w:firstRow="1" w:lastColumn="0" w:lastRow="0" w:noHBand="0" w:noVBand="1" w:val="04A0"/>
+      </w:tblPr>
+      <w:tblGrid>
+        <w:gridCol w:w="2040"/>
+        <w:gridCol w:w="2040"/>
+        <w:gridCol w:w="2040"/>
+        <w:gridCol w:w="2040"/>
+        <w:gridCol w:w="2040"/>
+      </w:tblGrid>
+      <w:tr>
+        <w:tc>
+          <w:tcPr>
+            <w:tcW w:type="dxa" w:w="2040"/>
+          </w:tcPr>
+          <w:p>
+            <w:r>
+              <w:rPr>
+                <w:b/>
+              </w:rPr>
+              <w:t>Tile</w:t>
+            </w:r>
+          </w:p>
+        </w:tc>
+        <w:tc>
+          <w:tcPr>
+            <w:tcW w:type="dxa" w:w="2040"/>
+          </w:tcPr>
+          <w:p>
+            <w:r>
+              <w:rPr>
+                <w:b/>
+              </w:rPr>
+              <w:t>Current (row,col)</w:t>
+            </w:r>
+          </w:p>
+        </w:tc>
+        <w:tc>
+          <w:tcPr>
+            <w:tcW w:type="dxa" w:w="2040"/>
+          </w:tcPr>
+          <w:p>
+            <w:r>
+              <w:rPr>
+                <w:b/>
+              </w:rPr>
+              <w:t>Goal (row,col)</w:t>
+            </w:r>
+          </w:p>
+        </w:tc>
+        <w:tc>
+          <w:tcPr>
+            <w:tcW w:type="dxa" w:w="2040"/>
+          </w:tcPr>
+          <w:p>
+            <w:r>
+              <w:rPr>
+                <w:b/>
+              </w:rPr>
+              <w:t>Misplaced?</w:t>
+            </w:r>
+          </w:p>
+        </w:tc>
+        <w:tc>
+          <w:tcPr>
+            <w:tcW w:type="dxa" w:w="2040"/>
+          </w:tcPr>
+          <w:p>
+            <w:r>
+              <w:rPr>
+                <w:b/>
+              </w:rPr>
+              <w:t>Manhattan dist</w:t>
+            </w:r>
+          </w:p>
+        </w:tc>
+      </w:tr>
+      <w:tr>
+        <w:tc>
+          <w:tcPr>
+            <w:tcW w:type="dxa" w:w="2040"/>
+          </w:tcPr>
+          <w:p>
+            <w:r>
+              <w:t>1</w:t>
+            </w:r>
+          </w:p>
+        </w:tc>
+        <w:tc>
+          <w:tcPr>
+            <w:tcW w:type="dxa" w:w="2040"/>
+          </w:tcPr>
+          <w:p>
+            <w:r>
+              <w:t>(2,0)</w:t>
+            </w:r>
+          </w:p>
+        </w:tc>
+        <w:tc>
+          <w:tcPr>
+            <w:tcW w:type="dxa" w:w="2040"/>
+          </w:tcPr>
+          <w:p>
+            <w:r>
+              <w:t>(0,1)</w:t>
+            </w:r>
+          </w:p>
+        </w:tc>
+        <w:tc>
+          <w:tcPr>
+            <w:tcW w:type="dxa" w:w="2040"/>
+          </w:tcPr>
+          <w:p>
+            <w:r>
+              <w:t>YES</w:t>
+            </w:r>
+          </w:p>
+        </w:tc>
+        <w:tc>
+          <w:tcPr>
+            <w:tcW w:type="dxa" w:w="2040"/>
+          </w:tcPr>
+          <w:p>
+            <w:r>
+              <w:t>|2-0|+|0-1| = 3</w:t>
+            </w:r>
+          </w:p>
+        </w:tc>
+      </w:tr>
+      <w:tr>
+        <w:tc>
+          <w:tcPr>
+            <w:tcW w:type="dxa" w:w="2040"/>
+          </w:tcPr>
+          <w:p>
+            <w:r>
+              <w:t>2</w:t>
+            </w:r>
+          </w:p>
+        </w:tc>
+        <w:tc>
+          <w:tcPr>
+            <w:tcW w:type="dxa" w:w="2040"/>
+          </w:tcPr>
+          <w:p>
+            <w:r>
+              <w:t>(0,1)</w:t>
+            </w:r>
+          </w:p>
+        </w:tc>
+        <w:tc>
+          <w:tcPr>
+            <w:tcW w:type="dxa" w:w="2040"/>
+          </w:tcPr>
+          <w:p>
+            <w:r>
+              <w:t>(0,2)</w:t>
+            </w:r>
+          </w:p>
+        </w:tc>
+        <w:tc>
+          <w:tcPr>
+            <w:tcW w:type="dxa" w:w="2040"/>
+          </w:tcPr>
+          <w:p>
+            <w:r>
+              <w:t>YES</w:t>
+            </w:r>
+          </w:p>
+        </w:tc>
+        <w:tc>
+          <w:tcPr>
+            <w:tcW w:type="dxa" w:w="2040"/>
+          </w:tcPr>
+          <w:p>
+            <w:r>
+              <w:t>|0-0|+|1-2| = 1</w:t>
+            </w:r>
+          </w:p>
+        </w:tc>
+      </w:tr>
+      <w:tr>
+        <w:tc>
+          <w:tcPr>
+            <w:tcW w:type="dxa" w:w="2040"/>
+          </w:tcPr>
+          <w:p>
+            <w:r>
+              <w:t>3</w:t>
+            </w:r>
+          </w:p>
+        </w:tc>
+        <w:tc>
+          <w:tcPr>
+            <w:tcW w:type="dxa" w:w="2040"/>
+          </w:tcPr>
+          <w:p>
+            <w:r>
+              <w:t>(1,2)</w:t>
+            </w:r>
+          </w:p>
+        </w:tc>
+        <w:tc>
+          <w:tcPr>
+            <w:tcW w:type="dxa" w:w="2040"/>
+          </w:tcPr>
+          <w:p>
+            <w:r>
+              <w:t>(1,0)</w:t>
+            </w:r>
+          </w:p>
+        </w:tc>
+        <w:tc>
+          <w:tcPr>
+            <w:tcW w:type="dxa" w:w="2040"/>
+          </w:tcPr>
+          <w:p>
+            <w:r>
+              <w:t>YES</w:t>
+            </w:r>
+          </w:p>
+        </w:tc>
+        <w:tc>
+          <w:tcPr>
+            <w:tcW w:type="dxa" w:w="2040"/>
+          </w:tcPr>
+          <w:p>
+            <w:r>
+              <w:t>|1-1|+|2-0| = 2</w:t>
+            </w:r>
+          </w:p>
+        </w:tc>
+      </w:tr>
+      <w:tr>
+        <w:tc>
+          <w:tcPr>
+            <w:tcW w:type="dxa" w:w="2040"/>
+          </w:tcPr>
+          <w:p>
+            <w:r>
+              <w:t>4</w:t>
+            </w:r>
+          </w:p>
+        </w:tc>
+        <w:tc>
+          <w:tcPr>
+            <w:tcW w:type="dxa" w:w="2040"/>
+          </w:tcPr>
+          <w:p>
+            <w:r>
+              <w:t>(1,1)</w:t>
+            </w:r>
+          </w:p>
+        </w:tc>
+        <w:tc>
+          <w:tcPr>
+            <w:tcW w:type="dxa" w:w="2040"/>
+          </w:tcPr>
+          <w:p>
+            <w:r>
+              <w:t>(1,1)</w:t>
+            </w:r>
+          </w:p>
+        </w:tc>
+        <w:tc>
+          <w:tcPr>
+            <w:tcW w:type="dxa" w:w="2040"/>
+          </w:tcPr>
+          <w:p>
+            <w:r>
+              <w:t>NO</w:t>
+            </w:r>
+          </w:p>
+        </w:tc>
+        <w:tc>
+          <w:tcPr>
+            <w:tcW w:type="dxa" w:w="2040"/>
+          </w:tcPr>
+          <w:p>
+            <w:r>
+              <w:t>0</w:t>
+            </w:r>
+          </w:p>
+        </w:tc>
+      </w:tr>
+      <w:tr>
+        <w:tc>
+          <w:tcPr>
+            <w:tcW w:type="dxa" w:w="2040"/>
+          </w:tcPr>
+          <w:p>
+            <w:r>
+              <w:t>5</w:t>
+            </w:r>
+          </w:p>
+        </w:tc>
+        <w:tc>
+          <w:tcPr>
+            <w:tcW w:type="dxa" w:w="2040"/>
+          </w:tcPr>
+          <w:p>
+            <w:r>
+              <w:t>(1,0)</w:t>
+            </w:r>
+          </w:p>
+        </w:tc>
+        <w:tc>
+          <w:tcPr>
+            <w:tcW w:type="dxa" w:w="2040"/>
+          </w:tcPr>
+          <w:p>
+            <w:r>
+              <w:t>(1,2)</w:t>
+            </w:r>
+          </w:p>
+        </w:tc>
+        <w:tc>
+          <w:tcPr>
+            <w:tcW w:type="dxa" w:w="2040"/>
+          </w:tcPr>
+          <w:p>
+            <w:r>
+              <w:t>YES</w:t>
+            </w:r>
+          </w:p>
+        </w:tc>
+        <w:tc>
+          <w:tcPr>
+            <w:tcW w:type="dxa" w:w="2040"/>
+          </w:tcPr>
+          <w:p>
+            <w:r>
+              <w:t>|1-1|+|0-2| = 2</w:t>
+            </w:r>
+          </w:p>
+        </w:tc>
+      </w:tr>
+      <w:tr>
+        <w:tc>
+          <w:tcPr>
+            <w:tcW w:type="dxa" w:w="2040"/>
+          </w:tcPr>
+          <w:p>
+            <w:r>
+              <w:t>6</w:t>
+            </w:r>
+          </w:p>
+        </w:tc>
+        <w:tc>
+          <w:tcPr>
+            <w:tcW w:type="dxa" w:w="2040"/>
+          </w:tcPr>
+          <w:p>
+            <w:r>
+              <w:t>(2,1)</w:t>
+            </w:r>
+          </w:p>
+        </w:tc>
+        <w:tc>
+          <w:tcPr>
+            <w:tcW w:type="dxa" w:w="2040"/>
+          </w:tcPr>
+          <w:p>
+            <w:r>
+              <w:t>(2,0)</w:t>
+            </w:r>
+          </w:p>
+        </w:tc>
+        <w:tc>
+          <w:tcPr>
+            <w:tcW w:type="dxa" w:w="2040"/>
+          </w:tcPr>
+          <w:p>
+            <w:r>
+              <w:t>YES</w:t>
+            </w:r>
+          </w:p>
+        </w:tc>
+        <w:tc>
+          <w:tcPr>
+            <w:tcW w:type="dxa" w:w="2040"/>
+          </w:tcPr>
+          <w:p>
+            <w:r>
+              <w:t>|2-2|+|1-0| = 1</w:t>
+            </w:r>
+          </w:p>
+        </w:tc>
+      </w:tr>
+      <w:tr>
+        <w:tc>
+          <w:tcPr>
+            <w:tcW w:type="dxa" w:w="2040"/>
+          </w:tcPr>
+          <w:p>
+            <w:r>
+              <w:t>7</w:t>
+            </w:r>
+          </w:p>
+        </w:tc>
+        <w:tc>
+          <w:tcPr>
+            <w:tcW w:type="dxa" w:w="2040"/>
+          </w:tcPr>
+          <w:p>
+            <w:r>
+              <w:t>(0,0)</w:t>
+            </w:r>
+          </w:p>
+        </w:tc>
+        <w:tc>
+          <w:tcPr>
+            <w:tcW w:type="dxa" w:w="2040"/>
+          </w:tcPr>
+          <w:p>
+            <w:r>
+              <w:t>(2,1)</w:t>
+            </w:r>
+          </w:p>
+        </w:tc>
+        <w:tc>
+          <w:tcPr>
+            <w:tcW w:type="dxa" w:w="2040"/>
+          </w:tcPr>
+          <w:p>
+            <w:r>
+              <w:t>YES</w:t>
+            </w:r>
+          </w:p>
+        </w:tc>
+        <w:tc>
+          <w:tcPr>
+            <w:tcW w:type="dxa" w:w="2040"/>
+          </w:tcPr>
+          <w:p>
+            <w:r>
+              <w:t>|0-2|+|0-1| = 3</w:t>
+            </w:r>
+          </w:p>
+        </w:tc>
+      </w:tr>
+      <w:tr>
+        <w:tc>
+          <w:tcPr>
+            <w:tcW w:type="dxa" w:w="2040"/>
+          </w:tcPr>
+          <w:p>
+            <w:r>
+              <w:t>8</w:t>
+            </w:r>
+          </w:p>
+        </w:tc>
+        <w:tc>
+          <w:tcPr>
+            <w:tcW w:type="dxa" w:w="2040"/>
+          </w:tcPr>
+          <w:p>
+            <w:r>
+              <w:t>(2,2)</w:t>
+            </w:r>
+          </w:p>
+        </w:tc>
+        <w:tc>
+          <w:tcPr>
+            <w:tcW w:type="dxa" w:w="2040"/>
+          </w:tcPr>
+          <w:p>
+            <w:r>
+              <w:t>(2,2)</w:t>
+            </w:r>
+          </w:p>
+        </w:tc>
+        <w:tc>
+          <w:tcPr>
+            <w:tcW w:type="dxa" w:w="2040"/>
+          </w:tcPr>
+          <w:p>
+            <w:r>
+              <w:t>NO</w:t>
+            </w:r>
+          </w:p>
+        </w:tc>
+        <w:tc>
+          <w:tcPr>
+            <w:tcW w:type="dxa" w:w="2040"/>
+          </w:tcPr>
+          <w:p>
+            <w:r>
+              <w:t>0</w:t>
+            </w:r>
+          </w:p>
+        </w:tc>
+      </w:tr>
+    </w:tbl>
+    <w:p>
+      <w:r>
+        <w:rPr>
+          <w:b w:val="0"/>
+        </w:rPr>
+        <w:t>h1 = 6 misplaced tiles</w:t>
+      </w:r>
+    </w:p>
+    <w:p>
+      <w:r>
+        <w:rPr>
+          <w:b w:val="0"/>
+        </w:rPr>
+        <w:t>h2 = 3+1+2+0+2+1+3+0 = 12</w:t>
+      </w:r>
+    </w:p>
+    <w:p>
+      <w:r>
+        <w:rPr>
+          <w:b w:val="0"/>
+        </w:rPr>
+        <w:t>CONCLUSION: h2 &gt;= h1 for this state. Both admissible. h2 dominates h1.</w:t>
+      </w:r>
+    </w:p>
+    <w:p>
+      <w:r>
+        <w:rPr>
+          <w:b w:val="0"/>
+        </w:rPr>
+        <w:t>Dominated heuristic (h2) is more informed -&gt; A* with h2 expands fewer nodes, same optimal path.</w:t>
+      </w:r>
+    </w:p>
+    <w:p>
+      <w:pPr>
+        <w:pStyle w:val="Heading2"/>
+      </w:pPr>
+      <w:r>
+        <w:rPr>
+          <w:b/>
+        </w:rPr>
+        <w:t>Aug 2022 Q4.1: Perceptron 2D (w0=(1,1), eta=0.1)</w:t>
+      </w:r>
+    </w:p>
+    <w:tbl>
+      <w:tblPr>
+        <w:tblStyle w:val="TableGrid"/>
+        <w:tblW w:type="auto" w:w="0"/>
+        <w:tblLook w:firstColumn="1" w:firstRow="1" w:lastColumn="0" w:lastRow="0" w:noHBand="0" w:noVBand="1" w:val="04A0"/>
+      </w:tblPr>
+      <w:tblGrid>
+        <w:gridCol w:w="1457"/>
+        <w:gridCol w:w="1457"/>
+        <w:gridCol w:w="1457"/>
+        <w:gridCol w:w="1457"/>
+        <w:gridCol w:w="1457"/>
+        <w:gridCol w:w="1457"/>
+        <w:gridCol w:w="1457"/>
+      </w:tblGrid>
+      <w:tr>
+        <w:tc>
+          <w:tcPr>
+            <w:tcW w:type="dxa" w:w="1457"/>
+          </w:tcPr>
+          <w:p>
+            <w:r>
+              <w:rPr>
+                <w:b/>
+              </w:rPr>
+              <w:t>Step</w:t>
+            </w:r>
+          </w:p>
+        </w:tc>
+        <w:tc>
+          <w:tcPr>
+            <w:tcW w:type="dxa" w:w="1457"/>
+          </w:tcPr>
+          <w:p>
+            <w:r>
+              <w:rPr>
+                <w:b/>
+              </w:rPr>
+              <w:t>x</w:t>
+            </w:r>
+          </w:p>
+        </w:tc>
+        <w:tc>
+          <w:tcPr>
+            <w:tcW w:type="dxa" w:w="1457"/>
+          </w:tcPr>
+          <w:p>
+            <w:r>
+              <w:rPr>
+                <w:b/>
+              </w:rPr>
+              <w:t>y</w:t>
+            </w:r>
+          </w:p>
+        </w:tc>
+        <w:tc>
+          <w:tcPr>
+            <w:tcW w:type="dxa" w:w="1457"/>
+          </w:tcPr>
+          <w:p>
+            <w:r>
+              <w:rPr>
+                <w:b/>
+              </w:rPr>
+              <w:t>s=w.x</w:t>
+            </w:r>
+          </w:p>
+        </w:tc>
+        <w:tc>
+          <w:tcPr>
+            <w:tcW w:type="dxa" w:w="1457"/>
+          </w:tcPr>
+          <w:p>
+            <w:r>
+              <w:rPr>
+                <w:b/>
+              </w:rPr>
+              <w:t>yest</w:t>
+            </w:r>
+          </w:p>
+        </w:tc>
+        <w:tc>
+          <w:tcPr>
+            <w:tcW w:type="dxa" w:w="1457"/>
+          </w:tcPr>
+          <w:p>
+            <w:r>
+              <w:rPr>
+                <w:b/>
+              </w:rPr>
+              <w:t>Update?</w:t>
+            </w:r>
+          </w:p>
+        </w:tc>
+        <w:tc>
+          <w:tcPr>
+            <w:tcW w:type="dxa" w:w="1457"/>
+          </w:tcPr>
+          <w:p>
+            <w:r>
+              <w:rPr>
+                <w:b/>
+              </w:rPr>
+              <w:t>w after</w:t>
+            </w:r>
+          </w:p>
+        </w:tc>
+      </w:tr>
+      <w:tr>
+        <w:tc>
+          <w:tcPr>
+            <w:tcW w:type="dxa" w:w="1457"/>
+          </w:tcPr>
+          <w:p>
+            <w:r>
+              <w:t>x1</w:t>
+            </w:r>
+          </w:p>
+        </w:tc>
+        <w:tc>
+          <w:tcPr>
+            <w:tcW w:type="dxa" w:w="1457"/>
+          </w:tcPr>
+          <w:p>
+            <w:r>
+              <w:t>(2,2)</w:t>
+            </w:r>
+          </w:p>
+        </w:tc>
+        <w:tc>
+          <w:tcPr>
+            <w:tcW w:type="dxa" w:w="1457"/>
+          </w:tcPr>
+          <w:p>
+            <w:r>
+              <w:t>+1</w:t>
+            </w:r>
+          </w:p>
+        </w:tc>
+        <w:tc>
+          <w:tcPr>
+            <w:tcW w:type="dxa" w:w="1457"/>
+          </w:tcPr>
+          <w:p>
+            <w:r>
+              <w:t>1*2+1*2=4.0</w:t>
+            </w:r>
+          </w:p>
+        </w:tc>
+        <w:tc>
+          <w:tcPr>
+            <w:tcW w:type="dxa" w:w="1457"/>
+          </w:tcPr>
+          <w:p>
+            <w:r>
+              <w:t>+1</w:t>
+            </w:r>
+          </w:p>
+        </w:tc>
+        <w:tc>
+          <w:tcPr>
+            <w:tcW w:type="dxa" w:w="1457"/>
+          </w:tcPr>
+          <w:p>
+            <w:r>
+              <w:t>No</w:t>
+            </w:r>
+          </w:p>
+        </w:tc>
+        <w:tc>
+          <w:tcPr>
+            <w:tcW w:type="dxa" w:w="1457"/>
+          </w:tcPr>
+          <w:p>
+            <w:r>
+              <w:t>(1.0, 1.0)</w:t>
+            </w:r>
+          </w:p>
+        </w:tc>
+      </w:tr>
+      <w:tr>
+        <w:tc>
+          <w:tcPr>
+            <w:tcW w:type="dxa" w:w="1457"/>
+          </w:tcPr>
+          <w:p>
+            <w:r>
+              <w:t>x2</w:t>
+            </w:r>
+          </w:p>
+        </w:tc>
+        <w:tc>
+          <w:tcPr>
+            <w:tcW w:type="dxa" w:w="1457"/>
+          </w:tcPr>
+          <w:p>
+            <w:r>
+              <w:t>(-2,-2)</w:t>
+            </w:r>
+          </w:p>
+        </w:tc>
+        <w:tc>
+          <w:tcPr>
+            <w:tcW w:type="dxa" w:w="1457"/>
+          </w:tcPr>
+          <w:p>
+            <w:r>
+              <w:t>+1</w:t>
+            </w:r>
+          </w:p>
+        </w:tc>
+        <w:tc>
+          <w:tcPr>
+            <w:tcW w:type="dxa" w:w="1457"/>
+          </w:tcPr>
+          <w:p>
+            <w:r>
+              <w:t>1*(-2)+1*(-2)=-4.0</w:t>
+            </w:r>
+          </w:p>
+        </w:tc>
+        <w:tc>
+          <w:tcPr>
+            <w:tcW w:type="dxa" w:w="1457"/>
+          </w:tcPr>
+          <w:p>
+            <w:r>
+              <w:t>-1</w:t>
+            </w:r>
+          </w:p>
+        </w:tc>
+        <w:tc>
+          <w:tcPr>
+            <w:tcW w:type="dxa" w:w="1457"/>
+          </w:tcPr>
+          <w:p>
+            <w:r>
+              <w:t>YES (+=0.1*2*(-2,-2))</w:t>
+            </w:r>
+          </w:p>
+        </w:tc>
+        <w:tc>
+          <w:tcPr>
+            <w:tcW w:type="dxa" w:w="1457"/>
+          </w:tcPr>
+          <w:p>
+            <w:r>
+              <w:t>(0.6, 0.6)</w:t>
+            </w:r>
+          </w:p>
+        </w:tc>
+      </w:tr>
+      <w:tr>
+        <w:tc>
+          <w:tcPr>
+            <w:tcW w:type="dxa" w:w="1457"/>
+          </w:tcPr>
+          <w:p>
+            <w:r>
+              <w:t>x3</w:t>
+            </w:r>
+          </w:p>
+        </w:tc>
+        <w:tc>
+          <w:tcPr>
+            <w:tcW w:type="dxa" w:w="1457"/>
+          </w:tcPr>
+          <w:p>
+            <w:r>
+              <w:t>(1,2)</w:t>
+            </w:r>
+          </w:p>
+        </w:tc>
+        <w:tc>
+          <w:tcPr>
+            <w:tcW w:type="dxa" w:w="1457"/>
+          </w:tcPr>
+          <w:p>
+            <w:r>
+              <w:t>-1</w:t>
+            </w:r>
+          </w:p>
+        </w:tc>
+        <w:tc>
+          <w:tcPr>
+            <w:tcW w:type="dxa" w:w="1457"/>
+          </w:tcPr>
+          <w:p>
+            <w:r>
+              <w:t>0.6*1+0.6*2=1.8</w:t>
+            </w:r>
+          </w:p>
+        </w:tc>
+        <w:tc>
+          <w:tcPr>
+            <w:tcW w:type="dxa" w:w="1457"/>
+          </w:tcPr>
+          <w:p>
+            <w:r>
+              <w:t>+1</w:t>
+            </w:r>
+          </w:p>
+        </w:tc>
+        <w:tc>
+          <w:tcPr>
+            <w:tcW w:type="dxa" w:w="1457"/>
+          </w:tcPr>
+          <w:p>
+            <w:r>
+              <w:t>YES (+=0.1*(-2)*(1,2))</w:t>
+            </w:r>
+          </w:p>
+        </w:tc>
+        <w:tc>
+          <w:tcPr>
+            <w:tcW w:type="dxa" w:w="1457"/>
+          </w:tcPr>
+          <w:p>
+            <w:r>
+              <w:t>(0.4, 0.2)</w:t>
+            </w:r>
+          </w:p>
+        </w:tc>
+      </w:tr>
+      <w:tr>
+        <w:tc>
+          <w:tcPr>
+            <w:tcW w:type="dxa" w:w="1457"/>
+          </w:tcPr>
+          <w:p>
+            <w:r>
+              <w:t>x4</w:t>
+            </w:r>
+          </w:p>
+        </w:tc>
+        <w:tc>
+          <w:tcPr>
+            <w:tcW w:type="dxa" w:w="1457"/>
+          </w:tcPr>
+          <w:p>
+            <w:r>
+              <w:t>(1,2)</w:t>
+            </w:r>
+          </w:p>
+        </w:tc>
+        <w:tc>
+          <w:tcPr>
+            <w:tcW w:type="dxa" w:w="1457"/>
+          </w:tcPr>
+          <w:p>
+            <w:r>
+              <w:t>-1</w:t>
+            </w:r>
+          </w:p>
+        </w:tc>
+        <w:tc>
+          <w:tcPr>
+            <w:tcW w:type="dxa" w:w="1457"/>
+          </w:tcPr>
+          <w:p>
+            <w:r>
+              <w:t>0.4*1+0.2*2=0.8</w:t>
+            </w:r>
+          </w:p>
+        </w:tc>
+        <w:tc>
+          <w:tcPr>
+            <w:tcW w:type="dxa" w:w="1457"/>
+          </w:tcPr>
+          <w:p>
+            <w:r>
+              <w:t>+1</w:t>
+            </w:r>
+          </w:p>
+        </w:tc>
+        <w:tc>
+          <w:tcPr>
+            <w:tcW w:type="dxa" w:w="1457"/>
+          </w:tcPr>
+          <w:p>
+            <w:r>
+              <w:t>YES (+=0.1*(-2)*(1,2))</w:t>
+            </w:r>
+          </w:p>
+        </w:tc>
+        <w:tc>
+          <w:tcPr>
+            <w:tcW w:type="dxa" w:w="1457"/>
+          </w:tcPr>
+          <w:p>
+            <w:r>
+              <w:t>(0.2, -0.2)</w:t>
+            </w:r>
+          </w:p>
+        </w:tc>
+      </w:tr>
+      <w:tr>
+        <w:tc>
+          <w:tcPr>
+            <w:tcW w:type="dxa" w:w="1457"/>
+          </w:tcPr>
+          <w:p>
+            <w:r>
+              <w:t>x5</w:t>
+            </w:r>
+          </w:p>
+        </w:tc>
+        <w:tc>
+          <w:tcPr>
+            <w:tcW w:type="dxa" w:w="1457"/>
+          </w:tcPr>
+          <w:p>
+            <w:r>
+              <w:t>(2,1)</w:t>
+            </w:r>
+          </w:p>
+        </w:tc>
+        <w:tc>
+          <w:tcPr>
+            <w:tcW w:type="dxa" w:w="1457"/>
+          </w:tcPr>
+          <w:p>
+            <w:r>
+              <w:t>-1</w:t>
+            </w:r>
+          </w:p>
+        </w:tc>
+        <w:tc>
+          <w:tcPr>
+            <w:tcW w:type="dxa" w:w="1457"/>
+          </w:tcPr>
+          <w:p>
+            <w:r>
+              <w:t>0.2*2+(-0.2)*1=0.2</w:t>
+            </w:r>
+          </w:p>
+        </w:tc>
+        <w:tc>
+          <w:tcPr>
+            <w:tcW w:type="dxa" w:w="1457"/>
+          </w:tcPr>
+          <w:p>
+            <w:r>
+              <w:t>+1</w:t>
+            </w:r>
+          </w:p>
+        </w:tc>
+        <w:tc>
+          <w:tcPr>
+            <w:tcW w:type="dxa" w:w="1457"/>
+          </w:tcPr>
+          <w:p>
+            <w:r>
+              <w:t>YES (+=0.1*(-2)*(2,1))</w:t>
+            </w:r>
+          </w:p>
+        </w:tc>
+        <w:tc>
+          <w:tcPr>
+            <w:tcW w:type="dxa" w:w="1457"/>
+          </w:tcPr>
+          <w:p>
+            <w:r>
+              <w:t>(-0.2, -0.4)</w:t>
+            </w:r>
+          </w:p>
+        </w:tc>
+      </w:tr>
+      <w:tr>
+        <w:tc>
+          <w:tcPr>
+            <w:tcW w:type="dxa" w:w="1457"/>
+          </w:tcPr>
+          <w:p>
+            <w:r>
+              <w:t>x6</w:t>
+            </w:r>
+          </w:p>
+        </w:tc>
+        <w:tc>
+          <w:tcPr>
+            <w:tcW w:type="dxa" w:w="1457"/>
+          </w:tcPr>
+          <w:p>
+            <w:r>
+              <w:t>(1,1)</w:t>
+            </w:r>
+          </w:p>
+        </w:tc>
+        <w:tc>
+          <w:tcPr>
+            <w:tcW w:type="dxa" w:w="1457"/>
+          </w:tcPr>
+          <w:p>
+            <w:r>
+              <w:t>-1</w:t>
+            </w:r>
+          </w:p>
+        </w:tc>
+        <w:tc>
+          <w:tcPr>
+            <w:tcW w:type="dxa" w:w="1457"/>
+          </w:tcPr>
+          <w:p>
+            <w:r>
+              <w:t>(-0.2)*1+(-0.4)*1=-0.6</w:t>
+            </w:r>
+          </w:p>
+        </w:tc>
+        <w:tc>
+          <w:tcPr>
+            <w:tcW w:type="dxa" w:w="1457"/>
+          </w:tcPr>
+          <w:p>
+            <w:r>
+              <w:t>-1</w:t>
+            </w:r>
+          </w:p>
+        </w:tc>
+        <w:tc>
+          <w:tcPr>
+            <w:tcW w:type="dxa" w:w="1457"/>
+          </w:tcPr>
+          <w:p>
+            <w:r>
+              <w:t>No</w:t>
+            </w:r>
+          </w:p>
+        </w:tc>
+        <w:tc>
+          <w:tcPr>
+            <w:tcW w:type="dxa" w:w="1457"/>
+          </w:tcPr>
+          <w:p>
+            <w:r>
+              <w:t>(-0.2, -0.4)</w:t>
+            </w:r>
+          </w:p>
+        </w:tc>
+      </w:tr>
+      <w:tr>
+        <w:tc>
+          <w:tcPr>
+            <w:tcW w:type="dxa" w:w="1457"/>
+          </w:tcPr>
+          <w:p>
+            <w:r>
+              <w:t>x7</w:t>
+            </w:r>
+          </w:p>
+        </w:tc>
+        <w:tc>
+          <w:tcPr>
+            <w:tcW w:type="dxa" w:w="1457"/>
+          </w:tcPr>
+          <w:p>
+            <w:r>
+              <w:t>(-1,-1)</w:t>
+            </w:r>
+          </w:p>
+        </w:tc>
+        <w:tc>
+          <w:tcPr>
+            <w:tcW w:type="dxa" w:w="1457"/>
+          </w:tcPr>
+          <w:p>
+            <w:r>
+              <w:t>+1</w:t>
+            </w:r>
+          </w:p>
+        </w:tc>
+        <w:tc>
+          <w:tcPr>
+            <w:tcW w:type="dxa" w:w="1457"/>
+          </w:tcPr>
+          <w:p>
+            <w:r>
+              <w:t>(-0.2)*(-1)+(-0.4)*(-1)=0.6</w:t>
+            </w:r>
+          </w:p>
+        </w:tc>
+        <w:tc>
+          <w:tcPr>
+            <w:tcW w:type="dxa" w:w="1457"/>
+          </w:tcPr>
+          <w:p>
+            <w:r>
+              <w:t>+1</w:t>
+            </w:r>
+          </w:p>
+        </w:tc>
+        <w:tc>
+          <w:tcPr>
+            <w:tcW w:type="dxa" w:w="1457"/>
+          </w:tcPr>
+          <w:p>
+            <w:r>
+              <w:t>No</w:t>
+            </w:r>
+          </w:p>
+        </w:tc>
+        <w:tc>
+          <w:tcPr>
+            <w:tcW w:type="dxa" w:w="1457"/>
+          </w:tcPr>
+          <w:p>
+            <w:r>
+              <w:t>(-0.2, -0.4)</w:t>
+            </w:r>
+          </w:p>
+        </w:tc>
+      </w:tr>
+      <w:tr>
+        <w:tc>
+          <w:tcPr>
+            <w:tcW w:type="dxa" w:w="1457"/>
+          </w:tcPr>
+          <w:p>
+            <w:r>
+              <w:t>x8</w:t>
+            </w:r>
+          </w:p>
+        </w:tc>
+        <w:tc>
+          <w:tcPr>
+            <w:tcW w:type="dxa" w:w="1457"/>
+          </w:tcPr>
+          <w:p>
+            <w:r>
+              <w:t>(-2,-2)</w:t>
+            </w:r>
+          </w:p>
+        </w:tc>
+        <w:tc>
+          <w:tcPr>
+            <w:tcW w:type="dxa" w:w="1457"/>
+          </w:tcPr>
+          <w:p>
+            <w:r>
+              <w:t>+1</w:t>
+            </w:r>
+          </w:p>
+        </w:tc>
+        <w:tc>
+          <w:tcPr>
+            <w:tcW w:type="dxa" w:w="1457"/>
+          </w:tcPr>
+          <w:p>
+            <w:r>
+              <w:t>(-0.2)*(-2)+(-0.4)*(-2)=1.2</w:t>
+            </w:r>
+          </w:p>
+        </w:tc>
+        <w:tc>
+          <w:tcPr>
+            <w:tcW w:type="dxa" w:w="1457"/>
+          </w:tcPr>
+          <w:p>
+            <w:r>
+              <w:t>+1</w:t>
+            </w:r>
+          </w:p>
+        </w:tc>
+        <w:tc>
+          <w:tcPr>
+            <w:tcW w:type="dxa" w:w="1457"/>
+          </w:tcPr>
+          <w:p>
+            <w:r>
+              <w:t>No</w:t>
+            </w:r>
+          </w:p>
+        </w:tc>
+        <w:tc>
+          <w:tcPr>
+            <w:tcW w:type="dxa" w:w="1457"/>
+          </w:tcPr>
+          <w:p>
+            <w:r>
+              <w:t>(-0.2, -0.4)</w:t>
+            </w:r>
+          </w:p>
+        </w:tc>
+      </w:tr>
+    </w:tbl>
+    <w:p>
+      <w:r>
+        <w:rPr>
+          <w:b w:val="0"/>
+        </w:rPr>
+        <w:t>Final w = (-0.2, -0.4). 4 updates (x2, x3, x4, x5).</w:t>
+      </w:r>
+    </w:p>
+    <w:p>
+      <w:pPr>
+        <w:pStyle w:val="Heading2"/>
+      </w:pPr>
+      <w:r>
+        <w:rPr>
+          <w:b/>
+        </w:rPr>
+        <w:t>Aug 2022 Q4.2: Convolution with All-Ones 3x3 Kernel</w:t>
+      </w:r>
+    </w:p>
+    <w:p>
+      <w:r>
+        <w:rPr>
+          <w:b w:val="0"/>
+        </w:rPr>
+        <w:t>Image: [[100,120,110,110],[110,150,140,120],[120,140,150,110],[110,140,140,120]]</w:t>
+      </w:r>
+    </w:p>
+    <w:p>
+      <w:r>
+        <w:rPr>
+          <w:b w:val="0"/>
+        </w:rPr>
+        <w:t>Kernel: all 1s (3x3). All-ones means output = SUM of the 3x3 region.</w:t>
+      </w:r>
+    </w:p>
+    <w:tbl>
+      <w:tblPr>
+        <w:tblStyle w:val="TableGrid"/>
+        <w:tblW w:type="auto" w:w="0"/>
+        <w:tblLook w:firstColumn="1" w:firstRow="1" w:lastColumn="0" w:lastRow="0" w:noHBand="0" w:noVBand="1" w:val="04A0"/>
+      </w:tblPr>
+      <w:tblGrid>
+        <w:gridCol w:w="2550"/>
+        <w:gridCol w:w="2550"/>
+        <w:gridCol w:w="2550"/>
+        <w:gridCol w:w="2550"/>
+      </w:tblGrid>
+      <w:tr>
+        <w:tc>
+          <w:tcPr>
+            <w:tcW w:type="dxa" w:w="2550"/>
+          </w:tcPr>
+          <w:p>
+            <w:r>
+              <w:rPr>
+                <w:b/>
+              </w:rPr>
+              <w:t>Output cell</w:t>
+            </w:r>
+          </w:p>
+        </w:tc>
+        <w:tc>
+          <w:tcPr>
+            <w:tcW w:type="dxa" w:w="2550"/>
+          </w:tcPr>
+          <w:p>
+            <w:r>
+              <w:rPr>
+                <w:b/>
+              </w:rPr>
+              <w:t>Region</w:t>
+            </w:r>
+          </w:p>
+        </w:tc>
+        <w:tc>
+          <w:tcPr>
+            <w:tcW w:type="dxa" w:w="2550"/>
+          </w:tcPr>
+          <w:p>
+            <w:r>
+              <w:rPr>
+                <w:b/>
+              </w:rPr>
+              <w:t>Sum</w:t>
+            </w:r>
+          </w:p>
+        </w:tc>
+        <w:tc>
+          <w:tcPr>
+            <w:tcW w:type="dxa" w:w="2550"/>
+          </w:tcPr>
+          <w:p>
+            <w:r>
+              <w:rPr>
+                <w:b/>
+              </w:rPr>
+              <w:t>Result</w:t>
+            </w:r>
+          </w:p>
+        </w:tc>
+      </w:tr>
+      <w:tr>
+        <w:tc>
+          <w:tcPr>
+            <w:tcW w:type="dxa" w:w="2550"/>
+          </w:tcPr>
+          <w:p>
+            <w:r>
+              <w:t>Top-left</w:t>
+            </w:r>
+          </w:p>
+        </w:tc>
+        <w:tc>
+          <w:tcPr>
+            <w:tcW w:type="dxa" w:w="2550"/>
+          </w:tcPr>
+          <w:p>
+            <w:r>
+              <w:t>rows 0-2, cols 0-2</w:t>
+            </w:r>
+          </w:p>
+        </w:tc>
+        <w:tc>
+          <w:tcPr>
+            <w:tcW w:type="dxa" w:w="2550"/>
+          </w:tcPr>
+          <w:p>
+            <w:r>
+              <w:t>100+120+110+110+150+140+120+140+150</w:t>
+            </w:r>
+          </w:p>
+        </w:tc>
+        <w:tc>
+          <w:tcPr>
+            <w:tcW w:type="dxa" w:w="2550"/>
+          </w:tcPr>
+          <w:p>
+            <w:r>
+              <w:t>1140</w:t>
+            </w:r>
+          </w:p>
+        </w:tc>
+      </w:tr>
+      <w:tr>
+        <w:tc>
+          <w:tcPr>
+            <w:tcW w:type="dxa" w:w="2550"/>
+          </w:tcPr>
+          <w:p>
+            <w:r>
+              <w:t>Top-right</w:t>
+            </w:r>
+          </w:p>
+        </w:tc>
+        <w:tc>
+          <w:tcPr>
+            <w:tcW w:type="dxa" w:w="2550"/>
+          </w:tcPr>
+          <w:p>
+            <w:r>
+              <w:t>rows 0-2, cols 1-3</w:t>
+            </w:r>
+          </w:p>
+        </w:tc>
+        <w:tc>
+          <w:tcPr>
+            <w:tcW w:type="dxa" w:w="2550"/>
+          </w:tcPr>
+          <w:p>
+            <w:r>
+              <w:t>120+110+110+150+140+120+140+150+110</w:t>
+            </w:r>
+          </w:p>
+        </w:tc>
+        <w:tc>
+          <w:tcPr>
+            <w:tcW w:type="dxa" w:w="2550"/>
+          </w:tcPr>
+          <w:p>
+            <w:r>
+              <w:t>1150</w:t>
+            </w:r>
+          </w:p>
+        </w:tc>
+      </w:tr>
+      <w:tr>
+        <w:tc>
+          <w:tcPr>
+            <w:tcW w:type="dxa" w:w="2550"/>
+          </w:tcPr>
+          <w:p>
+            <w:r>
+              <w:t>Bottom-left</w:t>
+            </w:r>
+          </w:p>
+        </w:tc>
+        <w:tc>
+          <w:tcPr>
+            <w:tcW w:type="dxa" w:w="2550"/>
+          </w:tcPr>
+          <w:p>
+            <w:r>
+              <w:t>rows 1-3, cols 0-2</w:t>
+            </w:r>
+          </w:p>
+        </w:tc>
+        <w:tc>
+          <w:tcPr>
+            <w:tcW w:type="dxa" w:w="2550"/>
+          </w:tcPr>
+          <w:p>
+            <w:r>
+              <w:t>110+150+140+120+140+150+110+140+140</w:t>
+            </w:r>
+          </w:p>
+        </w:tc>
+        <w:tc>
+          <w:tcPr>
+            <w:tcW w:type="dxa" w:w="2550"/>
+          </w:tcPr>
+          <w:p>
+            <w:r>
+              <w:t>1200</w:t>
+            </w:r>
+          </w:p>
+        </w:tc>
+      </w:tr>
+      <w:tr>
+        <w:tc>
+          <w:tcPr>
+            <w:tcW w:type="dxa" w:w="2550"/>
+          </w:tcPr>
+          <w:p>
+            <w:r>
+              <w:t>Bottom-right</w:t>
+            </w:r>
+          </w:p>
+        </w:tc>
+        <w:tc>
+          <w:tcPr>
+            <w:tcW w:type="dxa" w:w="2550"/>
+          </w:tcPr>
+          <w:p>
+            <w:r>
+              <w:t>rows 1-3, cols 1-3</w:t>
+            </w:r>
+          </w:p>
+        </w:tc>
+        <w:tc>
+          <w:tcPr>
+            <w:tcW w:type="dxa" w:w="2550"/>
+          </w:tcPr>
+          <w:p>
+            <w:r>
+              <w:t>150+140+120+140+150+110+140+140+120</w:t>
+            </w:r>
+          </w:p>
+        </w:tc>
+        <w:tc>
+          <w:tcPr>
+            <w:tcW w:type="dxa" w:w="2550"/>
+          </w:tcPr>
+          <w:p>
+            <w:r>
+              <w:t>1210</w:t>
+            </w:r>
+          </w:p>
+        </w:tc>
+      </w:tr>
+    </w:tbl>
+    <w:p>
+      <w:r>
+        <w:rPr>
+          <w:b w:val="0"/>
+        </w:rPr>
+        <w:t>Output: [[1140, 1150], [1200, 1210]]</w:t>
+      </w:r>
+    </w:p>
     <w:sectPr>
       <w:pgSz w:w="12240" w:h="15840"/>
       <w:pgMar w:top="850" w:right="1020" w:bottom="850" w:left="1020" w:header="720" w:footer="720" w:gutter="0"/>

</xml_diff>

<commit_message>
Fix 7 critical errors found in Round 2 audit
- May 2025 Q16 BFS: correct path A->C->E (E added by C, not D)
- May 2025 Q16 A*: correct path A->B->D->E cost=11 (was wrong A->C->D->E cost=12; B must expand before D)
- Dec 2023 Q3 A*: complete full expansion C->D->G cost=24 (was truncated after step 2)
- Dec 2024 Q5 Bayesian: add numerical answers P(C)=0.5588, P(W|C)=0.8182
- Dec 2023 Q5 Bayesian: add numerical answers P(C|E=True)=0.688, P(C|E=False)=0.338
- Dec 2024 Q4 Timisoara A*: add full 11-step expansion table, solution cost=536
- Dec 2023 Q6 Decision Tree: add full IG table (F4=0.2247 root) and tree structure

Co-Authored-By: Claude Sonnet 4.6 <noreply@anthropic.com>
</commit_message>
<xml_diff>
--- a/COMP4431_Calculation_Steps.docx
+++ b/COMP4431_Calculation_Steps.docx
@@ -7962,6 +7962,2612 @@
           <w:b w:val="0"/>
         </w:rPr>
         <w:t>Output: [[1140, 1150], [1200, 1210]]</w:t>
+      </w:r>
+    </w:p>
+    <w:p>
+      <w:pPr>
+        <w:pStyle w:val="Heading2"/>
+      </w:pPr>
+      <w:r>
+        <w:rPr>
+          <w:b/>
+        </w:rPr>
+        <w:t>CORRECTION: May 2025 Q16 BFS -- Correct Path</w:t>
+      </w:r>
+    </w:p>
+    <w:p>
+      <w:r>
+        <w:rPr>
+          <w:b w:val="0"/>
+          <w:i w:val="0"/>
+        </w:rPr>
+        <w:t>Graph: A-2-C, A-4-B, C-10-E, C-8-D, B-5-D, D-2-E. Start=A, Goal=E. Alphabetical expansion order.</w:t>
+      </w:r>
+    </w:p>
+    <w:tbl>
+      <w:tblPr>
+        <w:tblStyle w:val="TableGrid"/>
+        <w:tblW w:type="auto" w:w="0"/>
+        <w:tblLook w:firstColumn="1" w:firstRow="1" w:lastColumn="0" w:lastRow="0" w:noHBand="0" w:noVBand="1" w:val="04A0"/>
+      </w:tblPr>
+      <w:tblGrid>
+        <w:gridCol w:w="3400"/>
+        <w:gridCol w:w="3400"/>
+        <w:gridCol w:w="3400"/>
+      </w:tblGrid>
+      <w:tr>
+        <w:tc>
+          <w:tcPr>
+            <w:tcW w:type="dxa" w:w="3400"/>
+          </w:tcPr>
+          <w:p>
+            <w:r>
+              <w:rPr>
+                <w:b/>
+              </w:rPr>
+              <w:t>Action</w:t>
+            </w:r>
+          </w:p>
+        </w:tc>
+        <w:tc>
+          <w:tcPr>
+            <w:tcW w:type="dxa" w:w="3400"/>
+          </w:tcPr>
+          <w:p>
+            <w:r>
+              <w:rPr>
+                <w:b/>
+              </w:rPr>
+              <w:t>Queue / Visited</w:t>
+            </w:r>
+          </w:p>
+        </w:tc>
+        <w:tc>
+          <w:tcPr>
+            <w:tcW w:type="dxa" w:w="3400"/>
+          </w:tcPr>
+          <w:p>
+            <w:r>
+              <w:rPr>
+                <w:b/>
+              </w:rPr>
+              <w:t>Note</w:t>
+            </w:r>
+          </w:p>
+        </w:tc>
+      </w:tr>
+      <w:tr>
+        <w:tc>
+          <w:tcPr>
+            <w:tcW w:type="dxa" w:w="3400"/>
+          </w:tcPr>
+          <w:p>
+            <w:r>
+              <w:t>Init: add A</w:t>
+            </w:r>
+          </w:p>
+        </w:tc>
+        <w:tc>
+          <w:tcPr>
+            <w:tcW w:type="dxa" w:w="3400"/>
+          </w:tcPr>
+          <w:p>
+            <w:r>
+              <w:t>[A] | visited={A}</w:t>
+            </w:r>
+          </w:p>
+        </w:tc>
+        <w:tc>
+          <w:tcPr>
+            <w:tcW w:type="dxa" w:w="3400"/>
+          </w:tcPr>
+          <w:p>
+            <w:r/>
+          </w:p>
+        </w:tc>
+      </w:tr>
+      <w:tr>
+        <w:tc>
+          <w:tcPr>
+            <w:tcW w:type="dxa" w:w="3400"/>
+          </w:tcPr>
+          <w:p>
+            <w:r>
+              <w:t>Expand A: add B,C (alpha)</w:t>
+            </w:r>
+          </w:p>
+        </w:tc>
+        <w:tc>
+          <w:tcPr>
+            <w:tcW w:type="dxa" w:w="3400"/>
+          </w:tcPr>
+          <w:p>
+            <w:r>
+              <w:t>[B,C] | {A,B,C}</w:t>
+            </w:r>
+          </w:p>
+        </w:tc>
+        <w:tc>
+          <w:tcPr>
+            <w:tcW w:type="dxa" w:w="3400"/>
+          </w:tcPr>
+          <w:p>
+            <w:r>
+              <w:t>B before C (alphabetical)</w:t>
+            </w:r>
+          </w:p>
+        </w:tc>
+      </w:tr>
+      <w:tr>
+        <w:tc>
+          <w:tcPr>
+            <w:tcW w:type="dxa" w:w="3400"/>
+          </w:tcPr>
+          <w:p>
+            <w:r>
+              <w:t>Expand B: add D</w:t>
+            </w:r>
+          </w:p>
+        </w:tc>
+        <w:tc>
+          <w:tcPr>
+            <w:tcW w:type="dxa" w:w="3400"/>
+          </w:tcPr>
+          <w:p>
+            <w:r>
+              <w:t>[C,D] | {A,B,C,D}</w:t>
+            </w:r>
+          </w:p>
+        </w:tc>
+        <w:tc>
+          <w:tcPr>
+            <w:tcW w:type="dxa" w:w="3400"/>
+          </w:tcPr>
+          <w:p>
+            <w:r>
+              <w:t>A visited; D added from B (parent=B)</w:t>
+            </w:r>
+          </w:p>
+        </w:tc>
+      </w:tr>
+      <w:tr>
+        <w:tc>
+          <w:tcPr>
+            <w:tcW w:type="dxa" w:w="3400"/>
+          </w:tcPr>
+          <w:p>
+            <w:r>
+              <w:t>Expand C: D visited, add E</w:t>
+            </w:r>
+          </w:p>
+        </w:tc>
+        <w:tc>
+          <w:tcPr>
+            <w:tcW w:type="dxa" w:w="3400"/>
+          </w:tcPr>
+          <w:p>
+            <w:r>
+              <w:t>[D,E] | {A,B,C,D,E}</w:t>
+            </w:r>
+          </w:p>
+        </w:tc>
+        <w:tc>
+          <w:tcPr>
+            <w:tcW w:type="dxa" w:w="3400"/>
+          </w:tcPr>
+          <w:p>
+            <w:r>
+              <w:t>E added from C (parent=C)</w:t>
+            </w:r>
+          </w:p>
+        </w:tc>
+      </w:tr>
+      <w:tr>
+        <w:tc>
+          <w:tcPr>
+            <w:tcW w:type="dxa" w:w="3400"/>
+          </w:tcPr>
+          <w:p>
+            <w:r>
+              <w:t>Expand D: all neighbors visited</w:t>
+            </w:r>
+          </w:p>
+        </w:tc>
+        <w:tc>
+          <w:tcPr>
+            <w:tcW w:type="dxa" w:w="3400"/>
+          </w:tcPr>
+          <w:p>
+            <w:r>
+              <w:t>[E] | {A,B,C,D,E}</w:t>
+            </w:r>
+          </w:p>
+        </w:tc>
+        <w:tc>
+          <w:tcPr>
+            <w:tcW w:type="dxa" w:w="3400"/>
+          </w:tcPr>
+          <w:p>
+            <w:r>
+              <w:t>Nothing new</w:t>
+            </w:r>
+          </w:p>
+        </w:tc>
+      </w:tr>
+      <w:tr>
+        <w:tc>
+          <w:tcPr>
+            <w:tcW w:type="dxa" w:w="3400"/>
+          </w:tcPr>
+          <w:p>
+            <w:r>
+              <w:t>Expand E: GOAL!</w:t>
+            </w:r>
+          </w:p>
+        </w:tc>
+        <w:tc>
+          <w:tcPr>
+            <w:tcW w:type="dxa" w:w="3400"/>
+          </w:tcPr>
+          <w:p>
+            <w:r>
+              <w:t>[]</w:t>
+            </w:r>
+          </w:p>
+        </w:tc>
+        <w:tc>
+          <w:tcPr>
+            <w:tcW w:type="dxa" w:w="3400"/>
+          </w:tcPr>
+          <w:p>
+            <w:r>
+              <w:t>Trace back: E&lt;-C&lt;-A</w:t>
+            </w:r>
+          </w:p>
+        </w:tc>
+      </w:tr>
+    </w:tbl>
+    <w:p>
+      <w:r>
+        <w:rPr>
+          <w:b/>
+          <w:i w:val="0"/>
+        </w:rPr>
+        <w:t>BFS PATH: A -&gt; C -&gt; E (2 hops). E was added by expanding C, not D.</w:t>
+      </w:r>
+    </w:p>
+    <w:p>
+      <w:r>
+        <w:rPr>
+          <w:b w:val="0"/>
+          <w:i w:val="0"/>
+        </w:rPr>
+        <w:t>Earlier notes said "Then D-&gt;E" -- misleading. E is in queue from C before D is expanded.</w:t>
+      </w:r>
+    </w:p>
+    <w:p>
+      <w:r>
+        <w:rPr>
+          <w:b w:val="0"/>
+          <w:i w:val="0"/>
+        </w:rPr>
+        <w:t>BFS ignores costs; finds shortest path by number of edges.</w:t>
+      </w:r>
+    </w:p>
+    <w:p>
+      <w:pPr>
+        <w:pStyle w:val="Heading2"/>
+      </w:pPr>
+      <w:r>
+        <w:rPr>
+          <w:b/>
+        </w:rPr>
+        <w:t>CORRECTION: May 2025 Q16 A* -- FULL CORRECTED SOLUTION</w:t>
+      </w:r>
+    </w:p>
+    <w:p>
+      <w:r>
+        <w:rPr>
+          <w:b/>
+          <w:i w:val="0"/>
+        </w:rPr>
+        <w:t>IMPORTANT: The earlier summary of May 2025 Q16 A* was incomplete. Correct answer below.</w:t>
+      </w:r>
+    </w:p>
+    <w:p>
+      <w:r>
+        <w:rPr>
+          <w:b w:val="0"/>
+          <w:i w:val="0"/>
+        </w:rPr>
+        <w:t>Graph: A-2-C, A-4-B, C-10-E, C-8-D, B-5-D, D-2-E. Start=A, Goal=E.</w:t>
+      </w:r>
+    </w:p>
+    <w:p>
+      <w:r>
+        <w:rPr>
+          <w:b w:val="0"/>
+          <w:i w:val="0"/>
+        </w:rPr>
+        <w:t>Heuristics: H(A)=7, H(B)=6, H(C)=4, H(D)=2, H(E)=0</w:t>
+      </w:r>
+    </w:p>
+    <w:tbl>
+      <w:tblPr>
+        <w:tblStyle w:val="TableGrid"/>
+        <w:tblW w:type="auto" w:w="0"/>
+        <w:tblLook w:firstColumn="1" w:firstRow="1" w:lastColumn="0" w:lastRow="0" w:noHBand="0" w:noVBand="1" w:val="04A0"/>
+      </w:tblPr>
+      <w:tblGrid>
+        <w:gridCol w:w="1700"/>
+        <w:gridCol w:w="1700"/>
+        <w:gridCol w:w="1700"/>
+        <w:gridCol w:w="1700"/>
+        <w:gridCol w:w="1700"/>
+        <w:gridCol w:w="1700"/>
+      </w:tblGrid>
+      <w:tr>
+        <w:tc>
+          <w:tcPr>
+            <w:tcW w:type="dxa" w:w="1700"/>
+          </w:tcPr>
+          <w:p>
+            <w:r>
+              <w:rPr>
+                <w:b/>
+              </w:rPr>
+              <w:t>Step</w:t>
+            </w:r>
+          </w:p>
+        </w:tc>
+        <w:tc>
+          <w:tcPr>
+            <w:tcW w:type="dxa" w:w="1700"/>
+          </w:tcPr>
+          <w:p>
+            <w:r>
+              <w:rPr>
+                <w:b/>
+              </w:rPr>
+              <w:t>Expand node</w:t>
+            </w:r>
+          </w:p>
+        </w:tc>
+        <w:tc>
+          <w:tcPr>
+            <w:tcW w:type="dxa" w:w="1700"/>
+          </w:tcPr>
+          <w:p>
+            <w:r>
+              <w:rPr>
+                <w:b/>
+              </w:rPr>
+              <w:t>g</w:t>
+            </w:r>
+          </w:p>
+        </w:tc>
+        <w:tc>
+          <w:tcPr>
+            <w:tcW w:type="dxa" w:w="1700"/>
+          </w:tcPr>
+          <w:p>
+            <w:r>
+              <w:rPr>
+                <w:b/>
+              </w:rPr>
+              <w:t>h</w:t>
+            </w:r>
+          </w:p>
+        </w:tc>
+        <w:tc>
+          <w:tcPr>
+            <w:tcW w:type="dxa" w:w="1700"/>
+          </w:tcPr>
+          <w:p>
+            <w:r>
+              <w:rPr>
+                <w:b/>
+              </w:rPr>
+              <w:t>f</w:t>
+            </w:r>
+          </w:p>
+        </w:tc>
+        <w:tc>
+          <w:tcPr>
+            <w:tcW w:type="dxa" w:w="1700"/>
+          </w:tcPr>
+          <w:p>
+            <w:r>
+              <w:rPr>
+                <w:b/>
+              </w:rPr>
+              <w:t>Frontier after expansion</w:t>
+            </w:r>
+          </w:p>
+        </w:tc>
+      </w:tr>
+      <w:tr>
+        <w:tc>
+          <w:tcPr>
+            <w:tcW w:type="dxa" w:w="1700"/>
+          </w:tcPr>
+          <w:p>
+            <w:r>
+              <w:t>1</w:t>
+            </w:r>
+          </w:p>
+        </w:tc>
+        <w:tc>
+          <w:tcPr>
+            <w:tcW w:type="dxa" w:w="1700"/>
+          </w:tcPr>
+          <w:p>
+            <w:r>
+              <w:t>A</w:t>
+            </w:r>
+          </w:p>
+        </w:tc>
+        <w:tc>
+          <w:tcPr>
+            <w:tcW w:type="dxa" w:w="1700"/>
+          </w:tcPr>
+          <w:p>
+            <w:r>
+              <w:t>0</w:t>
+            </w:r>
+          </w:p>
+        </w:tc>
+        <w:tc>
+          <w:tcPr>
+            <w:tcW w:type="dxa" w:w="1700"/>
+          </w:tcPr>
+          <w:p>
+            <w:r>
+              <w:t>7</w:t>
+            </w:r>
+          </w:p>
+        </w:tc>
+        <w:tc>
+          <w:tcPr>
+            <w:tcW w:type="dxa" w:w="1700"/>
+          </w:tcPr>
+          <w:p>
+            <w:r>
+              <w:t>7</w:t>
+            </w:r>
+          </w:p>
+        </w:tc>
+        <w:tc>
+          <w:tcPr>
+            <w:tcW w:type="dxa" w:w="1700"/>
+          </w:tcPr>
+          <w:p>
+            <w:r>
+              <w:t>C(f=6), B(f=10)</w:t>
+            </w:r>
+          </w:p>
+        </w:tc>
+      </w:tr>
+      <w:tr>
+        <w:tc>
+          <w:tcPr>
+            <w:tcW w:type="dxa" w:w="1700"/>
+          </w:tcPr>
+          <w:p>
+            <w:r>
+              <w:t>2</w:t>
+            </w:r>
+          </w:p>
+        </w:tc>
+        <w:tc>
+          <w:tcPr>
+            <w:tcW w:type="dxa" w:w="1700"/>
+          </w:tcPr>
+          <w:p>
+            <w:r>
+              <w:t>C (f=6)</w:t>
+            </w:r>
+          </w:p>
+        </w:tc>
+        <w:tc>
+          <w:tcPr>
+            <w:tcW w:type="dxa" w:w="1700"/>
+          </w:tcPr>
+          <w:p>
+            <w:r>
+              <w:t>2</w:t>
+            </w:r>
+          </w:p>
+        </w:tc>
+        <w:tc>
+          <w:tcPr>
+            <w:tcW w:type="dxa" w:w="1700"/>
+          </w:tcPr>
+          <w:p>
+            <w:r>
+              <w:t>4</w:t>
+            </w:r>
+          </w:p>
+        </w:tc>
+        <w:tc>
+          <w:tcPr>
+            <w:tcW w:type="dxa" w:w="1700"/>
+          </w:tcPr>
+          <w:p>
+            <w:r>
+              <w:t>6</w:t>
+            </w:r>
+          </w:p>
+        </w:tc>
+        <w:tc>
+          <w:tcPr>
+            <w:tcW w:type="dxa" w:w="1700"/>
+          </w:tcPr>
+          <w:p>
+            <w:r>
+              <w:t>B(f=10), D_via_C(f=12), E_via_C(f=12)</w:t>
+            </w:r>
+          </w:p>
+        </w:tc>
+      </w:tr>
+      <w:tr>
+        <w:tc>
+          <w:tcPr>
+            <w:tcW w:type="dxa" w:w="1700"/>
+          </w:tcPr>
+          <w:p>
+            <w:r>
+              <w:t>3</w:t>
+            </w:r>
+          </w:p>
+        </w:tc>
+        <w:tc>
+          <w:tcPr>
+            <w:tcW w:type="dxa" w:w="1700"/>
+          </w:tcPr>
+          <w:p>
+            <w:r>
+              <w:t>B (f=10)</w:t>
+            </w:r>
+          </w:p>
+        </w:tc>
+        <w:tc>
+          <w:tcPr>
+            <w:tcW w:type="dxa" w:w="1700"/>
+          </w:tcPr>
+          <w:p>
+            <w:r>
+              <w:t>4</w:t>
+            </w:r>
+          </w:p>
+        </w:tc>
+        <w:tc>
+          <w:tcPr>
+            <w:tcW w:type="dxa" w:w="1700"/>
+          </w:tcPr>
+          <w:p>
+            <w:r>
+              <w:t>6</w:t>
+            </w:r>
+          </w:p>
+        </w:tc>
+        <w:tc>
+          <w:tcPr>
+            <w:tcW w:type="dxa" w:w="1700"/>
+          </w:tcPr>
+          <w:p>
+            <w:r>
+              <w:t>10</w:t>
+            </w:r>
+          </w:p>
+        </w:tc>
+        <w:tc>
+          <w:tcPr>
+            <w:tcW w:type="dxa" w:w="1700"/>
+          </w:tcPr>
+          <w:p>
+            <w:r>
+              <w:t>D_via_B(f=11) updates D to f=11, E_via_C(f=12)</w:t>
+            </w:r>
+          </w:p>
+        </w:tc>
+      </w:tr>
+      <w:tr>
+        <w:tc>
+          <w:tcPr>
+            <w:tcW w:type="dxa" w:w="1700"/>
+          </w:tcPr>
+          <w:p>
+            <w:r>
+              <w:t>4</w:t>
+            </w:r>
+          </w:p>
+        </w:tc>
+        <w:tc>
+          <w:tcPr>
+            <w:tcW w:type="dxa" w:w="1700"/>
+          </w:tcPr>
+          <w:p>
+            <w:r>
+              <w:t>D (f=11, via B)</w:t>
+            </w:r>
+          </w:p>
+        </w:tc>
+        <w:tc>
+          <w:tcPr>
+            <w:tcW w:type="dxa" w:w="1700"/>
+          </w:tcPr>
+          <w:p>
+            <w:r>
+              <w:t>9</w:t>
+            </w:r>
+          </w:p>
+        </w:tc>
+        <w:tc>
+          <w:tcPr>
+            <w:tcW w:type="dxa" w:w="1700"/>
+          </w:tcPr>
+          <w:p>
+            <w:r>
+              <w:t>2</w:t>
+            </w:r>
+          </w:p>
+        </w:tc>
+        <w:tc>
+          <w:tcPr>
+            <w:tcW w:type="dxa" w:w="1700"/>
+          </w:tcPr>
+          <w:p>
+            <w:r>
+              <w:t>11</w:t>
+            </w:r>
+          </w:p>
+        </w:tc>
+        <w:tc>
+          <w:tcPr>
+            <w:tcW w:type="dxa" w:w="1700"/>
+          </w:tcPr>
+          <w:p>
+            <w:r>
+              <w:t>E_via_D(f=11) updates E to f=11</w:t>
+            </w:r>
+          </w:p>
+        </w:tc>
+      </w:tr>
+      <w:tr>
+        <w:tc>
+          <w:tcPr>
+            <w:tcW w:type="dxa" w:w="1700"/>
+          </w:tcPr>
+          <w:p>
+            <w:r>
+              <w:t>5</w:t>
+            </w:r>
+          </w:p>
+        </w:tc>
+        <w:tc>
+          <w:tcPr>
+            <w:tcW w:type="dxa" w:w="1700"/>
+          </w:tcPr>
+          <w:p>
+            <w:r>
+              <w:t>E (f=11, via D)</w:t>
+            </w:r>
+          </w:p>
+        </w:tc>
+        <w:tc>
+          <w:tcPr>
+            <w:tcW w:type="dxa" w:w="1700"/>
+          </w:tcPr>
+          <w:p>
+            <w:r>
+              <w:t>11</w:t>
+            </w:r>
+          </w:p>
+        </w:tc>
+        <w:tc>
+          <w:tcPr>
+            <w:tcW w:type="dxa" w:w="1700"/>
+          </w:tcPr>
+          <w:p>
+            <w:r>
+              <w:t>0</w:t>
+            </w:r>
+          </w:p>
+        </w:tc>
+        <w:tc>
+          <w:tcPr>
+            <w:tcW w:type="dxa" w:w="1700"/>
+          </w:tcPr>
+          <w:p>
+            <w:r>
+              <w:t>11</w:t>
+            </w:r>
+          </w:p>
+        </w:tc>
+        <w:tc>
+          <w:tcPr>
+            <w:tcW w:type="dxa" w:w="1700"/>
+          </w:tcPr>
+          <w:p>
+            <w:r>
+              <w:t>GOAL!</w:t>
+            </w:r>
+          </w:p>
+        </w:tc>
+      </w:tr>
+    </w:tbl>
+    <w:p>
+      <w:r>
+        <w:rPr>
+          <w:b w:val="0"/>
+          <w:i w:val="0"/>
+        </w:rPr>
+        <w:t>CORRECT SOLUTION: A -&gt; B -&gt; D -&gt; E, cost = 4+5+2 = 11</w:t>
+      </w:r>
+    </w:p>
+    <w:p>
+      <w:r>
+        <w:rPr>
+          <w:b w:val="0"/>
+          <w:i w:val="0"/>
+        </w:rPr>
+        <w:t>KEY INSIGHT: Path through B is cheaper than through C (cost 11 vs 12).</w:t>
+      </w:r>
+    </w:p>
+    <w:p>
+      <w:r>
+        <w:rPr>
+          <w:b w:val="0"/>
+          <w:i w:val="0"/>
+        </w:rPr>
+        <w:t>Step 3 is critical: when expanding B, D gets updated from f=12 to f=11. Without this update, the wrong answer (cost 12) is produced.</w:t>
+      </w:r>
+    </w:p>
+    <w:p>
+      <w:pPr>
+        <w:pStyle w:val="Heading2"/>
+      </w:pPr>
+      <w:r>
+        <w:rPr>
+          <w:b/>
+        </w:rPr>
+        <w:t>CORRECTION: Dec 2023 Q3 A* -- FULL EXPANSION (C to G)</w:t>
+      </w:r>
+    </w:p>
+    <w:p>
+      <w:r>
+        <w:rPr>
+          <w:b w:val="0"/>
+          <w:i w:val="0"/>
+        </w:rPr>
+        <w:t>Graph: A-6-B-3-C-4-E, A-20-F, B-18-D, C-8-D, E-6-D, F-5-D, D-16-G</w:t>
+      </w:r>
+    </w:p>
+    <w:p>
+      <w:r>
+        <w:rPr>
+          <w:b w:val="0"/>
+          <w:i w:val="0"/>
+        </w:rPr>
+        <w:t>Heuristics: A=30,B=25,C=20,D=15,E=10,F=5,G=0. Start=C, Goal=G.</w:t>
+      </w:r>
+    </w:p>
+    <w:tbl>
+      <w:tblPr>
+        <w:tblStyle w:val="TableGrid"/>
+        <w:tblW w:type="auto" w:w="0"/>
+        <w:tblLook w:firstColumn="1" w:firstRow="1" w:lastColumn="0" w:lastRow="0" w:noHBand="0" w:noVBand="1" w:val="04A0"/>
+      </w:tblPr>
+      <w:tblGrid>
+        <w:gridCol w:w="1700"/>
+        <w:gridCol w:w="1700"/>
+        <w:gridCol w:w="1700"/>
+        <w:gridCol w:w="1700"/>
+        <w:gridCol w:w="1700"/>
+        <w:gridCol w:w="1700"/>
+      </w:tblGrid>
+      <w:tr>
+        <w:tc>
+          <w:tcPr>
+            <w:tcW w:type="dxa" w:w="1700"/>
+          </w:tcPr>
+          <w:p>
+            <w:r>
+              <w:rPr>
+                <w:b/>
+              </w:rPr>
+              <w:t>Step</w:t>
+            </w:r>
+          </w:p>
+        </w:tc>
+        <w:tc>
+          <w:tcPr>
+            <w:tcW w:type="dxa" w:w="1700"/>
+          </w:tcPr>
+          <w:p>
+            <w:r>
+              <w:rPr>
+                <w:b/>
+              </w:rPr>
+              <w:t>Expand</w:t>
+            </w:r>
+          </w:p>
+        </w:tc>
+        <w:tc>
+          <w:tcPr>
+            <w:tcW w:type="dxa" w:w="1700"/>
+          </w:tcPr>
+          <w:p>
+            <w:r>
+              <w:rPr>
+                <w:b/>
+              </w:rPr>
+              <w:t>g</w:t>
+            </w:r>
+          </w:p>
+        </w:tc>
+        <w:tc>
+          <w:tcPr>
+            <w:tcW w:type="dxa" w:w="1700"/>
+          </w:tcPr>
+          <w:p>
+            <w:r>
+              <w:rPr>
+                <w:b/>
+              </w:rPr>
+              <w:t>h</w:t>
+            </w:r>
+          </w:p>
+        </w:tc>
+        <w:tc>
+          <w:tcPr>
+            <w:tcW w:type="dxa" w:w="1700"/>
+          </w:tcPr>
+          <w:p>
+            <w:r>
+              <w:rPr>
+                <w:b/>
+              </w:rPr>
+              <w:t>f</w:t>
+            </w:r>
+          </w:p>
+        </w:tc>
+        <w:tc>
+          <w:tcPr>
+            <w:tcW w:type="dxa" w:w="1700"/>
+          </w:tcPr>
+          <w:p>
+            <w:r>
+              <w:rPr>
+                <w:b/>
+              </w:rPr>
+              <w:t>Key action</w:t>
+            </w:r>
+          </w:p>
+        </w:tc>
+      </w:tr>
+      <w:tr>
+        <w:tc>
+          <w:tcPr>
+            <w:tcW w:type="dxa" w:w="1700"/>
+          </w:tcPr>
+          <w:p>
+            <w:r>
+              <w:t>1</w:t>
+            </w:r>
+          </w:p>
+        </w:tc>
+        <w:tc>
+          <w:tcPr>
+            <w:tcW w:type="dxa" w:w="1700"/>
+          </w:tcPr>
+          <w:p>
+            <w:r>
+              <w:t>C</w:t>
+            </w:r>
+          </w:p>
+        </w:tc>
+        <w:tc>
+          <w:tcPr>
+            <w:tcW w:type="dxa" w:w="1700"/>
+          </w:tcPr>
+          <w:p>
+            <w:r>
+              <w:t>0</w:t>
+            </w:r>
+          </w:p>
+        </w:tc>
+        <w:tc>
+          <w:tcPr>
+            <w:tcW w:type="dxa" w:w="1700"/>
+          </w:tcPr>
+          <w:p>
+            <w:r>
+              <w:t>20</w:t>
+            </w:r>
+          </w:p>
+        </w:tc>
+        <w:tc>
+          <w:tcPr>
+            <w:tcW w:type="dxa" w:w="1700"/>
+          </w:tcPr>
+          <w:p>
+            <w:r>
+              <w:t>20</w:t>
+            </w:r>
+          </w:p>
+        </w:tc>
+        <w:tc>
+          <w:tcPr>
+            <w:tcW w:type="dxa" w:w="1700"/>
+          </w:tcPr>
+          <w:p>
+            <w:r>
+              <w:t>Add B(f=28), D(f=23), E(f=14)</w:t>
+            </w:r>
+          </w:p>
+        </w:tc>
+      </w:tr>
+      <w:tr>
+        <w:tc>
+          <w:tcPr>
+            <w:tcW w:type="dxa" w:w="1700"/>
+          </w:tcPr>
+          <w:p>
+            <w:r>
+              <w:t>2</w:t>
+            </w:r>
+          </w:p>
+        </w:tc>
+        <w:tc>
+          <w:tcPr>
+            <w:tcW w:type="dxa" w:w="1700"/>
+          </w:tcPr>
+          <w:p>
+            <w:r>
+              <w:t>E (f=14)</w:t>
+            </w:r>
+          </w:p>
+        </w:tc>
+        <w:tc>
+          <w:tcPr>
+            <w:tcW w:type="dxa" w:w="1700"/>
+          </w:tcPr>
+          <w:p>
+            <w:r>
+              <w:t>4</w:t>
+            </w:r>
+          </w:p>
+        </w:tc>
+        <w:tc>
+          <w:tcPr>
+            <w:tcW w:type="dxa" w:w="1700"/>
+          </w:tcPr>
+          <w:p>
+            <w:r>
+              <w:t>10</w:t>
+            </w:r>
+          </w:p>
+        </w:tc>
+        <w:tc>
+          <w:tcPr>
+            <w:tcW w:type="dxa" w:w="1700"/>
+          </w:tcPr>
+          <w:p>
+            <w:r>
+              <w:t>14</w:t>
+            </w:r>
+          </w:p>
+        </w:tc>
+        <w:tc>
+          <w:tcPr>
+            <w:tcW w:type="dxa" w:w="1700"/>
+          </w:tcPr>
+          <w:p>
+            <w:r>
+              <w:t>D via E: g=10,f=25 &gt; existing D(f=23). Keep D(f=23).</w:t>
+            </w:r>
+          </w:p>
+        </w:tc>
+      </w:tr>
+      <w:tr>
+        <w:tc>
+          <w:tcPr>
+            <w:tcW w:type="dxa" w:w="1700"/>
+          </w:tcPr>
+          <w:p>
+            <w:r>
+              <w:t>3</w:t>
+            </w:r>
+          </w:p>
+        </w:tc>
+        <w:tc>
+          <w:tcPr>
+            <w:tcW w:type="dxa" w:w="1700"/>
+          </w:tcPr>
+          <w:p>
+            <w:r>
+              <w:t>D (f=23)</w:t>
+            </w:r>
+          </w:p>
+        </w:tc>
+        <w:tc>
+          <w:tcPr>
+            <w:tcW w:type="dxa" w:w="1700"/>
+          </w:tcPr>
+          <w:p>
+            <w:r>
+              <w:t>8</w:t>
+            </w:r>
+          </w:p>
+        </w:tc>
+        <w:tc>
+          <w:tcPr>
+            <w:tcW w:type="dxa" w:w="1700"/>
+          </w:tcPr>
+          <w:p>
+            <w:r>
+              <w:t>15</w:t>
+            </w:r>
+          </w:p>
+        </w:tc>
+        <w:tc>
+          <w:tcPr>
+            <w:tcW w:type="dxa" w:w="1700"/>
+          </w:tcPr>
+          <w:p>
+            <w:r>
+              <w:t>23</w:t>
+            </w:r>
+          </w:p>
+        </w:tc>
+        <w:tc>
+          <w:tcPr>
+            <w:tcW w:type="dxa" w:w="1700"/>
+          </w:tcPr>
+          <w:p>
+            <w:r>
+              <w:t>Add F(g=13,f=18), G(g=24,f=24). B via D has f=51, skip.</w:t>
+            </w:r>
+          </w:p>
+        </w:tc>
+      </w:tr>
+      <w:tr>
+        <w:tc>
+          <w:tcPr>
+            <w:tcW w:type="dxa" w:w="1700"/>
+          </w:tcPr>
+          <w:p>
+            <w:r>
+              <w:t>4</w:t>
+            </w:r>
+          </w:p>
+        </w:tc>
+        <w:tc>
+          <w:tcPr>
+            <w:tcW w:type="dxa" w:w="1700"/>
+          </w:tcPr>
+          <w:p>
+            <w:r>
+              <w:t>F (f=18)</w:t>
+            </w:r>
+          </w:p>
+        </w:tc>
+        <w:tc>
+          <w:tcPr>
+            <w:tcW w:type="dxa" w:w="1700"/>
+          </w:tcPr>
+          <w:p>
+            <w:r>
+              <w:t>13</w:t>
+            </w:r>
+          </w:p>
+        </w:tc>
+        <w:tc>
+          <w:tcPr>
+            <w:tcW w:type="dxa" w:w="1700"/>
+          </w:tcPr>
+          <w:p>
+            <w:r>
+              <w:t>5</w:t>
+            </w:r>
+          </w:p>
+        </w:tc>
+        <w:tc>
+          <w:tcPr>
+            <w:tcW w:type="dxa" w:w="1700"/>
+          </w:tcPr>
+          <w:p>
+            <w:r>
+              <w:t>18</w:t>
+            </w:r>
+          </w:p>
+        </w:tc>
+        <w:tc>
+          <w:tcPr>
+            <w:tcW w:type="dxa" w:w="1700"/>
+          </w:tcPr>
+          <w:p>
+            <w:r>
+              <w:t>Add A(g=33,f=63). F is dead end.</w:t>
+            </w:r>
+          </w:p>
+        </w:tc>
+      </w:tr>
+      <w:tr>
+        <w:tc>
+          <w:tcPr>
+            <w:tcW w:type="dxa" w:w="1700"/>
+          </w:tcPr>
+          <w:p>
+            <w:r>
+              <w:t>5</w:t>
+            </w:r>
+          </w:p>
+        </w:tc>
+        <w:tc>
+          <w:tcPr>
+            <w:tcW w:type="dxa" w:w="1700"/>
+          </w:tcPr>
+          <w:p>
+            <w:r>
+              <w:t>G (f=24)</w:t>
+            </w:r>
+          </w:p>
+        </w:tc>
+        <w:tc>
+          <w:tcPr>
+            <w:tcW w:type="dxa" w:w="1700"/>
+          </w:tcPr>
+          <w:p>
+            <w:r>
+              <w:t>24</w:t>
+            </w:r>
+          </w:p>
+        </w:tc>
+        <w:tc>
+          <w:tcPr>
+            <w:tcW w:type="dxa" w:w="1700"/>
+          </w:tcPr>
+          <w:p>
+            <w:r>
+              <w:t>0</w:t>
+            </w:r>
+          </w:p>
+        </w:tc>
+        <w:tc>
+          <w:tcPr>
+            <w:tcW w:type="dxa" w:w="1700"/>
+          </w:tcPr>
+          <w:p>
+            <w:r>
+              <w:t>24</w:t>
+            </w:r>
+          </w:p>
+        </w:tc>
+        <w:tc>
+          <w:tcPr>
+            <w:tcW w:type="dxa" w:w="1700"/>
+          </w:tcPr>
+          <w:p>
+            <w:r>
+              <w:t>GOAL!</w:t>
+            </w:r>
+          </w:p>
+        </w:tc>
+      </w:tr>
+    </w:tbl>
+    <w:p>
+      <w:r>
+        <w:rPr>
+          <w:b w:val="0"/>
+          <w:i w:val="0"/>
+        </w:rPr>
+        <w:t>SOLUTION: C -&gt; D -&gt; G, cost = 8+16 = 24</w:t>
+      </w:r>
+    </w:p>
+    <w:p>
+      <w:r>
+        <w:rPr>
+          <w:b w:val="0"/>
+          <w:i w:val="0"/>
+        </w:rPr>
+        <w:t>Steps 3-4 are what the earlier notes omitted: D expands to F and G; F expands to A (dead end); then G is popped as the goal.</w:t>
+      </w:r>
+    </w:p>
+    <w:p>
+      <w:pPr>
+        <w:pStyle w:val="Heading2"/>
+      </w:pPr>
+      <w:r>
+        <w:rPr>
+          <w:b/>
+        </w:rPr>
+        <w:t>Dec 2024 Q4: A* Timisoara to Bucharest (Romania Map)</w:t>
+      </w:r>
+    </w:p>
+    <w:p>
+      <w:r>
+        <w:rPr>
+          <w:b w:val="0"/>
+          <w:i w:val="0"/>
+        </w:rPr>
+        <w:t>Full step-by-step expansion using h = straight-line distance to Bucharest.</w:t>
+      </w:r>
+    </w:p>
+    <w:tbl>
+      <w:tblPr>
+        <w:tblStyle w:val="TableGrid"/>
+        <w:tblW w:type="auto" w:w="0"/>
+        <w:tblLook w:firstColumn="1" w:firstRow="1" w:lastColumn="0" w:lastRow="0" w:noHBand="0" w:noVBand="1" w:val="04A0"/>
+      </w:tblPr>
+      <w:tblGrid>
+        <w:gridCol w:w="1700"/>
+        <w:gridCol w:w="1700"/>
+        <w:gridCol w:w="1700"/>
+        <w:gridCol w:w="1700"/>
+        <w:gridCol w:w="1700"/>
+        <w:gridCol w:w="1700"/>
+      </w:tblGrid>
+      <w:tr>
+        <w:tc>
+          <w:tcPr>
+            <w:tcW w:type="dxa" w:w="1700"/>
+          </w:tcPr>
+          <w:p>
+            <w:r>
+              <w:rPr>
+                <w:b/>
+              </w:rPr>
+              <w:t>Step</w:t>
+            </w:r>
+          </w:p>
+        </w:tc>
+        <w:tc>
+          <w:tcPr>
+            <w:tcW w:type="dxa" w:w="1700"/>
+          </w:tcPr>
+          <w:p>
+            <w:r>
+              <w:rPr>
+                <w:b/>
+              </w:rPr>
+              <w:t>Expand</w:t>
+            </w:r>
+          </w:p>
+        </w:tc>
+        <w:tc>
+          <w:tcPr>
+            <w:tcW w:type="dxa" w:w="1700"/>
+          </w:tcPr>
+          <w:p>
+            <w:r>
+              <w:rPr>
+                <w:b/>
+              </w:rPr>
+              <w:t>g</w:t>
+            </w:r>
+          </w:p>
+        </w:tc>
+        <w:tc>
+          <w:tcPr>
+            <w:tcW w:type="dxa" w:w="1700"/>
+          </w:tcPr>
+          <w:p>
+            <w:r>
+              <w:rPr>
+                <w:b/>
+              </w:rPr>
+              <w:t>h</w:t>
+            </w:r>
+          </w:p>
+        </w:tc>
+        <w:tc>
+          <w:tcPr>
+            <w:tcW w:type="dxa" w:w="1700"/>
+          </w:tcPr>
+          <w:p>
+            <w:r>
+              <w:rPr>
+                <w:b/>
+              </w:rPr>
+              <w:t>f</w:t>
+            </w:r>
+          </w:p>
+        </w:tc>
+        <w:tc>
+          <w:tcPr>
+            <w:tcW w:type="dxa" w:w="1700"/>
+          </w:tcPr>
+          <w:p>
+            <w:r>
+              <w:rPr>
+                <w:b/>
+              </w:rPr>
+              <w:t>New nodes added</w:t>
+            </w:r>
+          </w:p>
+        </w:tc>
+      </w:tr>
+      <w:tr>
+        <w:tc>
+          <w:tcPr>
+            <w:tcW w:type="dxa" w:w="1700"/>
+          </w:tcPr>
+          <w:p>
+            <w:r>
+              <w:t>1</w:t>
+            </w:r>
+          </w:p>
+        </w:tc>
+        <w:tc>
+          <w:tcPr>
+            <w:tcW w:type="dxa" w:w="1700"/>
+          </w:tcPr>
+          <w:p>
+            <w:r>
+              <w:t>Timisoara</w:t>
+            </w:r>
+          </w:p>
+        </w:tc>
+        <w:tc>
+          <w:tcPr>
+            <w:tcW w:type="dxa" w:w="1700"/>
+          </w:tcPr>
+          <w:p>
+            <w:r>
+              <w:t>0</w:t>
+            </w:r>
+          </w:p>
+        </w:tc>
+        <w:tc>
+          <w:tcPr>
+            <w:tcW w:type="dxa" w:w="1700"/>
+          </w:tcPr>
+          <w:p>
+            <w:r>
+              <w:t>329</w:t>
+            </w:r>
+          </w:p>
+        </w:tc>
+        <w:tc>
+          <w:tcPr>
+            <w:tcW w:type="dxa" w:w="1700"/>
+          </w:tcPr>
+          <w:p>
+            <w:r>
+              <w:t>329</w:t>
+            </w:r>
+          </w:p>
+        </w:tc>
+        <w:tc>
+          <w:tcPr>
+            <w:tcW w:type="dxa" w:w="1700"/>
+          </w:tcPr>
+          <w:p>
+            <w:r>
+              <w:t>Arad(f=484), Lugoj(f=355)</w:t>
+            </w:r>
+          </w:p>
+        </w:tc>
+      </w:tr>
+      <w:tr>
+        <w:tc>
+          <w:tcPr>
+            <w:tcW w:type="dxa" w:w="1700"/>
+          </w:tcPr>
+          <w:p>
+            <w:r>
+              <w:t>2</w:t>
+            </w:r>
+          </w:p>
+        </w:tc>
+        <w:tc>
+          <w:tcPr>
+            <w:tcW w:type="dxa" w:w="1700"/>
+          </w:tcPr>
+          <w:p>
+            <w:r>
+              <w:t>Lugoj</w:t>
+            </w:r>
+          </w:p>
+        </w:tc>
+        <w:tc>
+          <w:tcPr>
+            <w:tcW w:type="dxa" w:w="1700"/>
+          </w:tcPr>
+          <w:p>
+            <w:r>
+              <w:t>111</w:t>
+            </w:r>
+          </w:p>
+        </w:tc>
+        <w:tc>
+          <w:tcPr>
+            <w:tcW w:type="dxa" w:w="1700"/>
+          </w:tcPr>
+          <w:p>
+            <w:r>
+              <w:t>244</w:t>
+            </w:r>
+          </w:p>
+        </w:tc>
+        <w:tc>
+          <w:tcPr>
+            <w:tcW w:type="dxa" w:w="1700"/>
+          </w:tcPr>
+          <w:p>
+            <w:r>
+              <w:t>355</w:t>
+            </w:r>
+          </w:p>
+        </w:tc>
+        <w:tc>
+          <w:tcPr>
+            <w:tcW w:type="dxa" w:w="1700"/>
+          </w:tcPr>
+          <w:p>
+            <w:r>
+              <w:t>Mehadia(f=422)</w:t>
+            </w:r>
+          </w:p>
+        </w:tc>
+      </w:tr>
+      <w:tr>
+        <w:tc>
+          <w:tcPr>
+            <w:tcW w:type="dxa" w:w="1700"/>
+          </w:tcPr>
+          <w:p>
+            <w:r>
+              <w:t>3</w:t>
+            </w:r>
+          </w:p>
+        </w:tc>
+        <w:tc>
+          <w:tcPr>
+            <w:tcW w:type="dxa" w:w="1700"/>
+          </w:tcPr>
+          <w:p>
+            <w:r>
+              <w:t>Mehadia</w:t>
+            </w:r>
+          </w:p>
+        </w:tc>
+        <w:tc>
+          <w:tcPr>
+            <w:tcW w:type="dxa" w:w="1700"/>
+          </w:tcPr>
+          <w:p>
+            <w:r>
+              <w:t>181</w:t>
+            </w:r>
+          </w:p>
+        </w:tc>
+        <w:tc>
+          <w:tcPr>
+            <w:tcW w:type="dxa" w:w="1700"/>
+          </w:tcPr>
+          <w:p>
+            <w:r>
+              <w:t>241</w:t>
+            </w:r>
+          </w:p>
+        </w:tc>
+        <w:tc>
+          <w:tcPr>
+            <w:tcW w:type="dxa" w:w="1700"/>
+          </w:tcPr>
+          <w:p>
+            <w:r>
+              <w:t>422</w:t>
+            </w:r>
+          </w:p>
+        </w:tc>
+        <w:tc>
+          <w:tcPr>
+            <w:tcW w:type="dxa" w:w="1700"/>
+          </w:tcPr>
+          <w:p>
+            <w:r>
+              <w:t>Dobreta(f=498)</w:t>
+            </w:r>
+          </w:p>
+        </w:tc>
+      </w:tr>
+      <w:tr>
+        <w:tc>
+          <w:tcPr>
+            <w:tcW w:type="dxa" w:w="1700"/>
+          </w:tcPr>
+          <w:p>
+            <w:r>
+              <w:t>4</w:t>
+            </w:r>
+          </w:p>
+        </w:tc>
+        <w:tc>
+          <w:tcPr>
+            <w:tcW w:type="dxa" w:w="1700"/>
+          </w:tcPr>
+          <w:p>
+            <w:r>
+              <w:t>Arad</w:t>
+            </w:r>
+          </w:p>
+        </w:tc>
+        <w:tc>
+          <w:tcPr>
+            <w:tcW w:type="dxa" w:w="1700"/>
+          </w:tcPr>
+          <w:p>
+            <w:r>
+              <w:t>118</w:t>
+            </w:r>
+          </w:p>
+        </w:tc>
+        <w:tc>
+          <w:tcPr>
+            <w:tcW w:type="dxa" w:w="1700"/>
+          </w:tcPr>
+          <w:p>
+            <w:r>
+              <w:t>366</w:t>
+            </w:r>
+          </w:p>
+        </w:tc>
+        <w:tc>
+          <w:tcPr>
+            <w:tcW w:type="dxa" w:w="1700"/>
+          </w:tcPr>
+          <w:p>
+            <w:r>
+              <w:t>484</w:t>
+            </w:r>
+          </w:p>
+        </w:tc>
+        <w:tc>
+          <w:tcPr>
+            <w:tcW w:type="dxa" w:w="1700"/>
+          </w:tcPr>
+          <w:p>
+            <w:r>
+              <w:t>Sibiu(f=511), Zerind(f=567)</w:t>
+            </w:r>
+          </w:p>
+        </w:tc>
+      </w:tr>
+      <w:tr>
+        <w:tc>
+          <w:tcPr>
+            <w:tcW w:type="dxa" w:w="1700"/>
+          </w:tcPr>
+          <w:p>
+            <w:r>
+              <w:t>5</w:t>
+            </w:r>
+          </w:p>
+        </w:tc>
+        <w:tc>
+          <w:tcPr>
+            <w:tcW w:type="dxa" w:w="1700"/>
+          </w:tcPr>
+          <w:p>
+            <w:r>
+              <w:t>Dobreta</w:t>
+            </w:r>
+          </w:p>
+        </w:tc>
+        <w:tc>
+          <w:tcPr>
+            <w:tcW w:type="dxa" w:w="1700"/>
+          </w:tcPr>
+          <w:p>
+            <w:r>
+              <w:t>256</w:t>
+            </w:r>
+          </w:p>
+        </w:tc>
+        <w:tc>
+          <w:tcPr>
+            <w:tcW w:type="dxa" w:w="1700"/>
+          </w:tcPr>
+          <w:p>
+            <w:r>
+              <w:t>242</w:t>
+            </w:r>
+          </w:p>
+        </w:tc>
+        <w:tc>
+          <w:tcPr>
+            <w:tcW w:type="dxa" w:w="1700"/>
+          </w:tcPr>
+          <w:p>
+            <w:r>
+              <w:t>498</w:t>
+            </w:r>
+          </w:p>
+        </w:tc>
+        <w:tc>
+          <w:tcPr>
+            <w:tcW w:type="dxa" w:w="1700"/>
+          </w:tcPr>
+          <w:p>
+            <w:r>
+              <w:t>Craiova_via_Dobreta(f=536)</w:t>
+            </w:r>
+          </w:p>
+        </w:tc>
+      </w:tr>
+      <w:tr>
+        <w:tc>
+          <w:tcPr>
+            <w:tcW w:type="dxa" w:w="1700"/>
+          </w:tcPr>
+          <w:p>
+            <w:r>
+              <w:t>6</w:t>
+            </w:r>
+          </w:p>
+        </w:tc>
+        <w:tc>
+          <w:tcPr>
+            <w:tcW w:type="dxa" w:w="1700"/>
+          </w:tcPr>
+          <w:p>
+            <w:r>
+              <w:t>Sibiu</w:t>
+            </w:r>
+          </w:p>
+        </w:tc>
+        <w:tc>
+          <w:tcPr>
+            <w:tcW w:type="dxa" w:w="1700"/>
+          </w:tcPr>
+          <w:p>
+            <w:r>
+              <w:t>258</w:t>
+            </w:r>
+          </w:p>
+        </w:tc>
+        <w:tc>
+          <w:tcPr>
+            <w:tcW w:type="dxa" w:w="1700"/>
+          </w:tcPr>
+          <w:p>
+            <w:r>
+              <w:t>253</w:t>
+            </w:r>
+          </w:p>
+        </w:tc>
+        <w:tc>
+          <w:tcPr>
+            <w:tcW w:type="dxa" w:w="1700"/>
+          </w:tcPr>
+          <w:p>
+            <w:r>
+              <w:t>511</w:t>
+            </w:r>
+          </w:p>
+        </w:tc>
+        <w:tc>
+          <w:tcPr>
+            <w:tcW w:type="dxa" w:w="1700"/>
+          </w:tcPr>
+          <w:p>
+            <w:r>
+              <w:t>Fagaras(f=535), Rimnicu(f=531), Oradea(f=789)</w:t>
+            </w:r>
+          </w:p>
+        </w:tc>
+      </w:tr>
+      <w:tr>
+        <w:tc>
+          <w:tcPr>
+            <w:tcW w:type="dxa" w:w="1700"/>
+          </w:tcPr>
+          <w:p>
+            <w:r>
+              <w:t>7</w:t>
+            </w:r>
+          </w:p>
+        </w:tc>
+        <w:tc>
+          <w:tcPr>
+            <w:tcW w:type="dxa" w:w="1700"/>
+          </w:tcPr>
+          <w:p>
+            <w:r>
+              <w:t>Rimnicu</w:t>
+            </w:r>
+          </w:p>
+        </w:tc>
+        <w:tc>
+          <w:tcPr>
+            <w:tcW w:type="dxa" w:w="1700"/>
+          </w:tcPr>
+          <w:p>
+            <w:r>
+              <w:t>338</w:t>
+            </w:r>
+          </w:p>
+        </w:tc>
+        <w:tc>
+          <w:tcPr>
+            <w:tcW w:type="dxa" w:w="1700"/>
+          </w:tcPr>
+          <w:p>
+            <w:r>
+              <w:t>193</w:t>
+            </w:r>
+          </w:p>
+        </w:tc>
+        <w:tc>
+          <w:tcPr>
+            <w:tcW w:type="dxa" w:w="1700"/>
+          </w:tcPr>
+          <w:p>
+            <w:r>
+              <w:t>531</w:t>
+            </w:r>
+          </w:p>
+        </w:tc>
+        <w:tc>
+          <w:tcPr>
+            <w:tcW w:type="dxa" w:w="1700"/>
+          </w:tcPr>
+          <w:p>
+            <w:r>
+              <w:t>Pitesti(f=533), Craiova_via_Rim(f=644)</w:t>
+            </w:r>
+          </w:p>
+        </w:tc>
+      </w:tr>
+      <w:tr>
+        <w:tc>
+          <w:tcPr>
+            <w:tcW w:type="dxa" w:w="1700"/>
+          </w:tcPr>
+          <w:p>
+            <w:r>
+              <w:t>8</w:t>
+            </w:r>
+          </w:p>
+        </w:tc>
+        <w:tc>
+          <w:tcPr>
+            <w:tcW w:type="dxa" w:w="1700"/>
+          </w:tcPr>
+          <w:p>
+            <w:r>
+              <w:t>Pitesti</w:t>
+            </w:r>
+          </w:p>
+        </w:tc>
+        <w:tc>
+          <w:tcPr>
+            <w:tcW w:type="dxa" w:w="1700"/>
+          </w:tcPr>
+          <w:p>
+            <w:r>
+              <w:t>435</w:t>
+            </w:r>
+          </w:p>
+        </w:tc>
+        <w:tc>
+          <w:tcPr>
+            <w:tcW w:type="dxa" w:w="1700"/>
+          </w:tcPr>
+          <w:p>
+            <w:r>
+              <w:t>98</w:t>
+            </w:r>
+          </w:p>
+        </w:tc>
+        <w:tc>
+          <w:tcPr>
+            <w:tcW w:type="dxa" w:w="1700"/>
+          </w:tcPr>
+          <w:p>
+            <w:r>
+              <w:t>533</w:t>
+            </w:r>
+          </w:p>
+        </w:tc>
+        <w:tc>
+          <w:tcPr>
+            <w:tcW w:type="dxa" w:w="1700"/>
+          </w:tcPr>
+          <w:p>
+            <w:r>
+              <w:t>Bucharest_via_Pitesti(f=536), Craiova(f=733)</w:t>
+            </w:r>
+          </w:p>
+        </w:tc>
+      </w:tr>
+      <w:tr>
+        <w:tc>
+          <w:tcPr>
+            <w:tcW w:type="dxa" w:w="1700"/>
+          </w:tcPr>
+          <w:p>
+            <w:r>
+              <w:t>9</w:t>
+            </w:r>
+          </w:p>
+        </w:tc>
+        <w:tc>
+          <w:tcPr>
+            <w:tcW w:type="dxa" w:w="1700"/>
+          </w:tcPr>
+          <w:p>
+            <w:r>
+              <w:t>Fagaras</w:t>
+            </w:r>
+          </w:p>
+        </w:tc>
+        <w:tc>
+          <w:tcPr>
+            <w:tcW w:type="dxa" w:w="1700"/>
+          </w:tcPr>
+          <w:p>
+            <w:r>
+              <w:t>357</w:t>
+            </w:r>
+          </w:p>
+        </w:tc>
+        <w:tc>
+          <w:tcPr>
+            <w:tcW w:type="dxa" w:w="1700"/>
+          </w:tcPr>
+          <w:p>
+            <w:r>
+              <w:t>178</w:t>
+            </w:r>
+          </w:p>
+        </w:tc>
+        <w:tc>
+          <w:tcPr>
+            <w:tcW w:type="dxa" w:w="1700"/>
+          </w:tcPr>
+          <w:p>
+            <w:r>
+              <w:t>535</w:t>
+            </w:r>
+          </w:p>
+        </w:tc>
+        <w:tc>
+          <w:tcPr>
+            <w:tcW w:type="dxa" w:w="1700"/>
+          </w:tcPr>
+          <w:p>
+            <w:r>
+              <w:t>Bucharest_via_Fagaras(f=568)</w:t>
+            </w:r>
+          </w:p>
+        </w:tc>
+      </w:tr>
+      <w:tr>
+        <w:tc>
+          <w:tcPr>
+            <w:tcW w:type="dxa" w:w="1700"/>
+          </w:tcPr>
+          <w:p>
+            <w:r>
+              <w:t>10</w:t>
+            </w:r>
+          </w:p>
+        </w:tc>
+        <w:tc>
+          <w:tcPr>
+            <w:tcW w:type="dxa" w:w="1700"/>
+          </w:tcPr>
+          <w:p>
+            <w:r>
+              <w:t>Craiova</w:t>
+            </w:r>
+          </w:p>
+        </w:tc>
+        <w:tc>
+          <w:tcPr>
+            <w:tcW w:type="dxa" w:w="1700"/>
+          </w:tcPr>
+          <w:p>
+            <w:r>
+              <w:t>376</w:t>
+            </w:r>
+          </w:p>
+        </w:tc>
+        <w:tc>
+          <w:tcPr>
+            <w:tcW w:type="dxa" w:w="1700"/>
+          </w:tcPr>
+          <w:p>
+            <w:r>
+              <w:t>160</w:t>
+            </w:r>
+          </w:p>
+        </w:tc>
+        <w:tc>
+          <w:tcPr>
+            <w:tcW w:type="dxa" w:w="1700"/>
+          </w:tcPr>
+          <w:p>
+            <w:r>
+              <w:t>536</w:t>
+            </w:r>
+          </w:p>
+        </w:tc>
+        <w:tc>
+          <w:tcPr>
+            <w:tcW w:type="dxa" w:w="1700"/>
+          </w:tcPr>
+          <w:p>
+            <w:r>
+              <w:t>Skips Pitesti/Rimnicu already visited</w:t>
+            </w:r>
+          </w:p>
+        </w:tc>
+      </w:tr>
+      <w:tr>
+        <w:tc>
+          <w:tcPr>
+            <w:tcW w:type="dxa" w:w="1700"/>
+          </w:tcPr>
+          <w:p>
+            <w:r>
+              <w:t>11</w:t>
+            </w:r>
+          </w:p>
+        </w:tc>
+        <w:tc>
+          <w:tcPr>
+            <w:tcW w:type="dxa" w:w="1700"/>
+          </w:tcPr>
+          <w:p>
+            <w:r>
+              <w:t>Bucharest</w:t>
+            </w:r>
+          </w:p>
+        </w:tc>
+        <w:tc>
+          <w:tcPr>
+            <w:tcW w:type="dxa" w:w="1700"/>
+          </w:tcPr>
+          <w:p>
+            <w:r>
+              <w:t>536</w:t>
+            </w:r>
+          </w:p>
+        </w:tc>
+        <w:tc>
+          <w:tcPr>
+            <w:tcW w:type="dxa" w:w="1700"/>
+          </w:tcPr>
+          <w:p>
+            <w:r>
+              <w:t>0</w:t>
+            </w:r>
+          </w:p>
+        </w:tc>
+        <w:tc>
+          <w:tcPr>
+            <w:tcW w:type="dxa" w:w="1700"/>
+          </w:tcPr>
+          <w:p>
+            <w:r>
+              <w:t>536</w:t>
+            </w:r>
+          </w:p>
+        </w:tc>
+        <w:tc>
+          <w:tcPr>
+            <w:tcW w:type="dxa" w:w="1700"/>
+          </w:tcPr>
+          <w:p>
+            <w:r>
+              <w:t>GOAL!</w:t>
+            </w:r>
+          </w:p>
+        </w:tc>
+      </w:tr>
+    </w:tbl>
+    <w:p>
+      <w:r>
+        <w:rPr>
+          <w:b w:val="0"/>
+          <w:i w:val="0"/>
+        </w:rPr>
+        <w:t>SOLUTION: Timisoara -&gt; Arad -&gt; Sibiu -&gt; Rimnicu -&gt; Pitesti -&gt; Bucharest</w:t>
+      </w:r>
+    </w:p>
+    <w:p>
+      <w:r>
+        <w:rPr>
+          <w:b w:val="0"/>
+          <w:i w:val="0"/>
+        </w:rPr>
+        <w:t>Cost = 118+140+80+97+101 = 536</w:t>
+      </w:r>
+    </w:p>
+    <w:p>
+      <w:r>
+        <w:rPr>
+          <w:b w:val="0"/>
+          <w:i w:val="0"/>
+        </w:rPr>
+        <w:t>Key: Pitesti route (f=536) beats Fagaras route (f=568). Craiova via Dobreta (g=376) is slower than via Rimnicu (g=484) — both reach Pitesti but via-Rimnicu path was already found cheaper.</w:t>
+      </w:r>
+    </w:p>
+    <w:p>
+      <w:pPr>
+        <w:pStyle w:val="Heading2"/>
+      </w:pPr>
+      <w:r>
+        <w:rPr>
+          <w:b/>
+        </w:rPr>
+        <w:t>Dec 2024 Q5: Bayesian P(C) and P(W|C) -- Full Numerical Solution</w:t>
+      </w:r>
+    </w:p>
+    <w:p>
+      <w:r>
+        <w:rPr>
+          <w:b w:val="0"/>
+          <w:i w:val="0"/>
+        </w:rPr>
+        <w:t>Network: W-&gt;T, W-&gt;R, T-&gt;C, R-&gt;C. P(W)=0.6</w:t>
+      </w:r>
+    </w:p>
+    <w:p>
+      <w:r>
+        <w:rPr>
+          <w:b w:val="0"/>
+          <w:i w:val="0"/>
+        </w:rPr>
+        <w:t>P(T|W)=0.7, P(T|~W)=0.2, P(R|W)=0.8, P(R|~W)=0.1</w:t>
+      </w:r>
+    </w:p>
+    <w:p>
+      <w:r>
+        <w:rPr>
+          <w:b w:val="0"/>
+          <w:i w:val="0"/>
+        </w:rPr>
+        <w:t>P(C|T,R)=0.9, P(C|T,~R)=0.6, P(C|~T,R)=0.7, P(C|~T,~R)=0.1</w:t>
+      </w:r>
+    </w:p>
+    <w:p>
+      <w:r>
+        <w:rPr>
+          <w:b w:val="0"/>
+          <w:i w:val="0"/>
+        </w:rPr>
+        <w:t>Step 1: P(C|W=1) -- sum over T,R (conditionally independent given W):</w:t>
+      </w:r>
+    </w:p>
+    <w:p>
+      <w:r>
+        <w:rPr>
+          <w:b w:val="0"/>
+          <w:i w:val="0"/>
+        </w:rPr>
+        <w:t xml:space="preserve">  = P(T|W)*P(R|W)*0.9 + P(T|W)*P(~R|W)*0.6 + P(~T|W)*P(R|W)*0.7 + P(~T|W)*P(~R|W)*0.1</w:t>
+      </w:r>
+    </w:p>
+    <w:p>
+      <w:r>
+        <w:rPr>
+          <w:b w:val="0"/>
+          <w:i w:val="0"/>
+        </w:rPr>
+        <w:t xml:space="preserve">  = 0.7*0.8*0.9 + 0.7*0.2*0.6 + 0.3*0.8*0.7 + 0.3*0.2*0.1</w:t>
+      </w:r>
+    </w:p>
+    <w:p>
+      <w:r>
+        <w:rPr>
+          <w:b w:val="0"/>
+          <w:i w:val="0"/>
+        </w:rPr>
+        <w:t xml:space="preserve">  = 0.504 + 0.084 + 0.168 + 0.006 = 0.762</w:t>
+      </w:r>
+    </w:p>
+    <w:p>
+      <w:r>
+        <w:rPr>
+          <w:b w:val="0"/>
+          <w:i w:val="0"/>
+        </w:rPr>
+        <w:t>Step 2: P(C|W=0):</w:t>
+      </w:r>
+    </w:p>
+    <w:p>
+      <w:r>
+        <w:rPr>
+          <w:b w:val="0"/>
+          <w:i w:val="0"/>
+        </w:rPr>
+        <w:t xml:space="preserve">  = 0.2*0.1*0.9 + 0.2*0.9*0.6 + 0.8*0.1*0.7 + 0.8*0.9*0.1</w:t>
+      </w:r>
+    </w:p>
+    <w:p>
+      <w:r>
+        <w:rPr>
+          <w:b w:val="0"/>
+          <w:i w:val="0"/>
+        </w:rPr>
+        <w:t xml:space="preserve">  = 0.018 + 0.108 + 0.056 + 0.072 = 0.254</w:t>
+      </w:r>
+    </w:p>
+    <w:p>
+      <w:r>
+        <w:rPr>
+          <w:b w:val="0"/>
+          <w:i w:val="0"/>
+        </w:rPr>
+        <w:t>Step 3: P(C) = P(C|W)*P(W) + P(C|~W)*P(~W) = 0.762*0.6 + 0.254*0.4 = 0.4572+0.1016 = 0.5588</w:t>
+      </w:r>
+    </w:p>
+    <w:p>
+      <w:r>
+        <w:rPr>
+          <w:b w:val="0"/>
+          <w:i w:val="0"/>
+        </w:rPr>
+        <w:t>Step 4: P(W|C) = P(C|W)*P(W)/P(C) = 0.762*0.6/0.5588 = 0.4572/0.5588 = 0.8182</w:t>
+      </w:r>
+    </w:p>
+    <w:p>
+      <w:r>
+        <w:rPr>
+          <w:b/>
+          <w:i w:val="0"/>
+        </w:rPr>
+        <w:t>ANSWERS: P(C) = 0.5588    P(W|C) = 0.8182</w:t>
+      </w:r>
+    </w:p>
+    <w:p>
+      <w:pPr>
+        <w:pStyle w:val="Heading2"/>
+      </w:pPr>
+      <w:r>
+        <w:rPr>
+          <w:b/>
+        </w:rPr>
+        <w:t>Dec 2023 Q5: Bayesian P(C|E) -- Full Numerical Solution</w:t>
+      </w:r>
+    </w:p>
+    <w:p>
+      <w:r>
+        <w:rPr>
+          <w:b w:val="0"/>
+          <w:i w:val="0"/>
+        </w:rPr>
+        <w:t>Network: E-&gt;S, E-&gt;J, S-&gt;C, J-&gt;C. P(E)=0.3</w:t>
+      </w:r>
+    </w:p>
+    <w:p>
+      <w:r>
+        <w:rPr>
+          <w:b w:val="0"/>
+          <w:i w:val="0"/>
+        </w:rPr>
+        <w:t>P(S|E)=0.2, P(S|~E)=0.6, P(J|E)=0.8, P(J|~E)=0.1</w:t>
+      </w:r>
+    </w:p>
+    <w:p>
+      <w:r>
+        <w:rPr>
+          <w:b w:val="0"/>
+          <w:i w:val="0"/>
+        </w:rPr>
+        <w:t>P(C|J,S)=0.9, P(C|J,~S)=0.8, P(C|~J,S)=0.4, P(C|~J,~S)=0.1</w:t>
+      </w:r>
+    </w:p>
+    <w:p>
+      <w:r>
+        <w:rPr>
+          <w:b w:val="0"/>
+          <w:i w:val="0"/>
+        </w:rPr>
+        <w:t>P(C|E=True) -- causal inference:</w:t>
+      </w:r>
+    </w:p>
+    <w:p>
+      <w:r>
+        <w:rPr>
+          <w:b w:val="0"/>
+          <w:i w:val="0"/>
+        </w:rPr>
+        <w:t xml:space="preserve">  = P(J|E)*P(S|E)*0.9 + P(J|E)*P(~S|E)*0.8 + P(~J|E)*P(S|E)*0.4 + P(~J|E)*P(~S|E)*0.1</w:t>
+      </w:r>
+    </w:p>
+    <w:p>
+      <w:r>
+        <w:rPr>
+          <w:b w:val="0"/>
+          <w:i w:val="0"/>
+        </w:rPr>
+        <w:t xml:space="preserve">  = 0.8*0.2*0.9 + 0.8*0.8*0.8 + 0.2*0.2*0.4 + 0.2*0.8*0.1</w:t>
+      </w:r>
+    </w:p>
+    <w:p>
+      <w:r>
+        <w:rPr>
+          <w:b w:val="0"/>
+          <w:i w:val="0"/>
+        </w:rPr>
+        <w:t xml:space="preserve">  = 0.144 + 0.512 + 0.016 + 0.016 = 0.688</w:t>
+      </w:r>
+    </w:p>
+    <w:p>
+      <w:r>
+        <w:rPr>
+          <w:b w:val="0"/>
+          <w:i w:val="0"/>
+        </w:rPr>
+        <w:t>P(C|E=False):</w:t>
+      </w:r>
+    </w:p>
+    <w:p>
+      <w:r>
+        <w:rPr>
+          <w:b w:val="0"/>
+          <w:i w:val="0"/>
+        </w:rPr>
+        <w:t xml:space="preserve">  = 0.1*0.6*0.9 + 0.1*0.4*0.8 + 0.9*0.6*0.4 + 0.9*0.4*0.1</w:t>
+      </w:r>
+    </w:p>
+    <w:p>
+      <w:r>
+        <w:rPr>
+          <w:b w:val="0"/>
+          <w:i w:val="0"/>
+        </w:rPr>
+        <w:t xml:space="preserve">  = 0.054 + 0.032 + 0.216 + 0.036 = 0.338</w:t>
+      </w:r>
+    </w:p>
+    <w:p>
+      <w:r>
+        <w:rPr>
+          <w:b w:val="0"/>
+          <w:i w:val="0"/>
+        </w:rPr>
+        <w:t>P(C) = 0.688*0.3 + 0.338*0.7 = 0.2064+0.2366 = 0.4430</w:t>
+      </w:r>
+    </w:p>
+    <w:p>
+      <w:r>
+        <w:rPr>
+          <w:b w:val="0"/>
+          <w:i w:val="0"/>
+        </w:rPr>
+        <w:t>P(E|C) = 0.688*0.3/0.4430 = 0.2064/0.4430 = 0.4659</w:t>
+      </w:r>
+    </w:p>
+    <w:p>
+      <w:r>
+        <w:rPr>
+          <w:b/>
+          <w:i w:val="0"/>
+        </w:rPr>
+        <w:t>ANSWERS: P(C|E=True)=0.688  P(C|E=False)=0.338  P(C)=0.443  P(E|C)=0.466</w:t>
+      </w:r>
+    </w:p>
+    <w:p>
+      <w:pPr>
+        <w:pStyle w:val="Heading2"/>
+      </w:pPr>
+      <w:r>
+        <w:rPr>
+          <w:b/>
+        </w:rPr>
+        <w:t>Dec 2023 Q6: Decision Tree -- Full IG Computation (14 points, 5 features)</w:t>
+      </w:r>
+    </w:p>
+    <w:p>
+      <w:r>
+        <w:rPr>
+          <w:b w:val="0"/>
+          <w:i w:val="0"/>
+        </w:rPr>
+        <w:t>Dataset: 14 instances (D1-D14), 7 Cat=1 / 7 Cat=0. H(S)=1.0</w:t>
+      </w:r>
+    </w:p>
+    <w:tbl>
+      <w:tblPr>
+        <w:tblStyle w:val="TableGrid"/>
+        <w:tblW w:type="auto" w:w="0"/>
+        <w:tblLook w:firstColumn="1" w:firstRow="1" w:lastColumn="0" w:lastRow="0" w:noHBand="0" w:noVBand="1" w:val="04A0"/>
+      </w:tblPr>
+      <w:tblGrid>
+        <w:gridCol w:w="3400"/>
+        <w:gridCol w:w="3400"/>
+        <w:gridCol w:w="3400"/>
+      </w:tblGrid>
+      <w:tr>
+        <w:tc>
+          <w:tcPr>
+            <w:tcW w:type="dxa" w:w="3400"/>
+          </w:tcPr>
+          <w:p>
+            <w:r>
+              <w:rPr>
+                <w:b/>
+              </w:rPr>
+              <w:t>Feature</w:t>
+            </w:r>
+          </w:p>
+        </w:tc>
+        <w:tc>
+          <w:tcPr>
+            <w:tcW w:type="dxa" w:w="3400"/>
+          </w:tcPr>
+          <w:p>
+            <w:r>
+              <w:rPr>
+                <w:b/>
+              </w:rPr>
+              <w:t>Values and label counts</w:t>
+            </w:r>
+          </w:p>
+        </w:tc>
+        <w:tc>
+          <w:tcPr>
+            <w:tcW w:type="dxa" w:w="3400"/>
+          </w:tcPr>
+          <w:p>
+            <w:r>
+              <w:rPr>
+                <w:b/>
+              </w:rPr>
+              <w:t>IG</w:t>
+            </w:r>
+          </w:p>
+        </w:tc>
+      </w:tr>
+      <w:tr>
+        <w:tc>
+          <w:tcPr>
+            <w:tcW w:type="dxa" w:w="3400"/>
+          </w:tcPr>
+          <w:p>
+            <w:r>
+              <w:t>F1</w:t>
+            </w:r>
+          </w:p>
+        </w:tc>
+        <w:tc>
+          <w:tcPr>
+            <w:tcW w:type="dxa" w:w="3400"/>
+          </w:tcPr>
+          <w:p>
+            <w:r>
+              <w:t>F1=0: 1Y,2N(H=0.918) | F1=1: 2Y,2N(H=1.0) | F1=2: 4Y,3N(H=0.985)</w:t>
+            </w:r>
+          </w:p>
+        </w:tc>
+        <w:tc>
+          <w:tcPr>
+            <w:tcW w:type="dxa" w:w="3400"/>
+          </w:tcPr>
+          <w:p>
+            <w:r>
+              <w:t>0.025</w:t>
+            </w:r>
+          </w:p>
+        </w:tc>
+      </w:tr>
+      <w:tr>
+        <w:tc>
+          <w:tcPr>
+            <w:tcW w:type="dxa" w:w="3400"/>
+          </w:tcPr>
+          <w:p>
+            <w:r>
+              <w:t>F2</w:t>
+            </w:r>
+          </w:p>
+        </w:tc>
+        <w:tc>
+          <w:tcPr>
+            <w:tcW w:type="dxa" w:w="3400"/>
+          </w:tcPr>
+          <w:p>
+            <w:r>
+              <w:t>F2=0: 3Y,5N(H=0.954) | F2=1: 3Y,1N(H=0.811) | F2=2: 1Y,1N(H=1.0)</w:t>
+            </w:r>
+          </w:p>
+        </w:tc>
+        <w:tc>
+          <w:tcPr>
+            <w:tcW w:type="dxa" w:w="3400"/>
+          </w:tcPr>
+          <w:p>
+            <w:r>
+              <w:t>0.080</w:t>
+            </w:r>
+          </w:p>
+        </w:tc>
+      </w:tr>
+      <w:tr>
+        <w:tc>
+          <w:tcPr>
+            <w:tcW w:type="dxa" w:w="3400"/>
+          </w:tcPr>
+          <w:p>
+            <w:r>
+              <w:t>F3</w:t>
+            </w:r>
+          </w:p>
+        </w:tc>
+        <w:tc>
+          <w:tcPr>
+            <w:tcW w:type="dxa" w:w="3400"/>
+          </w:tcPr>
+          <w:p>
+            <w:r>
+              <w:t>F3=0: 2Y,2N(H=1.0) | F3=1: 4Y,4N(H=1.0) | F3=2: 1Y,1N(H=1.0)</w:t>
+            </w:r>
+          </w:p>
+        </w:tc>
+        <w:tc>
+          <w:tcPr>
+            <w:tcW w:type="dxa" w:w="3400"/>
+          </w:tcPr>
+          <w:p>
+            <w:r>
+              <w:t>0.000  USELESS</w:t>
+            </w:r>
+          </w:p>
+        </w:tc>
+      </w:tr>
+      <w:tr>
+        <w:tc>
+          <w:tcPr>
+            <w:tcW w:type="dxa" w:w="3400"/>
+          </w:tcPr>
+          <w:p>
+            <w:r>
+              <w:t>F4</w:t>
+            </w:r>
+          </w:p>
+        </w:tc>
+        <w:tc>
+          <w:tcPr>
+            <w:tcW w:type="dxa" w:w="3400"/>
+          </w:tcPr>
+          <w:p>
+            <w:r>
+              <w:t>F4=0: 2Y,0N(H=0,PURE) | F4=1: 1Y,3N(H=0.811) | F4=2: 2Y,1N(H=0.918) | F4=3: 2Y,3N(H=0.971)</w:t>
+            </w:r>
+          </w:p>
+        </w:tc>
+        <w:tc>
+          <w:tcPr>
+            <w:tcW w:type="dxa" w:w="3400"/>
+          </w:tcPr>
+          <w:p>
+            <w:r>
+              <w:t>0.2247  ROOT</w:t>
+            </w:r>
+          </w:p>
+        </w:tc>
+      </w:tr>
+      <w:tr>
+        <w:tc>
+          <w:tcPr>
+            <w:tcW w:type="dxa" w:w="3400"/>
+          </w:tcPr>
+          <w:p>
+            <w:r>
+              <w:t>F5</w:t>
+            </w:r>
+          </w:p>
+        </w:tc>
+        <w:tc>
+          <w:tcPr>
+            <w:tcW w:type="dxa" w:w="3400"/>
+          </w:tcPr>
+          <w:p>
+            <w:r>
+              <w:t>F5=0: 3Y,2N(H=0.971) | F5=1: 3Y,3N(H=1.0) | F5=2: 1Y,2N(H=0.918)</w:t>
+            </w:r>
+          </w:p>
+        </w:tc>
+        <w:tc>
+          <w:tcPr>
+            <w:tcW w:type="dxa" w:w="3400"/>
+          </w:tcPr>
+          <w:p>
+            <w:r>
+              <w:t>0.028</w:t>
+            </w:r>
+          </w:p>
+        </w:tc>
+      </w:tr>
+    </w:tbl>
+    <w:p>
+      <w:r>
+        <w:rPr>
+          <w:b w:val="0"/>
+          <w:i w:val="0"/>
+        </w:rPr>
+        <w:t>Root = F4 (IG=0.2247, highest). Tree branches:</w:t>
+      </w:r>
+    </w:p>
+    <w:p>
+      <w:r>
+        <w:rPr>
+          <w:b w:val="0"/>
+          <w:i w:val="0"/>
+        </w:rPr>
+        <w:t xml:space="preserve">  F4=0: D6,D7 -&gt; PURE Cat=1 (leaf)</w:t>
+      </w:r>
+    </w:p>
+    <w:p>
+      <w:r>
+        <w:rPr>
+          <w:b w:val="0"/>
+          <w:i w:val="0"/>
+        </w:rPr>
+        <w:t xml:space="preserve">  F4=1: D4,D9,D10,D13 (1Y,3N) -&gt; split on F3 (IG=0.811):</w:t>
+      </w:r>
+    </w:p>
+    <w:p>
+      <w:r>
+        <w:rPr>
+          <w:b w:val="0"/>
+          <w:i w:val="0"/>
+        </w:rPr>
+        <w:t xml:space="preserve">      F3=0 -&gt; D4: Cat=1 | F3=1 -&gt; D9,D13: Cat=0 | F3=2 -&gt; D10: Cat=0</w:t>
+      </w:r>
+    </w:p>
+    <w:p>
+      <w:r>
+        <w:rPr>
+          <w:b w:val="0"/>
+          <w:i w:val="0"/>
+        </w:rPr>
+        <w:t xml:space="preserve">  F4=2: D1,D5,D14 (2Y,1N) -&gt; split on F1 (IG=0.252, tied):</w:t>
+      </w:r>
+    </w:p>
+    <w:p>
+      <w:r>
+        <w:rPr>
+          <w:b w:val="0"/>
+          <w:i w:val="0"/>
+        </w:rPr>
+        <w:t xml:space="preserve">      F1=1 -&gt; D5: Cat=1 | F1=2 -&gt; D1,D14 (split further on F5: F5=0-&gt;Cat=1, F5=1-&gt;Cat=0)</w:t>
+      </w:r>
+    </w:p>
+    <w:p>
+      <w:r>
+        <w:rPr>
+          <w:b w:val="0"/>
+          <w:i w:val="0"/>
+        </w:rPr>
+        <w:t xml:space="preserve">  F4=3: D2,D3,D8,D11,D12 (2Y,3N) -&gt; split on F2 (IG=0.571):</w:t>
+      </w:r>
+    </w:p>
+    <w:p>
+      <w:r>
+        <w:rPr>
+          <w:b w:val="0"/>
+          <w:i w:val="0"/>
+        </w:rPr>
+        <w:t xml:space="preserve">      F2=0 -&gt; D8,D12: Cat=0 | F2=1 -&gt; D3: Cat=1 | F2=2 -&gt; D2,D11 (split on F3: F3=0-&gt;Cat=0, F3=1-&gt;Cat=1)</w:t>
+      </w:r>
+    </w:p>
+    <w:p>
+      <w:r>
+        <w:rPr>
+          <w:b w:val="0"/>
+          <w:i w:val="0"/>
+        </w:rPr>
+        <w:t>NOTE: F3 always has IG=0 at the ROOT level but can have high IG within subsets.</w:t>
       </w:r>
     </w:p>
     <w:sectPr>

</xml_diff>

<commit_message>
Round 5: fix all remaining gaps identified by full-read audit
Concept_Review: GA feature-selection chromosome encoding, Naive Bayes
DAG diagram (star topology, C->xi arrows), CNN three-layer precise
functions, CNN suitability discussion model answer, RNN numerical trace
(time steps 1-3 with hidden state), biological neuron scale (10B neurons,
60T connections).

Calculation_Steps: mini-batch iterations formula (N/B x epochs) with
worked example, single-neuron gradient descent complete trace (w1+w2+b
all updated), admissibility full numerical table for Dec 2016 Q3 graph
(all 7 nodes, tightest case B h=25 h*=26).

PastPaper_QuizSol: BFS search-tree drawing format (diagram guidance for
May 2025 Q16a and 8-puzzle), SA sign convention definitive resolution
(all three notations shown to give same P=e^{-|delta|/T}).

Co-Authored-By: Claude Sonnet 4.6 <noreply@anthropic.com>
</commit_message>
<xml_diff>
--- a/COMP4431_Calculation_Steps.docx
+++ b/COMP4431_Calculation_Steps.docx
@@ -18125,6 +18125,1531 @@
           <w:b w:val="0"/>
         </w:rPr>
         <w:t>P(E|C) = P(C|E)·P(E) / P(C) = 0.38 / 0.6513 = 0.58</w:t>
+      </w:r>
+    </w:p>
+    <w:p>
+      <w:r>
+        <w:t>──────────────────────────────────────────────────────────────────────</w:t>
+      </w:r>
+    </w:p>
+    <w:p>
+      <w:pPr>
+        <w:pStyle w:val="Heading1"/>
+      </w:pPr>
+      <w:r>
+        <w:t>GAP FIX 1: Lecture09 — Bayesian Network CPT Worked Example</w:t>
+      </w:r>
+    </w:p>
+    <w:p>
+      <w:r>
+        <w:rPr>
+          <w:b w:val="0"/>
+        </w:rPr>
+        <w:t>Source: Lecture092026.pdf, slide 12 (Bayesian Networks slide).</w:t>
+      </w:r>
+    </w:p>
+    <w:p>
+      <w:pPr>
+        <w:pStyle w:val="Heading2"/>
+      </w:pPr>
+      <w:r>
+        <w:t>Network Structure</w:t>
+      </w:r>
+    </w:p>
+    <w:p>
+      <w:r>
+        <w:rPr>
+          <w:b w:val="0"/>
+        </w:rPr>
+        <w:t>Nodes (top to bottom): E (Economic Environment) → S (Special Funding), E → J (Good Job), S + J → C (Promising Career).</w:t>
+      </w:r>
+    </w:p>
+    <w:p>
+      <w:pPr>
+        <w:pStyle w:val="Heading2"/>
+      </w:pPr>
+      <w:r>
+        <w:t>Prior Probabilities</w:t>
+      </w:r>
+    </w:p>
+    <w:p>
+      <w:pPr>
+        <w:pStyle w:val="ListBullet"/>
+        <w:ind w:left="0"/>
+      </w:pPr>
+      <w:r>
+        <w:t>P(E) = 0.5   (good economic condition)</w:t>
+      </w:r>
+    </w:p>
+    <w:p>
+      <w:pPr>
+        <w:pStyle w:val="ListBullet"/>
+        <w:ind w:left="0"/>
+      </w:pPr>
+      <w:r>
+        <w:t>P(S|E)  = 0.1,   P(S|~E) = 0.5</w:t>
+      </w:r>
+    </w:p>
+    <w:p>
+      <w:pPr>
+        <w:pStyle w:val="ListBullet"/>
+        <w:ind w:left="0"/>
+      </w:pPr>
+      <w:r>
+        <w:t>P(J|E)  = 0.8,   P(J|~E) = 0.1</w:t>
+      </w:r>
+    </w:p>
+    <w:p>
+      <w:pPr>
+        <w:pStyle w:val="Heading2"/>
+      </w:pPr>
+      <w:r>
+        <w:t>CPT for Promising Career C (given S and J)</w:t>
+      </w:r>
+    </w:p>
+    <w:tbl>
+      <w:tblPr>
+        <w:tblStyle w:val="TableGrid"/>
+        <w:tblW w:type="auto" w:w="0"/>
+        <w:tblLook w:firstColumn="1" w:firstRow="1" w:lastColumn="0" w:lastRow="0" w:noHBand="0" w:noVBand="1" w:val="04A0"/>
+      </w:tblPr>
+      <w:tblGrid>
+        <w:gridCol w:w="3400"/>
+        <w:gridCol w:w="3400"/>
+        <w:gridCol w:w="3400"/>
+      </w:tblGrid>
+      <w:tr>
+        <w:tc>
+          <w:tcPr>
+            <w:tcW w:type="dxa" w:w="3400"/>
+          </w:tcPr>
+          <w:p>
+            <w:r>
+              <w:t>J</w:t>
+            </w:r>
+          </w:p>
+        </w:tc>
+        <w:tc>
+          <w:tcPr>
+            <w:tcW w:type="dxa" w:w="3400"/>
+          </w:tcPr>
+          <w:p>
+            <w:r>
+              <w:t>S</w:t>
+            </w:r>
+          </w:p>
+        </w:tc>
+        <w:tc>
+          <w:tcPr>
+            <w:tcW w:type="dxa" w:w="3400"/>
+          </w:tcPr>
+          <w:p>
+            <w:r>
+              <w:t>P(C|J,S)</w:t>
+            </w:r>
+          </w:p>
+        </w:tc>
+      </w:tr>
+      <w:tr>
+        <w:tc>
+          <w:tcPr>
+            <w:tcW w:type="dxa" w:w="3400"/>
+          </w:tcPr>
+          <w:p>
+            <w:r>
+              <w:t>True</w:t>
+            </w:r>
+          </w:p>
+        </w:tc>
+        <w:tc>
+          <w:tcPr>
+            <w:tcW w:type="dxa" w:w="3400"/>
+          </w:tcPr>
+          <w:p>
+            <w:r>
+              <w:t>True</w:t>
+            </w:r>
+          </w:p>
+        </w:tc>
+        <w:tc>
+          <w:tcPr>
+            <w:tcW w:type="dxa" w:w="3400"/>
+          </w:tcPr>
+          <w:p>
+            <w:r>
+              <w:t>0.95</w:t>
+            </w:r>
+          </w:p>
+        </w:tc>
+      </w:tr>
+      <w:tr>
+        <w:tc>
+          <w:tcPr>
+            <w:tcW w:type="dxa" w:w="3400"/>
+          </w:tcPr>
+          <w:p>
+            <w:r>
+              <w:t>True</w:t>
+            </w:r>
+          </w:p>
+        </w:tc>
+        <w:tc>
+          <w:tcPr>
+            <w:tcW w:type="dxa" w:w="3400"/>
+          </w:tcPr>
+          <w:p>
+            <w:r>
+              <w:t>False</w:t>
+            </w:r>
+          </w:p>
+        </w:tc>
+        <w:tc>
+          <w:tcPr>
+            <w:tcW w:type="dxa" w:w="3400"/>
+          </w:tcPr>
+          <w:p>
+            <w:r>
+              <w:t>0.90</w:t>
+            </w:r>
+          </w:p>
+        </w:tc>
+      </w:tr>
+      <w:tr>
+        <w:tc>
+          <w:tcPr>
+            <w:tcW w:type="dxa" w:w="3400"/>
+          </w:tcPr>
+          <w:p>
+            <w:r>
+              <w:t>False</w:t>
+            </w:r>
+          </w:p>
+        </w:tc>
+        <w:tc>
+          <w:tcPr>
+            <w:tcW w:type="dxa" w:w="3400"/>
+          </w:tcPr>
+          <w:p>
+            <w:r>
+              <w:t>True</w:t>
+            </w:r>
+          </w:p>
+        </w:tc>
+        <w:tc>
+          <w:tcPr>
+            <w:tcW w:type="dxa" w:w="3400"/>
+          </w:tcPr>
+          <w:p>
+            <w:r>
+              <w:t>0.90</w:t>
+            </w:r>
+          </w:p>
+        </w:tc>
+      </w:tr>
+      <w:tr>
+        <w:tc>
+          <w:tcPr>
+            <w:tcW w:type="dxa" w:w="3400"/>
+          </w:tcPr>
+          <w:p>
+            <w:r>
+              <w:t>False</w:t>
+            </w:r>
+          </w:p>
+        </w:tc>
+        <w:tc>
+          <w:tcPr>
+            <w:tcW w:type="dxa" w:w="3400"/>
+          </w:tcPr>
+          <w:p>
+            <w:r>
+              <w:t>False</w:t>
+            </w:r>
+          </w:p>
+        </w:tc>
+        <w:tc>
+          <w:tcPr>
+            <w:tcW w:type="dxa" w:w="3400"/>
+          </w:tcPr>
+          <w:p>
+            <w:r>
+              <w:t>0.10</w:t>
+            </w:r>
+          </w:p>
+        </w:tc>
+      </w:tr>
+    </w:tbl>
+    <w:p>
+      <w:pPr>
+        <w:pStyle w:val="Heading2"/>
+      </w:pPr>
+      <w:r>
+        <w:t>Causal Inference: P(C | E=True) = 0.76</w:t>
+      </w:r>
+    </w:p>
+    <w:p>
+      <w:r>
+        <w:rPr>
+          <w:b w:val="0"/>
+        </w:rPr>
+        <w:t>We want P(C|E). We must marginalise over all combinations of S and J, given E is True.</w:t>
+      </w:r>
+    </w:p>
+    <w:p>
+      <w:r>
+        <w:rPr>
+          <w:b w:val="0"/>
+        </w:rPr>
+        <w:t>Step 1 — Compute conditional probabilities of S and J given E=True:</w:t>
+      </w:r>
+    </w:p>
+    <w:p>
+      <w:pPr>
+        <w:pStyle w:val="ListBullet"/>
+        <w:ind w:left="0"/>
+      </w:pPr>
+      <w:r>
+        <w:t>P(J|E=T) = 0.8,  P(~J|E=T) = 0.2</w:t>
+      </w:r>
+    </w:p>
+    <w:p>
+      <w:pPr>
+        <w:pStyle w:val="ListBullet"/>
+        <w:ind w:left="0"/>
+      </w:pPr>
+      <w:r>
+        <w:t>P(S|E=T) = 0.1,  P(~S|E=T) = 0.9</w:t>
+      </w:r>
+    </w:p>
+    <w:p>
+      <w:r>
+        <w:rPr>
+          <w:b w:val="0"/>
+        </w:rPr>
+        <w:t>Step 2 — Note: S and J are conditionally independent given E, so P(J,S|E) = P(J|E) × P(S|E).</w:t>
+      </w:r>
+    </w:p>
+    <w:p>
+      <w:r>
+        <w:rPr>
+          <w:b w:val="0"/>
+        </w:rPr>
+        <w:t>Step 3 — Sum over all four (J, S) combinations:</w:t>
+      </w:r>
+    </w:p>
+    <w:p>
+      <w:r>
+        <w:rPr>
+          <w:b w:val="0"/>
+        </w:rPr>
+        <w:t>P(C|E=T) = Σ_{j,s} P(C|J=j, S=s) × P(J=j|E=T) × P(S=s|E=T)</w:t>
+      </w:r>
+    </w:p>
+    <w:p>
+      <w:pPr>
+        <w:pStyle w:val="ListBullet"/>
+        <w:ind w:left="0"/>
+      </w:pPr>
+      <w:r>
+        <w:t>[J=T, S=T]  0.95 × 0.8 × 0.1  = 0.0760</w:t>
+      </w:r>
+    </w:p>
+    <w:p>
+      <w:pPr>
+        <w:pStyle w:val="ListBullet"/>
+        <w:ind w:left="0"/>
+      </w:pPr>
+      <w:r>
+        <w:t>[J=T, S=F]  0.90 × 0.8 × 0.9  = 0.6480</w:t>
+      </w:r>
+    </w:p>
+    <w:p>
+      <w:pPr>
+        <w:pStyle w:val="ListBullet"/>
+        <w:ind w:left="0"/>
+      </w:pPr>
+      <w:r>
+        <w:t>[J=F, S=T]  0.90 × 0.2 × 0.1  = 0.0180</w:t>
+      </w:r>
+    </w:p>
+    <w:p>
+      <w:pPr>
+        <w:pStyle w:val="ListBullet"/>
+        <w:ind w:left="0"/>
+      </w:pPr>
+      <w:r>
+        <w:t>[J=F, S=F]  0.10 × 0.2 × 0.9  = 0.0180</w:t>
+      </w:r>
+    </w:p>
+    <w:p>
+      <w:r>
+        <w:rPr>
+          <w:b/>
+        </w:rPr>
+        <w:t>P(C|E=T) = 0.0760 + 0.6480 + 0.0180 + 0.0180 = 0.7600</w:t>
+      </w:r>
+    </w:p>
+    <w:p>
+      <w:r>
+        <w:rPr>
+          <w:b w:val="0"/>
+        </w:rPr>
+        <w:t>Result: P(C|E=True) = 0.76  ✓ (matches slide 12)</w:t>
+      </w:r>
+    </w:p>
+    <w:p>
+      <w:pPr>
+        <w:pStyle w:val="Heading2"/>
+      </w:pPr>
+      <w:r>
+        <w:t>Diagnostic Inference: P(E | C=True) = 0.58</w:t>
+      </w:r>
+    </w:p>
+    <w:p>
+      <w:r>
+        <w:rPr>
+          <w:b w:val="0"/>
+        </w:rPr>
+        <w:t>Apply Bayes' rule:  P(E|C) = P(C|E) × P(E) / P(C)</w:t>
+      </w:r>
+    </w:p>
+    <w:p>
+      <w:r>
+        <w:rPr>
+          <w:b w:val="0"/>
+        </w:rPr>
+        <w:t>Step 1 — Compute P(C) by marginalising over E:</w:t>
+      </w:r>
+    </w:p>
+    <w:p>
+      <w:pPr>
+        <w:pStyle w:val="ListBullet"/>
+        <w:ind w:left="0"/>
+      </w:pPr>
+      <w:r>
+        <w:t>P(C|~E): compute similarly using P(J|~E)=0.1, P(S|~E)=0.5:</w:t>
+      </w:r>
+    </w:p>
+    <w:p>
+      <w:pPr>
+        <w:pStyle w:val="ListBullet"/>
+        <w:ind w:left="360"/>
+      </w:pPr>
+      <w:r>
+        <w:t xml:space="preserve">  [J=T, S=T]  0.95 × 0.1 × 0.5  = 0.0475</w:t>
+      </w:r>
+    </w:p>
+    <w:p>
+      <w:pPr>
+        <w:pStyle w:val="ListBullet"/>
+        <w:ind w:left="360"/>
+      </w:pPr>
+      <w:r>
+        <w:t xml:space="preserve">  [J=T, S=F]  0.90 × 0.1 × 0.5  = 0.0450</w:t>
+      </w:r>
+    </w:p>
+    <w:p>
+      <w:pPr>
+        <w:pStyle w:val="ListBullet"/>
+        <w:ind w:left="360"/>
+      </w:pPr>
+      <w:r>
+        <w:t xml:space="preserve">  [J=F, S=T]  0.90 × 0.9 × 0.5  = 0.4050</w:t>
+      </w:r>
+    </w:p>
+    <w:p>
+      <w:pPr>
+        <w:pStyle w:val="ListBullet"/>
+        <w:ind w:left="360"/>
+      </w:pPr>
+      <w:r>
+        <w:t xml:space="preserve">  [J=F, S=F]  0.10 × 0.9 × 0.5  = 0.0450</w:t>
+      </w:r>
+    </w:p>
+    <w:p>
+      <w:pPr>
+        <w:pStyle w:val="ListBullet"/>
+        <w:ind w:left="0"/>
+      </w:pPr>
+      <w:r>
+        <w:t>P(C|~E) = 0.0475 + 0.0450 + 0.4050 + 0.0450 = 0.5425</w:t>
+      </w:r>
+    </w:p>
+    <w:p>
+      <w:r>
+        <w:rPr>
+          <w:b w:val="0"/>
+        </w:rPr>
+        <w:t>Step 2 — Total probability of C:</w:t>
+      </w:r>
+    </w:p>
+    <w:p>
+      <w:r>
+        <w:rPr>
+          <w:b w:val="0"/>
+        </w:rPr>
+        <w:t>P(C) = P(C|E)×P(E) + P(C|~E)×P(~E)</w:t>
+        <w:br/>
+        <w:t xml:space="preserve">     = 0.76×0.5 + 0.5425×0.5</w:t>
+        <w:br/>
+        <w:t xml:space="preserve">     = 0.38 + 0.27125 = 0.65125</w:t>
+      </w:r>
+    </w:p>
+    <w:p>
+      <w:r>
+        <w:rPr>
+          <w:b w:val="0"/>
+        </w:rPr>
+        <w:t>Step 3 — Apply Bayes' rule:</w:t>
+      </w:r>
+    </w:p>
+    <w:p>
+      <w:r>
+        <w:rPr>
+          <w:b w:val="0"/>
+        </w:rPr>
+        <w:t>P(E|C) = P(C|E)×P(E) / P(C) = 0.38 / 0.65125 ≈ 0.5834</w:t>
+      </w:r>
+    </w:p>
+    <w:p>
+      <w:r>
+        <w:rPr>
+          <w:b/>
+        </w:rPr>
+        <w:t>Rounded to 2 d.p.: P(E|C) ≈ 0.58  ✓ (matches slide 12)</w:t>
+      </w:r>
+    </w:p>
+    <w:p>
+      <w:r>
+        <w:t>──────────────────────────────────────────────────────────────────────</w:t>
+      </w:r>
+    </w:p>
+    <w:p>
+      <w:pPr>
+        <w:pStyle w:val="Heading1"/>
+      </w:pPr>
+      <w:r>
+        <w:t>GAP FIX 3: Dec 2022 (2022/2023 Sem I) Q3.1 — BFS 8-Puzzle Child States</w:t>
+      </w:r>
+    </w:p>
+    <w:p>
+      <w:r>
+        <w:t>Source: 2023-08-17_20.pdf — COMP4431 exam dated 02 December 2022, Q3.</w:t>
+      </w:r>
+    </w:p>
+    <w:p>
+      <w:r>
+        <w:t>Problem Setup</w:t>
+      </w:r>
+    </w:p>
+    <w:p>
+      <w:r>
+        <w:t>Start state Figure 1(b) — blank at position (row=1, col=1), 0-indexed:</w:t>
+      </w:r>
+    </w:p>
+    <w:p>
+      <w:r>
+        <w:t>[ 1 | 4 | 2 ]</w:t>
+      </w:r>
+    </w:p>
+    <w:p>
+      <w:r>
+        <w:t>[ 3 | _ | 5 ]   &lt;- blank here (centre)</w:t>
+      </w:r>
+    </w:p>
+    <w:p>
+      <w:r>
+        <w:t>[ 6 | 7 | 8 ]</w:t>
+      </w:r>
+    </w:p>
+    <w:p>
+      <w:r>
+        <w:t>Goal state Figure 1(a):</w:t>
+      </w:r>
+    </w:p>
+    <w:p>
+      <w:r>
+        <w:t>[ _ | 1 | 2 ]</w:t>
+      </w:r>
+    </w:p>
+    <w:p>
+      <w:r>
+        <w:t>[ 3 | 4 | 5 ]</w:t>
+      </w:r>
+    </w:p>
+    <w:p>
+      <w:r>
+        <w:t>[ 6 | 7 | 8 ]</w:t>
+      </w:r>
+    </w:p>
+    <w:p>
+      <w:r>
+        <w:t>BFS Level 0 — Root</w:t>
+      </w:r>
+    </w:p>
+    <w:p>
+      <w:r>
+        <w:t>State: [1,4,2 / 3,_,5 / 6,7,8]</w:t>
+      </w:r>
+    </w:p>
+    <w:p>
+      <w:r>
+        <w:t>BFS Level 1 — Four Child States (blank moves U/D/L/R)</w:t>
+      </w:r>
+    </w:p>
+    <w:p>
+      <w:r>
+        <w:t>The blank is at (row=1, col=1). It can slide in 4 directions by swapping with the adjacent tile:</w:t>
+      </w:r>
+    </w:p>
+    <w:p>
+      <w:r>
+        <w:t>Move U (slide tile 4 down into blank): [ 1 | _ | 2 ] / [ 3 | 4 | 5 ] / [ 6 | 7 | 8 ]</w:t>
+      </w:r>
+    </w:p>
+    <w:p>
+      <w:r>
+        <w:t>   -&gt; NOT the goal. Goal has blank at (0,0); after MoveU blank is at (0,1). Continue expanding.</w:t>
+      </w:r>
+    </w:p>
+    <w:p>
+      <w:r>
+        <w:t>Move D (slide tile 7 up into blank):   [ 1 | 4 | 2 ] / [ 3 | 7 | 5 ] / [ 6 | _ | 8 ]</w:t>
+      </w:r>
+    </w:p>
+    <w:p>
+      <w:r>
+        <w:t>Move L (slide tile 3 right into blank):[ 1 | 4 | 2 ] / [ _ | 3 | 5 ] / [ 6 | 7 | 8 ]</w:t>
+      </w:r>
+    </w:p>
+    <w:p>
+      <w:r>
+        <w:t>Move R (slide tile 5 left into blank): [ 1 | 4 | 2 ] / [ 3 | 5 | _ ] / [ 6 | 7 | 8 ]</w:t>
+      </w:r>
+    </w:p>
+    <w:p>
+      <w:r>
+        <w:t>BFS queue after Level 1 (FIFO order): [MoveU-state, MoveD-state, MoveL-state, MoveR-state]</w:t>
+      </w:r>
+    </w:p>
+    <w:p>
+      <w:r>
+        <w:t>BFS Level 2 — Expand MoveU-state [1,_,2 / 3,4,5 / 6,7,8] (blank at row=0, col=1)</w:t>
+      </w:r>
+    </w:p>
+    <w:p>
+      <w:r>
+        <w:t>   Move U: invalid (blank already at top row)</w:t>
+      </w:r>
+    </w:p>
+    <w:p>
+      <w:r>
+        <w:t>   Move D: [1,4,2 / 3,_,5 / 6,7,8] — visited (start), skip</w:t>
+      </w:r>
+    </w:p>
+    <w:p>
+      <w:r>
+        <w:t>   Move L: [_,1,2 / 3,4,5 / 6,7,8] — THIS IS THE GOAL STATE!</w:t>
+      </w:r>
+    </w:p>
+    <w:p>
+      <w:r>
+        <w:t>   Move R: [1,2,_ / 3,4,5 / 6,7,8] — not goal</w:t>
+      </w:r>
+    </w:p>
+    <w:p>
+      <w:r>
+        <w:t>BFS Solution: Found at depth 2.</w:t>
+      </w:r>
+    </w:p>
+    <w:p>
+      <w:r>
+        <w:t>Solution path: Start -&gt; MoveU -&gt; MoveL -&gt; Goal</w:t>
+      </w:r>
+    </w:p>
+    <w:p>
+      <w:r>
+        <w:t>  Step 1 (Move U): blank moves from (1,1) to (0,1); tile 4 slides down.</w:t>
+      </w:r>
+    </w:p>
+    <w:p>
+      <w:r>
+        <w:t>    [1,4,2/3,_,5/6,7,8]  =&gt;  [1,_,2/3,4,5/6,7,8]</w:t>
+      </w:r>
+    </w:p>
+    <w:p>
+      <w:r>
+        <w:t>  Step 2 (Move L): blank moves from (0,1) to (0,0); tile 1 slides right.</w:t>
+      </w:r>
+    </w:p>
+    <w:p>
+      <w:r>
+        <w:t>    [1,_,2/3,4,5/6,7,8]  =&gt;  [_,1,2/3,4,5/6,7,8]  (= goal)</w:t>
+      </w:r>
+    </w:p>
+    <w:p>
+      <w:r>
+        <w:t>CORRECTION of previous fix agent error: The previous fix stated 'Move U immediately produces</w:t>
+      </w:r>
+    </w:p>
+    <w:p>
+      <w:r>
+        <w:t>the goal state (depth 1)'. This is incorrect. After Move U the state is [1,_,2/3,4,5/6,7,8],</w:t>
+      </w:r>
+    </w:p>
+    <w:p>
+      <w:r>
+        <w:t>which has the blank at (row=0, col=1). The goal requires the blank at (row=0, col=0). One</w:t>
+      </w:r>
+    </w:p>
+    <w:p>
+      <w:r>
+        <w:t>further move L (tile 1 slides right) is needed. BFS finds the solution at depth 2, not depth 1.</w:t>
+      </w:r>
+    </w:p>
+    <w:p>
+      <w:r>
+        <w:t>Full BFS expansion order (with visited set to avoid revisiting):</w:t>
+      </w:r>
+    </w:p>
+    <w:p>
+      <w:r>
+        <w:t>Expand root: generate U,D,L,R children -&gt; queue: [U,D,L,R]</w:t>
+      </w:r>
+    </w:p>
+    <w:p>
+      <w:r>
+        <w:t>Expand U-child [1,_,2/3,4,5/6,7,8]: generate L-child = goal -&gt; FOUND at depth 2.</w:t>
+      </w:r>
+    </w:p>
+    <w:p/>
+    <w:p>
+      <w:r>
+        <w:rPr>
+          <w:b w:val="0"/>
+          <w:sz w:val="20"/>
+        </w:rPr>
+        <w:t>──────────────────────────────────────────────────────────────────────</w:t>
+      </w:r>
+    </w:p>
+    <w:p>
+      <w:r>
+        <w:rPr>
+          <w:b/>
+          <w:sz w:val="24"/>
+        </w:rPr>
+        <w:t>ROUND 5 — GAP FIXES: Remaining Missing Calculations</w:t>
+      </w:r>
+    </w:p>
+    <w:p>
+      <w:r>
+        <w:rPr>
+          <w:b w:val="0"/>
+          <w:sz w:val="20"/>
+        </w:rPr>
+        <w:t>──────────────────────────────────────────────────────────────────────</w:t>
+      </w:r>
+    </w:p>
+    <w:p>
+      <w:r>
+        <w:rPr>
+          <w:b/>
+          <w:sz w:val="22"/>
+        </w:rPr>
+        <w:t>12. Mini-Batch Gradient Descent: Batch / Epoch / Iteration Formula</w:t>
+      </w:r>
+    </w:p>
+    <w:p>
+      <w:r>
+        <w:rPr>
+          <w:b w:val="0"/>
+          <w:sz w:val="20"/>
+        </w:rPr>
+        <w:t>DEFINITIONS:</w:t>
+      </w:r>
+    </w:p>
+    <w:p>
+      <w:pPr>
+        <w:ind w:left="400"/>
+      </w:pPr>
+      <w:r>
+        <w:rPr>
+          <w:b w:val="0"/>
+          <w:sz w:val="20"/>
+        </w:rPr>
+        <w:t xml:space="preserve">  N         = total number of training samples (dataset size)</w:t>
+      </w:r>
+    </w:p>
+    <w:p>
+      <w:pPr>
+        <w:ind w:left="400"/>
+      </w:pPr>
+      <w:r>
+        <w:rPr>
+          <w:b w:val="0"/>
+          <w:sz w:val="20"/>
+        </w:rPr>
+        <w:t xml:space="preserve">  Batch size B = number of samples processed in ONE forward+backward pass (one weight update)</w:t>
+      </w:r>
+    </w:p>
+    <w:p>
+      <w:pPr>
+        <w:ind w:left="400"/>
+      </w:pPr>
+      <w:r>
+        <w:rPr>
+          <w:b w:val="0"/>
+          <w:sz w:val="20"/>
+        </w:rPr>
+        <w:t xml:space="preserve">  Iteration = one weight update step using one batch of B samples</w:t>
+      </w:r>
+    </w:p>
+    <w:p>
+      <w:pPr>
+        <w:ind w:left="400"/>
+      </w:pPr>
+      <w:r>
+        <w:rPr>
+          <w:b w:val="0"/>
+          <w:sz w:val="20"/>
+        </w:rPr>
+        <w:t xml:space="preserve">  Epoch     = one COMPLETE pass through all N training samples</w:t>
+      </w:r>
+    </w:p>
+    <w:p/>
+    <w:p>
+      <w:r>
+        <w:rPr>
+          <w:b w:val="0"/>
+          <w:sz w:val="20"/>
+        </w:rPr>
+        <w:t>FORMULA:</w:t>
+      </w:r>
+    </w:p>
+    <w:p>
+      <w:pPr>
+        <w:ind w:left="400"/>
+      </w:pPr>
+      <w:r>
+        <w:rPr>
+          <w:b w:val="0"/>
+          <w:sz w:val="20"/>
+        </w:rPr>
+        <w:t xml:space="preserve">  Iterations per epoch  = N / B</w:t>
+      </w:r>
+    </w:p>
+    <w:p>
+      <w:pPr>
+        <w:ind w:left="400"/>
+      </w:pPr>
+      <w:r>
+        <w:rPr>
+          <w:b w:val="0"/>
+          <w:sz w:val="20"/>
+        </w:rPr>
+        <w:t xml:space="preserve">  Total iterations      = (N / B) x number_of_epochs</w:t>
+      </w:r>
+    </w:p>
+    <w:p/>
+    <w:p>
+      <w:r>
+        <w:rPr>
+          <w:b w:val="0"/>
+          <w:sz w:val="20"/>
+        </w:rPr>
+        <w:t>WORKED EXAMPLE (May 2025 Q17b — 5 marks):</w:t>
+      </w:r>
+    </w:p>
+    <w:p>
+      <w:pPr>
+        <w:ind w:left="400"/>
+      </w:pPr>
+      <w:r>
+        <w:rPr>
+          <w:b w:val="0"/>
+          <w:sz w:val="20"/>
+        </w:rPr>
+        <w:t xml:space="preserve">  N = 1000,  batch size B = 50,  epochs = 200</w:t>
+      </w:r>
+    </w:p>
+    <w:p>
+      <w:pPr>
+        <w:ind w:left="400"/>
+      </w:pPr>
+      <w:r>
+        <w:rPr>
+          <w:b w:val="0"/>
+          <w:sz w:val="20"/>
+        </w:rPr>
+        <w:t xml:space="preserve">  Iterations per epoch = 1000 / 50 = 20</w:t>
+      </w:r>
+    </w:p>
+    <w:p>
+      <w:pPr>
+        <w:ind w:left="400"/>
+      </w:pPr>
+      <w:r>
+        <w:rPr>
+          <w:b w:val="0"/>
+          <w:sz w:val="20"/>
+        </w:rPr>
+        <w:t xml:space="preserve">  Total iterations = 20 x 200 = 4000</w:t>
+      </w:r>
+    </w:p>
+    <w:p/>
+    <w:p>
+      <w:r>
+        <w:rPr>
+          <w:b w:val="0"/>
+          <w:sz w:val="20"/>
+        </w:rPr>
+        <w:t>COMPARISON:</w:t>
+      </w:r>
+    </w:p>
+    <w:p>
+      <w:pPr>
+        <w:ind w:left="400"/>
+      </w:pPr>
+      <w:r>
+        <w:rPr>
+          <w:b w:val="0"/>
+          <w:sz w:val="20"/>
+        </w:rPr>
+        <w:t xml:space="preserve">  Batch GD     (B = N):     1 iteration per epoch; stable but slow; uses all data at once.</w:t>
+      </w:r>
+    </w:p>
+    <w:p>
+      <w:pPr>
+        <w:ind w:left="400"/>
+      </w:pPr>
+      <w:r>
+        <w:rPr>
+          <w:b w:val="0"/>
+          <w:sz w:val="20"/>
+        </w:rPr>
+        <w:t xml:space="preserve">  Mini-batch GD (1&lt;B&lt;N):    N/B iterations per epoch; balance of speed and stability.</w:t>
+      </w:r>
+    </w:p>
+    <w:p>
+      <w:pPr>
+        <w:ind w:left="400"/>
+      </w:pPr>
+      <w:r>
+        <w:rPr>
+          <w:b w:val="0"/>
+          <w:sz w:val="20"/>
+        </w:rPr>
+        <w:t xml:space="preserve">  Stochastic GD (B = 1):    N iterations per epoch; noisy but fast; can escape local optima.</w:t>
+      </w:r>
+    </w:p>
+    <w:p/>
+    <w:p>
+      <w:r>
+        <w:rPr>
+          <w:b w:val="0"/>
+          <w:sz w:val="20"/>
+        </w:rPr>
+        <w:t>EXAM TIP: 'iteration' != 'epoch'.  One epoch = N/B iterations.  Multiple epochs mean the</w:t>
+      </w:r>
+    </w:p>
+    <w:p>
+      <w:r>
+        <w:rPr>
+          <w:b w:val="0"/>
+          <w:sz w:val="20"/>
+        </w:rPr>
+        <w:t>same data is seen multiple times, each time reshuffled into new mini-batches.</w:t>
+      </w:r>
+    </w:p>
+    <w:p/>
+    <w:p>
+      <w:r>
+        <w:rPr>
+          <w:b/>
+          <w:sz w:val="22"/>
+        </w:rPr>
+        <w:t>13. Single-Neuron Gradient Descent: COMPLETE Worked Example (w1 + w2 + b)</w:t>
+      </w:r>
+    </w:p>
+    <w:p>
+      <w:r>
+        <w:rPr>
+          <w:b w:val="0"/>
+          <w:sz w:val="20"/>
+        </w:rPr>
+        <w:t>Formula (given in exam): dE/dw_i = (A - Y) * sigma(s) * (1 - sigma(s)) * x_i</w:t>
+      </w:r>
+    </w:p>
+    <w:p>
+      <w:r>
+        <w:rPr>
+          <w:b w:val="0"/>
+          <w:sz w:val="20"/>
+        </w:rPr>
+        <w:t>Update rule:             w_i_new = w_i - rate * dE/dw_i    [note: SUBTRACT the gradient]</w:t>
+      </w:r>
+    </w:p>
+    <w:p>
+      <w:r>
+        <w:rPr>
+          <w:b w:val="0"/>
+          <w:sz w:val="20"/>
+        </w:rPr>
+        <w:t>Bias update:             b_new   = b   - rate * (A-Y)*sigma(s)*(1-sigma(s))*1</w:t>
+      </w:r>
+    </w:p>
+    <w:p/>
+    <w:p>
+      <w:r>
+        <w:rPr>
+          <w:b w:val="0"/>
+          <w:sz w:val="20"/>
+        </w:rPr>
+        <w:t>WORKED EXAMPLE (May 2025 Q17a — 15 marks):</w:t>
+      </w:r>
+    </w:p>
+    <w:p>
+      <w:pPr>
+        <w:ind w:left="400"/>
+      </w:pPr>
+      <w:r>
+        <w:rPr>
+          <w:b w:val="0"/>
+          <w:sz w:val="20"/>
+        </w:rPr>
+        <w:t xml:space="preserve">  Given: w1=0.1, w2=0.1, b=0.1, x1=8, x2=4, Y=3, learning rate=0.1</w:t>
+      </w:r>
+    </w:p>
+    <w:p/>
+    <w:p>
+      <w:pPr>
+        <w:ind w:left="400"/>
+      </w:pPr>
+      <w:r>
+        <w:rPr>
+          <w:b w:val="0"/>
+          <w:sz w:val="20"/>
+        </w:rPr>
+        <w:t xml:space="preserve">  STEP 1 — Forward pass:</w:t>
+      </w:r>
+    </w:p>
+    <w:p>
+      <w:pPr>
+        <w:ind w:left="400"/>
+      </w:pPr>
+      <w:r>
+        <w:rPr>
+          <w:b w:val="0"/>
+          <w:sz w:val="20"/>
+        </w:rPr>
+        <w:t xml:space="preserve">    s = w1*x1 + w2*x2 + b = 0.1*8 + 0.1*4 + 0.1 = 0.8 + 0.4 + 0.1 = 1.3</w:t>
+      </w:r>
+    </w:p>
+    <w:p>
+      <w:pPr>
+        <w:ind w:left="400"/>
+      </w:pPr>
+      <w:r>
+        <w:rPr>
+          <w:b w:val="0"/>
+          <w:sz w:val="20"/>
+        </w:rPr>
+        <w:t xml:space="preserve">    A = sigma(1.3) = 1 / (1 + e^{-1.3}) = 1 / (1 + 0.2725) = 0.7858</w:t>
+      </w:r>
+    </w:p>
+    <w:p/>
+    <w:p>
+      <w:pPr>
+        <w:ind w:left="400"/>
+      </w:pPr>
+      <w:r>
+        <w:rPr>
+          <w:b w:val="0"/>
+          <w:sz w:val="20"/>
+        </w:rPr>
+        <w:t xml:space="preserve">  STEP 2 — Common factor (compute once, reuse for all gradients):</w:t>
+      </w:r>
+    </w:p>
+    <w:p>
+      <w:pPr>
+        <w:ind w:left="400"/>
+      </w:pPr>
+      <w:r>
+        <w:rPr>
+          <w:b w:val="0"/>
+          <w:sz w:val="20"/>
+        </w:rPr>
+        <w:t xml:space="preserve">    (A - Y)         = 0.7858 - 3 = -2.2142</w:t>
+      </w:r>
+    </w:p>
+    <w:p>
+      <w:pPr>
+        <w:ind w:left="400"/>
+      </w:pPr>
+      <w:r>
+        <w:rPr>
+          <w:b w:val="0"/>
+          <w:sz w:val="20"/>
+        </w:rPr>
+        <w:t xml:space="preserve">    sigma'(s)       = A*(1-A)    = 0.7858 * 0.2142 = 0.1683</w:t>
+      </w:r>
+    </w:p>
+    <w:p>
+      <w:pPr>
+        <w:ind w:left="400"/>
+      </w:pPr>
+      <w:r>
+        <w:rPr>
+          <w:b w:val="0"/>
+          <w:sz w:val="20"/>
+        </w:rPr>
+        <w:t xml:space="preserve">    common factor C = (A-Y) * sigma'(s) = -2.2142 * 0.1683 = -0.3727</w:t>
+      </w:r>
+    </w:p>
+    <w:p/>
+    <w:p>
+      <w:pPr>
+        <w:ind w:left="400"/>
+      </w:pPr>
+      <w:r>
+        <w:rPr>
+          <w:b w:val="0"/>
+          <w:sz w:val="20"/>
+        </w:rPr>
+        <w:t xml:space="preserve">  STEP 3 — Gradients (multiply common factor by each input):</w:t>
+      </w:r>
+    </w:p>
+    <w:p>
+      <w:pPr>
+        <w:ind w:left="400"/>
+      </w:pPr>
+      <w:r>
+        <w:rPr>
+          <w:b w:val="0"/>
+          <w:sz w:val="20"/>
+        </w:rPr>
+        <w:t xml:space="preserve">    dE/dw1 = C * x1 = -0.3727 * 8 = -2.9816</w:t>
+      </w:r>
+    </w:p>
+    <w:p>
+      <w:pPr>
+        <w:ind w:left="400"/>
+      </w:pPr>
+      <w:r>
+        <w:rPr>
+          <w:b w:val="0"/>
+          <w:sz w:val="20"/>
+        </w:rPr>
+        <w:t xml:space="preserve">    dE/dw2 = C * x2 = -0.3727 * 4 = -1.4908</w:t>
+      </w:r>
+    </w:p>
+    <w:p>
+      <w:pPr>
+        <w:ind w:left="400"/>
+      </w:pPr>
+      <w:r>
+        <w:rPr>
+          <w:b w:val="0"/>
+          <w:sz w:val="20"/>
+        </w:rPr>
+        <w:t xml:space="preserve">    dE/db  = C * 1  = -0.3727 * 1 = -0.3727   (bias input is always 1)</w:t>
+      </w:r>
+    </w:p>
+    <w:p/>
+    <w:p>
+      <w:pPr>
+        <w:ind w:left="400"/>
+      </w:pPr>
+      <w:r>
+        <w:rPr>
+          <w:b w:val="0"/>
+          <w:sz w:val="20"/>
+        </w:rPr>
+        <w:t xml:space="preserve">  STEP 4 — Weight updates (w_new = w_old - rate * gradient):</w:t>
+      </w:r>
+    </w:p>
+    <w:p>
+      <w:pPr>
+        <w:ind w:left="400"/>
+      </w:pPr>
+      <w:r>
+        <w:rPr>
+          <w:b w:val="0"/>
+          <w:sz w:val="20"/>
+        </w:rPr>
+        <w:t xml:space="preserve">    w1_new = 0.1 - 0.1 * (-2.9816) = 0.1 + 0.2982 = 0.3982</w:t>
+      </w:r>
+    </w:p>
+    <w:p>
+      <w:pPr>
+        <w:ind w:left="400"/>
+      </w:pPr>
+      <w:r>
+        <w:rPr>
+          <w:b w:val="0"/>
+          <w:sz w:val="20"/>
+        </w:rPr>
+        <w:t xml:space="preserve">    w2_new = 0.1 - 0.1 * (-1.4908) = 0.1 + 0.1491 = 0.2491</w:t>
+      </w:r>
+    </w:p>
+    <w:p>
+      <w:pPr>
+        <w:ind w:left="400"/>
+      </w:pPr>
+      <w:r>
+        <w:rPr>
+          <w:b w:val="0"/>
+          <w:sz w:val="20"/>
+        </w:rPr>
+        <w:t xml:space="preserve">    b_new  = 0.1 - 0.1 * (-0.3727) = 0.1 + 0.0373 = 0.1373</w:t>
+      </w:r>
+    </w:p>
+    <w:p/>
+    <w:p>
+      <w:r>
+        <w:rPr>
+          <w:b w:val="0"/>
+          <w:sz w:val="20"/>
+        </w:rPr>
+        <w:t>CRITICAL NOTES:</w:t>
+      </w:r>
+    </w:p>
+    <w:p>
+      <w:pPr>
+        <w:ind w:left="400"/>
+      </w:pPr>
+      <w:r>
+        <w:rPr>
+          <w:b w:val="0"/>
+          <w:sz w:val="20"/>
+        </w:rPr>
+        <w:t xml:space="preserve">  (a) The gradient is SUBTRACTED (gradient descent MINIMISES the error E).</w:t>
+      </w:r>
+    </w:p>
+    <w:p>
+      <w:pPr>
+        <w:ind w:left="400"/>
+      </w:pPr>
+      <w:r>
+        <w:rPr>
+          <w:b w:val="0"/>
+          <w:sz w:val="20"/>
+        </w:rPr>
+        <w:t xml:space="preserve">  (b) sigma'(s) = A*(1-A) — use this; do NOT recompute e^{-s} for the derivative.</w:t>
+      </w:r>
+    </w:p>
+    <w:p>
+      <w:pPr>
+        <w:ind w:left="400"/>
+      </w:pPr>
+      <w:r>
+        <w:rPr>
+          <w:b w:val="0"/>
+          <w:sz w:val="20"/>
+        </w:rPr>
+        <w:t xml:space="preserve">  (c) Compute the 'common factor' once to avoid repeated arithmetic — saves time in exam.</w:t>
+      </w:r>
+    </w:p>
+    <w:p>
+      <w:pPr>
+        <w:ind w:left="400"/>
+      </w:pPr>
+      <w:r>
+        <w:rPr>
+          <w:b w:val="0"/>
+          <w:sz w:val="20"/>
+        </w:rPr>
+        <w:t xml:space="preserve">  (d) All three weights (w1, w2, b) get updated using the SAME A and sigma'(s).</w:t>
+      </w:r>
+    </w:p>
+    <w:p>
+      <w:pPr>
+        <w:ind w:left="400"/>
+      </w:pPr>
+      <w:r>
+        <w:rPr>
+          <w:b w:val="0"/>
+          <w:sz w:val="20"/>
+        </w:rPr>
+        <w:t xml:space="preserve">  (e) Round intermediate values to 4 d.p. throughout unless the question says otherwise.</w:t>
+      </w:r>
+    </w:p>
+    <w:p/>
+    <w:p>
+      <w:r>
+        <w:rPr>
+          <w:b w:val="0"/>
+          <w:sz w:val="20"/>
+        </w:rPr>
+        <w:t>CONTRAST with MLP backprop:</w:t>
+      </w:r>
+    </w:p>
+    <w:p>
+      <w:pPr>
+        <w:ind w:left="400"/>
+      </w:pPr>
+      <w:r>
+        <w:rPr>
+          <w:b w:val="0"/>
+          <w:sz w:val="20"/>
+        </w:rPr>
+        <w:t xml:space="preserve">  Single neuron above has no hidden layer — gradient is computed directly from output error.</w:t>
+      </w:r>
+    </w:p>
+    <w:p>
+      <w:pPr>
+        <w:ind w:left="400"/>
+      </w:pPr>
+      <w:r>
+        <w:rPr>
+          <w:b w:val="0"/>
+          <w:sz w:val="20"/>
+        </w:rPr>
+        <w:t xml:space="preserve">  In MLP, hidden-layer deltas require the chain rule through the output layer first.</w:t>
+      </w:r>
+    </w:p>
+    <w:p/>
+    <w:p>
+      <w:r>
+        <w:rPr>
+          <w:b/>
+          <w:sz w:val="22"/>
+        </w:rPr>
+        <w:t>14. Admissibility Check: Full Numerical Table (Dec 2016 Q3.6 — 4 marks)</w:t>
+      </w:r>
+    </w:p>
+    <w:p>
+      <w:r>
+        <w:rPr>
+          <w:b w:val="0"/>
+          <w:sz w:val="20"/>
+        </w:rPr>
+        <w:t>GRAPH (Dec 2016 Q3, verified from paper):</w:t>
+      </w:r>
+    </w:p>
+    <w:p>
+      <w:pPr>
+        <w:ind w:left="400"/>
+      </w:pPr>
+      <w:r>
+        <w:rPr>
+          <w:b w:val="0"/>
+          <w:sz w:val="20"/>
+        </w:rPr>
+        <w:t xml:space="preserve">  Edges: B-C=6, B-A=11, C-E=10, C-F=9, C-D=20, E-D=3, D-G=7</w:t>
+      </w:r>
+    </w:p>
+    <w:p>
+      <w:pPr>
+        <w:ind w:left="400"/>
+      </w:pPr>
+      <w:r>
+        <w:rPr>
+          <w:b w:val="0"/>
+          <w:sz w:val="20"/>
+        </w:rPr>
+        <w:t xml:space="preserve">  Goal node: G.  Start node: B (for this admissibility question, verify ALL nodes).</w:t>
+      </w:r>
+    </w:p>
+    <w:p/>
+    <w:p>
+      <w:r>
+        <w:rPr>
+          <w:b w:val="0"/>
+          <w:sz w:val="20"/>
+        </w:rPr>
+        <w:t>HEURISTIC VALUES (given): A=30, B=25, C=15, D=5, E=10, F=20, G=0</w:t>
+      </w:r>
+    </w:p>
+    <w:p/>
+    <w:p>
+      <w:r>
+        <w:rPr>
+          <w:b w:val="0"/>
+          <w:sz w:val="20"/>
+        </w:rPr>
+        <w:t>METHOD: For each node n, find the TRUE SHORTEST PATH from n to G (h*(n)) using UCS.</w:t>
+      </w:r>
+    </w:p>
+    <w:p>
+      <w:pPr>
+        <w:ind w:left="400"/>
+      </w:pPr>
+      <w:r>
+        <w:rPr>
+          <w:b w:val="0"/>
+          <w:sz w:val="20"/>
+        </w:rPr>
+        <w:t xml:space="preserve">  Then check: h(n) &lt;= h*(n)?   If YES for ALL nodes -&gt; heuristic is ADMISSIBLE.</w:t>
+      </w:r>
+    </w:p>
+    <w:p/>
+    <w:p>
+      <w:r>
+        <w:rPr>
+          <w:b w:val="0"/>
+          <w:sz w:val="20"/>
+        </w:rPr>
+        <w:t>TRUE SHORTEST PATH COMPUTATION (by inspection/UCS on the graph):</w:t>
+      </w:r>
+    </w:p>
+    <w:p>
+      <w:pPr>
+        <w:ind w:left="400"/>
+      </w:pPr>
+      <w:r>
+        <w:rPr>
+          <w:b w:val="0"/>
+          <w:sz w:val="20"/>
+        </w:rPr>
+        <w:t xml:space="preserve">  G: h*(G) = 0           (already at goal)                  h(G)=0   0&lt;=0   OK</w:t>
+      </w:r>
+    </w:p>
+    <w:p>
+      <w:pPr>
+        <w:ind w:left="400"/>
+      </w:pPr>
+      <w:r>
+        <w:rPr>
+          <w:b w:val="0"/>
+          <w:sz w:val="20"/>
+        </w:rPr>
+        <w:t xml:space="preserve">  D: D-&gt;G = 7            (direct edge D-G=7)                h(D)=5   5&lt;=7   OK</w:t>
+      </w:r>
+    </w:p>
+    <w:p>
+      <w:pPr>
+        <w:ind w:left="400"/>
+      </w:pPr>
+      <w:r>
+        <w:rPr>
+          <w:b w:val="0"/>
+          <w:sz w:val="20"/>
+        </w:rPr>
+        <w:t xml:space="preserve">  E: E-&gt;D-&gt;G = 3+7 = 10  (only path from E)                 h(E)=10  10&lt;=10 OK (TIGHT!)</w:t>
+      </w:r>
+    </w:p>
+    <w:p>
+      <w:pPr>
+        <w:ind w:left="400"/>
+      </w:pPr>
+      <w:r>
+        <w:rPr>
+          <w:b w:val="0"/>
+          <w:sz w:val="20"/>
+        </w:rPr>
+        <w:t xml:space="preserve">  C: C-&gt;E-&gt;D-&gt;G=10+3+7=20 vs C-&gt;D-&gt;G=20+7=27 -&gt; min=20      h(C)=15  15&lt;=20 OK</w:t>
+      </w:r>
+    </w:p>
+    <w:p>
+      <w:pPr>
+        <w:ind w:left="400"/>
+      </w:pPr>
+      <w:r>
+        <w:rPr>
+          <w:b w:val="0"/>
+          <w:sz w:val="20"/>
+        </w:rPr>
+        <w:t xml:space="preserve">  F: F-&gt;C-&gt;E-&gt;D-&gt;G=9+10+3+7=29 (C-F=9, so F-C=9 too)       h(F)=20  20&lt;=29 OK</w:t>
+      </w:r>
+    </w:p>
+    <w:p>
+      <w:pPr>
+        <w:ind w:left="400"/>
+      </w:pPr>
+      <w:r>
+        <w:rPr>
+          <w:b w:val="0"/>
+          <w:sz w:val="20"/>
+        </w:rPr>
+        <w:t xml:space="preserve">  A: A-&gt;B-&gt;C-&gt;E-&gt;D-&gt;G=11+6+10+3+7=37                        h(A)=30  30&lt;=37 OK</w:t>
+      </w:r>
+    </w:p>
+    <w:p>
+      <w:pPr>
+        <w:ind w:left="400"/>
+      </w:pPr>
+      <w:r>
+        <w:rPr>
+          <w:b w:val="0"/>
+          <w:sz w:val="20"/>
+        </w:rPr>
+        <w:t xml:space="preserve">  B: B-&gt;C-&gt;E-&gt;D-&gt;G=6+10+3+7=26 (the optimal path)           h(B)=25  25&lt;=26 OK (TIGHTEST!)</w:t>
+      </w:r>
+    </w:p>
+    <w:p/>
+    <w:p>
+      <w:r>
+        <w:rPr>
+          <w:b w:val="0"/>
+          <w:sz w:val="20"/>
+        </w:rPr>
+        <w:t>CONCLUSION: h(n) &lt;= h*(n) for ALL nodes.  Heuristic IS ADMISSIBLE.</w:t>
+      </w:r>
+    </w:p>
+    <w:p/>
+    <w:p>
+      <w:r>
+        <w:rPr>
+          <w:b w:val="0"/>
+          <w:sz w:val="20"/>
+        </w:rPr>
+        <w:t>EXAM ANSWER FORMAT:</w:t>
+      </w:r>
+    </w:p>
+    <w:p>
+      <w:pPr>
+        <w:ind w:left="400"/>
+      </w:pPr>
+      <w:r>
+        <w:rPr>
+          <w:b w:val="0"/>
+          <w:sz w:val="20"/>
+        </w:rPr>
+        <w:t xml:space="preserve">  'We verify admissibility by computing the true shortest path h*(n) to G for each node.</w:t>
+      </w:r>
+    </w:p>
+    <w:p>
+      <w:pPr>
+        <w:ind w:left="400"/>
+      </w:pPr>
+      <w:r>
+        <w:rPr>
+          <w:b w:val="0"/>
+          <w:sz w:val="20"/>
+        </w:rPr>
+        <w:t xml:space="preserve">  The tightest case is node B: h(B)=25, h*(B)=26, and 25&lt;=26.  Since h(n)&lt;=h*(n) for all</w:t>
+      </w:r>
+    </w:p>
+    <w:p>
+      <w:pPr>
+        <w:ind w:left="400"/>
+      </w:pPr>
+      <w:r>
+        <w:rPr>
+          <w:b w:val="0"/>
+          <w:sz w:val="20"/>
+        </w:rPr>
+        <w:t xml:space="preserve">  nodes, the heuristic is admissible and A* with this heuristic is optimal.'</w:t>
+      </w:r>
+    </w:p>
+    <w:p/>
+    <w:p>
+      <w:r>
+        <w:rPr>
+          <w:b w:val="0"/>
+          <w:sz w:val="20"/>
+        </w:rPr>
+        <w:t>EXAM TIP: Always highlight the TIGHTEST case (B: 25 vs 26) — it shows you did the check</w:t>
+      </w:r>
+    </w:p>
+    <w:p>
+      <w:r>
+        <w:rPr>
+          <w:b w:val="0"/>
+          <w:sz w:val="20"/>
+        </w:rPr>
+        <w:t>properly.  The grader wants to see node E (h=h*, exactly tight) and node B (h=h*-1).</w:t>
       </w:r>
     </w:p>
     <w:sectPr>

</xml_diff>